<commit_message>
Update Part G, Part H and Agile Reflection
</commit_message>
<xml_diff>
--- a/QuickBite_A2_Team_Coding.docx
+++ b/QuickBite_A2_Team_Coding.docx
@@ -2631,7 +2631,1069 @@
         <w:pStyle w:val="ListBullet"/>
       </w:pPr>
       <w:r>
-        <w:t>Product Owner K still needs to confirm top-five priorities and Product Backlog order; this selection is the team’s current Sprint plan.</w:t>
+        <w:t xml:space="preserve">Product Owner K still needs to confirm </w:t>
+      </w:r>
+      <w:proofErr w:type="gramStart"/>
+      <w:r>
+        <w:t>top-five</w:t>
+      </w:r>
+      <w:proofErr w:type="gramEnd"/>
+      <w:r>
+        <w:t xml:space="preserve"> priorities and Product Backlog order; this selection is the team’s current Sprint plan.</w:t>
+      </w:r>
+    </w:p>
+    <w:p>
+      <w:pPr>
+        <w:pStyle w:val="ListBullet"/>
+        <w:numPr>
+          <w:ilvl w:val="0"/>
+          <w:numId w:val="0"/>
+        </w:numPr>
+        <w:ind w:left="360" w:hanging="360"/>
+      </w:pPr>
+    </w:p>
+    <w:p>
+      <w:pPr>
+        <w:pStyle w:val="ListBullet"/>
+        <w:numPr>
+          <w:ilvl w:val="0"/>
+          <w:numId w:val="0"/>
+        </w:numPr>
+        <w:ind w:left="360" w:hanging="360"/>
+      </w:pPr>
+    </w:p>
+    <w:p>
+      <w:pPr>
+        <w:pStyle w:val="ListBullet"/>
+        <w:numPr>
+          <w:ilvl w:val="0"/>
+          <w:numId w:val="0"/>
+        </w:numPr>
+        <w:rPr>
+          <w:rFonts w:asciiTheme="majorHAnsi" w:hAnsiTheme="majorHAnsi" w:cstheme="majorHAnsi"/>
+          <w:b/>
+          <w:bCs/>
+          <w:color w:val="365F91" w:themeColor="accent1" w:themeShade="BF"/>
+          <w:sz w:val="30"/>
+          <w:szCs w:val="30"/>
+          <w:lang w:val="en-CA"/>
+        </w:rPr>
+      </w:pPr>
+      <w:r>
+        <w:rPr>
+          <w:rFonts w:asciiTheme="majorHAnsi" w:hAnsiTheme="majorHAnsi" w:cstheme="majorHAnsi"/>
+          <w:b/>
+          <w:bCs/>
+          <w:color w:val="365F91" w:themeColor="accent1" w:themeShade="BF"/>
+          <w:sz w:val="30"/>
+          <w:szCs w:val="30"/>
+          <w:lang w:val="en-CA"/>
+        </w:rPr>
+        <w:t>8.</w:t>
+      </w:r>
+      <w:r>
+        <w:rPr>
+          <w:rFonts w:asciiTheme="majorHAnsi" w:hAnsiTheme="majorHAnsi" w:cstheme="majorHAnsi"/>
+          <w:b/>
+          <w:bCs/>
+          <w:color w:val="365F91" w:themeColor="accent1" w:themeShade="BF"/>
+          <w:sz w:val="30"/>
+          <w:szCs w:val="30"/>
+          <w:lang w:val="en-CA"/>
+        </w:rPr>
+        <w:t>Part G — Sprint Review</w:t>
+      </w:r>
+    </w:p>
+    <w:p>
+      <w:pPr>
+        <w:pStyle w:val="ListBullet"/>
+        <w:numPr>
+          <w:ilvl w:val="0"/>
+          <w:numId w:val="0"/>
+        </w:numPr>
+        <w:rPr>
+          <w:rFonts w:cstheme="majorHAnsi"/>
+          <w:szCs w:val="20"/>
+        </w:rPr>
+      </w:pPr>
+      <w:r>
+        <w:rPr>
+          <w:rFonts w:cstheme="majorHAnsi"/>
+          <w:szCs w:val="20"/>
+        </w:rPr>
+        <w:t xml:space="preserve">At the end of the Sprint, the team demonstrated the working </w:t>
+      </w:r>
+      <w:proofErr w:type="spellStart"/>
+      <w:r>
+        <w:rPr>
+          <w:rFonts w:cstheme="majorHAnsi"/>
+          <w:szCs w:val="20"/>
+        </w:rPr>
+        <w:t>QuickBite</w:t>
+      </w:r>
+      <w:proofErr w:type="spellEnd"/>
+      <w:r>
+        <w:rPr>
+          <w:rFonts w:cstheme="majorHAnsi"/>
+          <w:szCs w:val="20"/>
+        </w:rPr>
+        <w:t xml:space="preserve"> Increment. The demonstration showed the customer ordering flow, including browsing restaurants, viewing a restaurant menu, adding available items to the order, selecting quantities, viewing the current order, choosing a pickup time, and placing the order. This demonstrated the main features selected for the Sprint and supported the Sprint Goal.</w:t>
+      </w:r>
+    </w:p>
+    <w:p>
+      <w:pPr>
+        <w:pStyle w:val="ListBullet"/>
+        <w:numPr>
+          <w:ilvl w:val="0"/>
+          <w:numId w:val="0"/>
+        </w:numPr>
+        <w:rPr>
+          <w:rFonts w:cstheme="majorHAnsi"/>
+          <w:szCs w:val="20"/>
+        </w:rPr>
+      </w:pPr>
+    </w:p>
+    <w:p>
+      <w:pPr>
+        <w:pStyle w:val="ListBullet"/>
+        <w:numPr>
+          <w:ilvl w:val="0"/>
+          <w:numId w:val="0"/>
+        </w:numPr>
+        <w:ind w:left="360" w:hanging="360"/>
+        <w:rPr>
+          <w:rFonts w:cstheme="majorHAnsi"/>
+          <w:szCs w:val="20"/>
+          <w:lang w:val="en-CA"/>
+        </w:rPr>
+      </w:pPr>
+      <w:r>
+        <w:rPr>
+          <w:rFonts w:cstheme="majorHAnsi"/>
+          <w:szCs w:val="20"/>
+          <w:lang w:val="en-CA"/>
+        </w:rPr>
+        <w:t>During the Sprint Review, the stakeholder provided the following feedback:</w:t>
+      </w:r>
+    </w:p>
+    <w:p>
+      <w:pPr>
+        <w:pStyle w:val="ListBullet"/>
+        <w:numPr>
+          <w:ilvl w:val="0"/>
+          <w:numId w:val="0"/>
+        </w:numPr>
+        <w:ind w:left="360" w:hanging="360"/>
+        <w:rPr>
+          <w:rFonts w:cstheme="majorHAnsi"/>
+          <w:szCs w:val="20"/>
+          <w:lang w:val="en-CA"/>
+        </w:rPr>
+      </w:pPr>
+    </w:p>
+    <w:p>
+      <w:pPr>
+        <w:pStyle w:val="ListBullet"/>
+        <w:numPr>
+          <w:ilvl w:val="0"/>
+          <w:numId w:val="0"/>
+        </w:numPr>
+        <w:rPr>
+          <w:rFonts w:cstheme="majorHAnsi"/>
+          <w:szCs w:val="20"/>
+        </w:rPr>
+      </w:pPr>
+      <w:r>
+        <w:rPr>
+          <w:rFonts w:cstheme="majorHAnsi"/>
+          <w:b/>
+          <w:bCs/>
+          <w:szCs w:val="20"/>
+        </w:rPr>
+        <w:t xml:space="preserve">Feedback 1: </w:t>
+      </w:r>
+      <w:r>
+        <w:rPr>
+          <w:rFonts w:cstheme="majorHAnsi"/>
+          <w:szCs w:val="20"/>
+        </w:rPr>
+        <w:t>The customer should be able to remove an item from the current order before placing it.</w:t>
+      </w:r>
+      <w:r>
+        <w:rPr>
+          <w:rFonts w:cstheme="majorHAnsi"/>
+          <w:b/>
+          <w:bCs/>
+          <w:szCs w:val="20"/>
+        </w:rPr>
+        <w:br/>
+        <w:t xml:space="preserve">Decision: </w:t>
+      </w:r>
+      <w:r>
+        <w:rPr>
+          <w:rFonts w:cstheme="majorHAnsi"/>
+          <w:szCs w:val="20"/>
+        </w:rPr>
+        <w:t>Add/Modify Product Backlog Item.</w:t>
+      </w:r>
+      <w:r>
+        <w:rPr>
+          <w:rFonts w:cstheme="majorHAnsi"/>
+          <w:b/>
+          <w:bCs/>
+          <w:szCs w:val="20"/>
+        </w:rPr>
+        <w:br/>
+        <w:t xml:space="preserve">Action: </w:t>
+      </w:r>
+      <w:r>
+        <w:rPr>
+          <w:rFonts w:cstheme="majorHAnsi"/>
+          <w:szCs w:val="20"/>
+        </w:rPr>
+        <w:t>PBI-04 will be prioritized for a future Sprint so customers can remove unwanted items and modify their order before submission.</w:t>
+      </w:r>
+    </w:p>
+    <w:p>
+      <w:pPr>
+        <w:pStyle w:val="ListBullet"/>
+        <w:numPr>
+          <w:ilvl w:val="0"/>
+          <w:numId w:val="0"/>
+        </w:numPr>
+        <w:rPr>
+          <w:rFonts w:cstheme="majorHAnsi"/>
+          <w:szCs w:val="20"/>
+        </w:rPr>
+      </w:pPr>
+    </w:p>
+    <w:p>
+      <w:pPr>
+        <w:pStyle w:val="ListBullet"/>
+        <w:numPr>
+          <w:ilvl w:val="0"/>
+          <w:numId w:val="0"/>
+        </w:numPr>
+        <w:rPr>
+          <w:rFonts w:cstheme="majorHAnsi"/>
+          <w:szCs w:val="20"/>
+          <w:lang w:val="en-CA"/>
+        </w:rPr>
+      </w:pPr>
+      <w:r>
+        <w:rPr>
+          <w:rFonts w:cstheme="majorHAnsi"/>
+          <w:b/>
+          <w:bCs/>
+          <w:szCs w:val="20"/>
+        </w:rPr>
+        <w:t>Feedback 2:</w:t>
+      </w:r>
+      <w:r>
+        <w:rPr>
+          <w:rFonts w:cstheme="majorHAnsi"/>
+          <w:szCs w:val="20"/>
+        </w:rPr>
+        <w:t xml:space="preserve"> The order confirmation should clearly show the restaurant, selected items, quantities, total price, and pickup time.</w:t>
+      </w:r>
+      <w:r>
+        <w:rPr>
+          <w:rFonts w:cstheme="majorHAnsi"/>
+          <w:szCs w:val="20"/>
+        </w:rPr>
+        <w:br/>
+      </w:r>
+      <w:r>
+        <w:rPr>
+          <w:rFonts w:cstheme="majorHAnsi"/>
+          <w:b/>
+          <w:bCs/>
+          <w:szCs w:val="20"/>
+        </w:rPr>
+        <w:t>Decision:</w:t>
+      </w:r>
+      <w:r>
+        <w:rPr>
+          <w:rFonts w:cstheme="majorHAnsi"/>
+          <w:szCs w:val="20"/>
+        </w:rPr>
+        <w:t xml:space="preserve"> Accept.</w:t>
+      </w:r>
+      <w:r>
+        <w:rPr>
+          <w:rFonts w:cstheme="majorHAnsi"/>
+          <w:szCs w:val="20"/>
+        </w:rPr>
+        <w:br/>
+      </w:r>
+      <w:r>
+        <w:rPr>
+          <w:rFonts w:cstheme="majorHAnsi"/>
+          <w:b/>
+          <w:bCs/>
+          <w:szCs w:val="20"/>
+        </w:rPr>
+        <w:t>Action:</w:t>
+      </w:r>
+      <w:r>
+        <w:rPr>
+          <w:rFonts w:cstheme="majorHAnsi"/>
+          <w:szCs w:val="20"/>
+        </w:rPr>
+        <w:t xml:space="preserve"> PBI-06 will be updated to make the order confirmation more detailed and clear for the customer.</w:t>
+      </w:r>
+    </w:p>
+    <w:p>
+      <w:pPr>
+        <w:pStyle w:val="ListBullet"/>
+        <w:numPr>
+          <w:ilvl w:val="0"/>
+          <w:numId w:val="0"/>
+        </w:numPr>
+        <w:rPr>
+          <w:rFonts w:cstheme="majorHAnsi"/>
+          <w:szCs w:val="20"/>
+          <w:lang w:val="en-CA"/>
+        </w:rPr>
+      </w:pPr>
+    </w:p>
+    <w:p>
+      <w:pPr>
+        <w:pStyle w:val="ListBullet"/>
+        <w:numPr>
+          <w:ilvl w:val="0"/>
+          <w:numId w:val="0"/>
+        </w:numPr>
+        <w:rPr>
+          <w:rFonts w:cstheme="majorHAnsi"/>
+          <w:szCs w:val="20"/>
+        </w:rPr>
+      </w:pPr>
+      <w:r>
+        <w:rPr>
+          <w:rFonts w:cstheme="majorHAnsi"/>
+          <w:b/>
+          <w:bCs/>
+          <w:szCs w:val="20"/>
+        </w:rPr>
+        <w:t>Feedback 3:</w:t>
+      </w:r>
+      <w:r>
+        <w:rPr>
+          <w:rFonts w:cstheme="majorHAnsi"/>
+          <w:szCs w:val="20"/>
+        </w:rPr>
+        <w:t xml:space="preserve"> Customers should be able to easily check the status of their order after placing it.</w:t>
+      </w:r>
+      <w:r>
+        <w:rPr>
+          <w:rFonts w:cstheme="majorHAnsi"/>
+          <w:szCs w:val="20"/>
+        </w:rPr>
+        <w:br/>
+      </w:r>
+      <w:r>
+        <w:rPr>
+          <w:rFonts w:cstheme="majorHAnsi"/>
+          <w:b/>
+          <w:bCs/>
+          <w:szCs w:val="20"/>
+        </w:rPr>
+        <w:t>Decision:</w:t>
+      </w:r>
+      <w:r>
+        <w:rPr>
+          <w:rFonts w:cstheme="majorHAnsi"/>
+          <w:szCs w:val="20"/>
+        </w:rPr>
+        <w:t xml:space="preserve"> Accept.</w:t>
+      </w:r>
+      <w:r>
+        <w:rPr>
+          <w:rFonts w:cstheme="majorHAnsi"/>
+          <w:szCs w:val="20"/>
+        </w:rPr>
+        <w:br/>
+      </w:r>
+      <w:r>
+        <w:rPr>
+          <w:rFonts w:cstheme="majorHAnsi"/>
+          <w:b/>
+          <w:bCs/>
+          <w:szCs w:val="20"/>
+        </w:rPr>
+        <w:t>Action:</w:t>
+      </w:r>
+      <w:r>
+        <w:rPr>
+          <w:rFonts w:cstheme="majorHAnsi"/>
+          <w:szCs w:val="20"/>
+        </w:rPr>
+        <w:t xml:space="preserve"> PBI-07, View Order Status, will remain a priority for a future Sprint so customers can see whether their order is Received, Preparing, Ready for Pickup, or Completed.</w:t>
+      </w:r>
+    </w:p>
+    <w:p>
+      <w:pPr>
+        <w:pStyle w:val="ListBullet"/>
+        <w:numPr>
+          <w:ilvl w:val="0"/>
+          <w:numId w:val="0"/>
+        </w:numPr>
+        <w:rPr>
+          <w:rFonts w:cstheme="majorHAnsi"/>
+          <w:szCs w:val="20"/>
+        </w:rPr>
+      </w:pPr>
+    </w:p>
+    <w:p>
+      <w:pPr>
+        <w:pStyle w:val="ListBullet"/>
+        <w:numPr>
+          <w:ilvl w:val="0"/>
+          <w:numId w:val="0"/>
+        </w:numPr>
+        <w:rPr>
+          <w:rFonts w:cstheme="majorHAnsi"/>
+          <w:szCs w:val="20"/>
+        </w:rPr>
+      </w:pPr>
+      <w:r>
+        <w:rPr>
+          <w:rFonts w:cstheme="majorHAnsi"/>
+          <w:b/>
+          <w:bCs/>
+          <w:szCs w:val="20"/>
+        </w:rPr>
+        <w:t>Increment → Feedback → Learning → Backlog Adaptation:</w:t>
+      </w:r>
+      <w:r>
+        <w:rPr>
+          <w:rFonts w:cstheme="majorHAnsi"/>
+          <w:szCs w:val="20"/>
+        </w:rPr>
+        <w:br/>
+        <w:t>The team demonstrated the working Increment, collected stakeholder feedback, identified improvements, and used this information to update and reprioritize the Product Backlog.</w:t>
+      </w:r>
+    </w:p>
+    <w:p>
+      <w:pPr>
+        <w:pStyle w:val="ListBullet"/>
+        <w:numPr>
+          <w:ilvl w:val="0"/>
+          <w:numId w:val="0"/>
+        </w:numPr>
+        <w:rPr>
+          <w:rFonts w:cstheme="majorHAnsi"/>
+          <w:szCs w:val="20"/>
+        </w:rPr>
+      </w:pPr>
+    </w:p>
+    <w:p>
+      <w:pPr>
+        <w:pStyle w:val="ListBullet"/>
+        <w:numPr>
+          <w:ilvl w:val="0"/>
+          <w:numId w:val="0"/>
+        </w:numPr>
+        <w:rPr>
+          <w:rFonts w:cstheme="majorHAnsi"/>
+          <w:szCs w:val="20"/>
+          <w:lang w:val="en-CA"/>
+        </w:rPr>
+      </w:pPr>
+      <w:r>
+        <w:rPr>
+          <w:rFonts w:cstheme="majorHAnsi"/>
+          <w:szCs w:val="20"/>
+        </w:rPr>
+        <w:lastRenderedPageBreak/>
+        <w:t>The Sprint Review helped the team identify improvements that were not fully included in the current Increment. The feedback showed that the basic ordering flow works, but pickup-time availability, order confirmation, and order-status visibility can be improved. The Product Backlog will be adapted based on this feedback for future development.</w:t>
+      </w:r>
+    </w:p>
+    <w:p>
+      <w:pPr>
+        <w:pStyle w:val="ListBullet"/>
+        <w:numPr>
+          <w:ilvl w:val="0"/>
+          <w:numId w:val="0"/>
+        </w:numPr>
+        <w:ind w:left="360" w:hanging="360"/>
+        <w:rPr>
+          <w:lang w:val="en-CA"/>
+        </w:rPr>
+      </w:pPr>
+    </w:p>
+    <w:p>
+      <w:pPr>
+        <w:pStyle w:val="ListBullet"/>
+        <w:numPr>
+          <w:ilvl w:val="0"/>
+          <w:numId w:val="0"/>
+        </w:numPr>
+        <w:ind w:left="360" w:hanging="360"/>
+        <w:rPr>
+          <w:rFonts w:asciiTheme="majorHAnsi" w:hAnsiTheme="majorHAnsi" w:cstheme="majorHAnsi"/>
+          <w:b/>
+          <w:bCs/>
+          <w:color w:val="365F91" w:themeColor="accent1" w:themeShade="BF"/>
+          <w:sz w:val="30"/>
+          <w:szCs w:val="30"/>
+          <w:lang w:val="en-CA"/>
+        </w:rPr>
+      </w:pPr>
+      <w:r>
+        <w:rPr>
+          <w:rFonts w:asciiTheme="majorHAnsi" w:hAnsiTheme="majorHAnsi" w:cstheme="majorHAnsi"/>
+          <w:b/>
+          <w:bCs/>
+          <w:color w:val="365F91" w:themeColor="accent1" w:themeShade="BF"/>
+          <w:sz w:val="30"/>
+          <w:szCs w:val="30"/>
+          <w:lang w:val="en-CA"/>
+        </w:rPr>
+        <w:t>9.</w:t>
+      </w:r>
+      <w:r>
+        <w:rPr>
+          <w:rFonts w:asciiTheme="majorHAnsi" w:hAnsiTheme="majorHAnsi" w:cstheme="majorHAnsi"/>
+          <w:b/>
+          <w:bCs/>
+          <w:color w:val="365F91" w:themeColor="accent1" w:themeShade="BF"/>
+          <w:sz w:val="30"/>
+          <w:szCs w:val="30"/>
+          <w:lang w:val="en-CA"/>
+        </w:rPr>
+        <w:t>Part H — Sprint Retrospective</w:t>
+      </w:r>
+      <w:r>
+        <w:rPr>
+          <w:rFonts w:asciiTheme="majorHAnsi" w:hAnsiTheme="majorHAnsi" w:cstheme="majorHAnsi"/>
+          <w:b/>
+          <w:bCs/>
+          <w:color w:val="365F91" w:themeColor="accent1" w:themeShade="BF"/>
+          <w:sz w:val="30"/>
+          <w:szCs w:val="30"/>
+          <w:lang w:val="en-CA"/>
+        </w:rPr>
+        <w:t>:</w:t>
+      </w:r>
+    </w:p>
+    <w:p>
+      <w:pPr>
+        <w:pStyle w:val="ListBullet"/>
+        <w:numPr>
+          <w:ilvl w:val="0"/>
+          <w:numId w:val="0"/>
+        </w:numPr>
+        <w:rPr>
+          <w:rFonts w:cstheme="majorHAnsi"/>
+          <w:szCs w:val="20"/>
+        </w:rPr>
+      </w:pPr>
+      <w:r>
+        <w:rPr>
+          <w:rFonts w:cstheme="majorHAnsi"/>
+          <w:b/>
+          <w:bCs/>
+          <w:color w:val="365F91" w:themeColor="accent1" w:themeShade="BF"/>
+          <w:szCs w:val="20"/>
+          <w:lang w:val="en-CA"/>
+        </w:rPr>
+        <w:t xml:space="preserve"> </w:t>
+      </w:r>
+      <w:r>
+        <w:rPr>
+          <w:rFonts w:cstheme="majorHAnsi"/>
+          <w:szCs w:val="20"/>
+        </w:rPr>
+        <w:t>At the end of the Sprint, the four team members discussed how the Sprint went and what could be improved for the next Sprint.</w:t>
+      </w:r>
+    </w:p>
+    <w:p>
+      <w:pPr>
+        <w:pStyle w:val="ListBullet"/>
+        <w:numPr>
+          <w:ilvl w:val="0"/>
+          <w:numId w:val="0"/>
+        </w:numPr>
+        <w:rPr>
+          <w:rFonts w:cstheme="majorHAnsi"/>
+          <w:szCs w:val="20"/>
+        </w:rPr>
+      </w:pPr>
+    </w:p>
+    <w:p>
+      <w:pPr>
+        <w:pStyle w:val="ListBullet"/>
+        <w:numPr>
+          <w:ilvl w:val="0"/>
+          <w:numId w:val="0"/>
+        </w:numPr>
+        <w:rPr>
+          <w:rFonts w:cstheme="majorHAnsi"/>
+          <w:szCs w:val="20"/>
+          <w:lang w:val="en-CA"/>
+        </w:rPr>
+      </w:pPr>
+      <w:r>
+        <w:rPr>
+          <w:rFonts w:cstheme="majorHAnsi"/>
+          <w:b/>
+          <w:bCs/>
+          <w:szCs w:val="20"/>
+        </w:rPr>
+        <w:t>What went well:</w:t>
+      </w:r>
+      <w:r>
+        <w:rPr>
+          <w:rFonts w:cstheme="majorHAnsi"/>
+          <w:b/>
+          <w:bCs/>
+          <w:szCs w:val="20"/>
+        </w:rPr>
+        <w:br/>
+      </w:r>
+      <w:r>
+        <w:rPr>
+          <w:rFonts w:cstheme="majorHAnsi"/>
+          <w:szCs w:val="20"/>
+        </w:rPr>
+        <w:t xml:space="preserve">The team divided the technical work between all four members, which allowed everyone to contribute to the </w:t>
+      </w:r>
+      <w:proofErr w:type="spellStart"/>
+      <w:r>
+        <w:rPr>
+          <w:rFonts w:cstheme="majorHAnsi"/>
+          <w:szCs w:val="20"/>
+        </w:rPr>
+        <w:t>QuickBite</w:t>
+      </w:r>
+      <w:proofErr w:type="spellEnd"/>
+      <w:r>
+        <w:rPr>
+          <w:rFonts w:cstheme="majorHAnsi"/>
+          <w:szCs w:val="20"/>
+        </w:rPr>
+        <w:t xml:space="preserve"> Increment. GitHub Projects helped the team organize the tasks and track the progress of the Sprint. Using separate branches and pull requests also helped the team combine everyone's work into one project.</w:t>
+      </w:r>
+    </w:p>
+    <w:p>
+      <w:pPr>
+        <w:pStyle w:val="ListBullet"/>
+        <w:numPr>
+          <w:ilvl w:val="0"/>
+          <w:numId w:val="0"/>
+        </w:numPr>
+        <w:rPr>
+          <w:lang w:val="en-CA"/>
+        </w:rPr>
+      </w:pPr>
+    </w:p>
+    <w:p>
+      <w:pPr>
+        <w:pStyle w:val="ListBullet"/>
+        <w:numPr>
+          <w:ilvl w:val="0"/>
+          <w:numId w:val="0"/>
+        </w:numPr>
+      </w:pPr>
+      <w:r>
+        <w:rPr>
+          <w:b/>
+          <w:bCs/>
+        </w:rPr>
+        <w:t>What did not go well:</w:t>
+      </w:r>
+      <w:r>
+        <w:br/>
+        <w:t>Some tasks took longer than expected because different parts of the project depended on other team members' work. There were also some problems when merging code, which required additional fixes and testing.</w:t>
+      </w:r>
+    </w:p>
+    <w:p>
+      <w:pPr>
+        <w:pStyle w:val="ListBullet"/>
+        <w:numPr>
+          <w:ilvl w:val="0"/>
+          <w:numId w:val="0"/>
+        </w:numPr>
+      </w:pPr>
+    </w:p>
+    <w:p>
+      <w:pPr>
+        <w:pStyle w:val="ListBullet"/>
+        <w:numPr>
+          <w:ilvl w:val="0"/>
+          <w:numId w:val="0"/>
+        </w:numPr>
+      </w:pPr>
+      <w:r>
+        <w:rPr>
+          <w:b/>
+          <w:bCs/>
+        </w:rPr>
+        <w:t>What slowed the team down:</w:t>
+      </w:r>
+      <w:r>
+        <w:br/>
+        <w:t>Dependencies between tasks slowed the team down. For example, the cart depended on the menu data, and connecting the cart to the final order depended on the pickup-time functionality. This meant some work had to wait until another part was ready. This matches the dependencies identified in the team's plan.</w:t>
+      </w:r>
+    </w:p>
+    <w:p>
+      <w:pPr>
+        <w:pStyle w:val="ListBullet"/>
+        <w:numPr>
+          <w:ilvl w:val="0"/>
+          <w:numId w:val="0"/>
+        </w:numPr>
+      </w:pPr>
+    </w:p>
+    <w:p>
+      <w:pPr>
+        <w:pStyle w:val="ListBullet"/>
+        <w:numPr>
+          <w:ilvl w:val="0"/>
+          <w:numId w:val="0"/>
+        </w:numPr>
+      </w:pPr>
+      <w:r>
+        <w:rPr>
+          <w:b/>
+          <w:bCs/>
+        </w:rPr>
+        <w:t>What helped collaboration:</w:t>
+      </w:r>
+      <w:r>
+        <w:br/>
+        <w:t xml:space="preserve">GitHub, GitHub Projects, branches, pull requests, and communication between team members helped the team coordinate the work. Team members shared information such as restaurant IDs, menu-item data, cart information, and </w:t>
+      </w:r>
+      <w:proofErr w:type="gramStart"/>
+      <w:r>
+        <w:t>pickup</w:t>
+      </w:r>
+      <w:proofErr w:type="gramEnd"/>
+      <w:r>
+        <w:t>-time information so the different features could work together.</w:t>
+      </w:r>
+    </w:p>
+    <w:p>
+      <w:pPr>
+        <w:pStyle w:val="ListBullet"/>
+        <w:numPr>
+          <w:ilvl w:val="0"/>
+          <w:numId w:val="0"/>
+        </w:numPr>
+      </w:pPr>
+    </w:p>
+    <w:p>
+      <w:pPr>
+        <w:pStyle w:val="ListBullet"/>
+        <w:numPr>
+          <w:ilvl w:val="0"/>
+          <w:numId w:val="0"/>
+        </w:numPr>
+      </w:pPr>
+      <w:r>
+        <w:rPr>
+          <w:b/>
+          <w:bCs/>
+        </w:rPr>
+        <w:t>Definition of Done:</w:t>
+      </w:r>
+      <w:r>
+        <w:br/>
+        <w:t>The Definition of Done helped the team avoid considering a task complete only because the code was written. The team also needed to test the functionality, review the work, integrate it with the project, and make sure the acceptance criteria were met. This follows the team's coding and integration process.</w:t>
+      </w:r>
+    </w:p>
+    <w:p>
+      <w:pPr>
+        <w:pStyle w:val="ListBullet"/>
+        <w:numPr>
+          <w:ilvl w:val="0"/>
+          <w:numId w:val="0"/>
+        </w:numPr>
+      </w:pPr>
+    </w:p>
+    <w:p>
+      <w:pPr>
+        <w:pStyle w:val="ListBullet"/>
+        <w:numPr>
+          <w:ilvl w:val="0"/>
+          <w:numId w:val="0"/>
+        </w:numPr>
+      </w:pPr>
+      <w:r>
+        <w:rPr>
+          <w:b/>
+          <w:bCs/>
+        </w:rPr>
+        <w:t>Improvement Action 1:</w:t>
+      </w:r>
+      <w:r>
+        <w:br/>
+        <w:t>For the next Sprint, the team will identify dependencies between tasks earlier and agree on shared data structures before starting development. This will reduce waiting time and integration problems.</w:t>
+      </w:r>
+    </w:p>
+    <w:p>
+      <w:pPr>
+        <w:pStyle w:val="ListBullet"/>
+        <w:numPr>
+          <w:ilvl w:val="0"/>
+          <w:numId w:val="0"/>
+        </w:numPr>
+      </w:pPr>
+    </w:p>
+    <w:p>
+      <w:pPr>
+        <w:pStyle w:val="ListBullet"/>
+        <w:numPr>
+          <w:ilvl w:val="0"/>
+          <w:numId w:val="0"/>
+        </w:numPr>
+      </w:pPr>
+      <w:r>
+        <w:rPr>
+          <w:b/>
+          <w:bCs/>
+        </w:rPr>
+        <w:t>Improvement Action 2:</w:t>
+      </w:r>
+      <w:r>
+        <w:br/>
+        <w:t>For the next Sprint, the team will start code reviews and integration testing earlier instead of waiting until several features are completed. This will help identify merge conflicts and integration problems sooner.</w:t>
+      </w:r>
+    </w:p>
+    <w:p>
+      <w:pPr>
+        <w:pStyle w:val="ListBullet"/>
+        <w:numPr>
+          <w:ilvl w:val="0"/>
+          <w:numId w:val="0"/>
+        </w:numPr>
+      </w:pPr>
+    </w:p>
+    <w:p>
+      <w:pPr>
+        <w:pStyle w:val="ListBullet"/>
+        <w:numPr>
+          <w:ilvl w:val="0"/>
+          <w:numId w:val="0"/>
+        </w:numPr>
+        <w:rPr>
+          <w:rFonts w:asciiTheme="majorHAnsi" w:hAnsiTheme="majorHAnsi" w:cstheme="majorHAnsi"/>
+          <w:b/>
+          <w:bCs/>
+          <w:color w:val="365F91" w:themeColor="accent1" w:themeShade="BF"/>
+          <w:sz w:val="30"/>
+          <w:szCs w:val="30"/>
+        </w:rPr>
+      </w:pPr>
+      <w:r>
+        <w:rPr>
+          <w:rFonts w:asciiTheme="majorHAnsi" w:hAnsiTheme="majorHAnsi" w:cstheme="majorHAnsi"/>
+          <w:b/>
+          <w:bCs/>
+          <w:color w:val="365F91" w:themeColor="accent1" w:themeShade="BF"/>
+          <w:sz w:val="30"/>
+          <w:szCs w:val="30"/>
+        </w:rPr>
+        <w:t>10. Agile Reflection</w:t>
+      </w:r>
+    </w:p>
+    <w:p>
+      <w:pPr>
+        <w:pStyle w:val="ListBullet"/>
+        <w:numPr>
+          <w:ilvl w:val="0"/>
+          <w:numId w:val="0"/>
+        </w:numPr>
+      </w:pPr>
+    </w:p>
+    <w:p>
+      <w:pPr>
+        <w:pStyle w:val="ListBullet"/>
+        <w:numPr>
+          <w:ilvl w:val="0"/>
+          <w:numId w:val="0"/>
+        </w:numPr>
+      </w:pPr>
+      <w:r>
+        <w:t xml:space="preserve">The </w:t>
+      </w:r>
+      <w:proofErr w:type="spellStart"/>
+      <w:r>
+        <w:t>QuickBite</w:t>
+      </w:r>
+      <w:proofErr w:type="spellEnd"/>
+      <w:r>
+        <w:t xml:space="preserve"> project demonstrated Agile practices through the way the team planned, developed, tested, and improved the system during the Sprint.</w:t>
+      </w:r>
+    </w:p>
+    <w:p>
+      <w:pPr>
+        <w:pStyle w:val="ListBullet"/>
+        <w:numPr>
+          <w:ilvl w:val="0"/>
+          <w:numId w:val="0"/>
+        </w:numPr>
+      </w:pPr>
+    </w:p>
+    <w:p>
+      <w:pPr>
+        <w:pStyle w:val="ListBullet"/>
+        <w:numPr>
+          <w:ilvl w:val="0"/>
+          <w:numId w:val="0"/>
+        </w:numPr>
+      </w:pPr>
+      <w:r>
+        <w:rPr>
+          <w:b/>
+          <w:bCs/>
+        </w:rPr>
+        <w:t>Incremental Delivery:</w:t>
+      </w:r>
+      <w:r>
+        <w:br/>
+        <w:t xml:space="preserve">The team focused on a small working part of </w:t>
+      </w:r>
+      <w:proofErr w:type="spellStart"/>
+      <w:r>
+        <w:t>QuickBite</w:t>
+      </w:r>
+      <w:proofErr w:type="spellEnd"/>
+      <w:r>
+        <w:t xml:space="preserve"> instead of trying to build the entire system. The Sprint Increment </w:t>
+      </w:r>
+      <w:r>
+        <w:lastRenderedPageBreak/>
+        <w:t>focused on the customer ordering flow, including browsing restaurants, viewing menus, adding items, selecting a pickup time, and placing an order. This followed the Sprint Goal.</w:t>
+      </w:r>
+    </w:p>
+    <w:p>
+      <w:pPr>
+        <w:pStyle w:val="ListBullet"/>
+        <w:numPr>
+          <w:ilvl w:val="0"/>
+          <w:numId w:val="0"/>
+        </w:numPr>
+      </w:pPr>
+    </w:p>
+    <w:p>
+      <w:pPr>
+        <w:pStyle w:val="ListBullet"/>
+        <w:numPr>
+          <w:ilvl w:val="0"/>
+          <w:numId w:val="0"/>
+        </w:numPr>
+      </w:pPr>
+      <w:r>
+        <w:rPr>
+          <w:b/>
+          <w:bCs/>
+        </w:rPr>
+        <w:t>Responding to Change:</w:t>
+      </w:r>
+      <w:r>
+        <w:br/>
+        <w:t>The team responded to the new requirement about restaurant workload and pickup-time availability. Instead of automatically changing the whole Sprint, the team considered how the requirement affected the existing backlog and what should be handled in future work.</w:t>
+      </w:r>
+    </w:p>
+    <w:p>
+      <w:pPr>
+        <w:pStyle w:val="ListBullet"/>
+        <w:numPr>
+          <w:ilvl w:val="0"/>
+          <w:numId w:val="0"/>
+        </w:numPr>
+      </w:pPr>
+    </w:p>
+    <w:p>
+      <w:pPr>
+        <w:pStyle w:val="ListBullet"/>
+        <w:numPr>
+          <w:ilvl w:val="0"/>
+          <w:numId w:val="0"/>
+        </w:numPr>
+      </w:pPr>
+      <w:r>
+        <w:rPr>
+          <w:b/>
+          <w:bCs/>
+        </w:rPr>
+        <w:t>Working Software and Technical Quality:</w:t>
+      </w:r>
+      <w:r>
+        <w:br/>
+        <w:t>The team produced actual working software instead of only planning the features. Team members used GitHub branches and pull requests, tested their assigned tasks, integrated the different features, and fixed problems that appeared during integration. The team also used the Definition of Done to make sure work was tested and reviewed before being considered complete</w:t>
+      </w:r>
+    </w:p>
+    <w:p>
+      <w:pPr>
+        <w:pStyle w:val="ListBullet"/>
+        <w:numPr>
+          <w:ilvl w:val="0"/>
+          <w:numId w:val="0"/>
+        </w:numPr>
+      </w:pPr>
+    </w:p>
+    <w:p>
+      <w:pPr>
+        <w:pStyle w:val="ListBullet"/>
+        <w:numPr>
+          <w:ilvl w:val="0"/>
+          <w:numId w:val="0"/>
+        </w:numPr>
+      </w:pPr>
+      <w:r>
+        <w:rPr>
+          <w:b/>
+          <w:bCs/>
+        </w:rPr>
+        <w:t>Stakeholder Feedback:</w:t>
+      </w:r>
+      <w:r>
+        <w:br/>
+        <w:t xml:space="preserve">During the Sprint Review, the team used stakeholder feedback to identify improvements to the product. The feedback helped the team identify improvements related to modifying an order, improving the order confirmation, and </w:t>
+      </w:r>
+      <w:proofErr w:type="gramStart"/>
+      <w:r>
+        <w:t>viewing</w:t>
+      </w:r>
+      <w:proofErr w:type="gramEnd"/>
+      <w:r>
+        <w:t xml:space="preserve"> the order status. These ideas were used to adapt the Product Backlog for future development.</w:t>
+      </w:r>
+    </w:p>
+    <w:p>
+      <w:pPr>
+        <w:pStyle w:val="ListBullet"/>
+        <w:numPr>
+          <w:ilvl w:val="0"/>
+          <w:numId w:val="0"/>
+        </w:numPr>
+      </w:pPr>
+    </w:p>
+    <w:p>
+      <w:pPr>
+        <w:pStyle w:val="ListBullet"/>
+        <w:numPr>
+          <w:ilvl w:val="0"/>
+          <w:numId w:val="0"/>
+        </w:numPr>
+        <w:rPr>
+          <w:lang w:val="en-CA"/>
+        </w:rPr>
+      </w:pPr>
+      <w:r>
+        <w:rPr>
+          <w:b/>
+          <w:bCs/>
+        </w:rPr>
+        <w:t>Continuous Improvement:</w:t>
+      </w:r>
+      <w:r>
+        <w:br/>
+        <w:t>During the Sprint Retrospective, the team identified problems such as task dependencies and integration difficulties. For the next Sprint, the team decided to identify dependencies earlier and begin code reviews and integration testing sooner. This allows the team to learn from the current Sprint and improve how it works in the future.</w:t>
       </w:r>
     </w:p>
     <w:sectPr>
@@ -3261,6 +4323,155 @@
     </w:lvl>
   </w:abstractNum>
   <w:abstractNum w:abstractNumId="9" w15:restartNumberingAfterBreak="0">
+    <w:nsid w:val="092869A3"/>
+    <w:multiLevelType w:val="multilevel"/>
+    <w:tmpl w:val="DF427802"/>
+    <w:lvl w:ilvl="0">
+      <w:start w:val="1"/>
+      <w:numFmt w:val="bullet"/>
+      <w:lvlText w:val=""/>
+      <w:lvlJc w:val="left"/>
+      <w:pPr>
+        <w:tabs>
+          <w:tab w:val="num" w:pos="720"/>
+        </w:tabs>
+        <w:ind w:left="720" w:hanging="360"/>
+      </w:pPr>
+      <w:rPr>
+        <w:rFonts w:ascii="Symbol" w:hAnsi="Symbol" w:hint="default"/>
+        <w:sz w:val="20"/>
+      </w:rPr>
+    </w:lvl>
+    <w:lvl w:ilvl="1" w:tentative="1">
+      <w:start w:val="1"/>
+      <w:numFmt w:val="bullet"/>
+      <w:lvlText w:val="o"/>
+      <w:lvlJc w:val="left"/>
+      <w:pPr>
+        <w:tabs>
+          <w:tab w:val="num" w:pos="1440"/>
+        </w:tabs>
+        <w:ind w:left="1440" w:hanging="360"/>
+      </w:pPr>
+      <w:rPr>
+        <w:rFonts w:ascii="Courier New" w:hAnsi="Courier New" w:hint="default"/>
+        <w:sz w:val="20"/>
+      </w:rPr>
+    </w:lvl>
+    <w:lvl w:ilvl="2" w:tentative="1">
+      <w:start w:val="1"/>
+      <w:numFmt w:val="bullet"/>
+      <w:lvlText w:val=""/>
+      <w:lvlJc w:val="left"/>
+      <w:pPr>
+        <w:tabs>
+          <w:tab w:val="num" w:pos="2160"/>
+        </w:tabs>
+        <w:ind w:left="2160" w:hanging="360"/>
+      </w:pPr>
+      <w:rPr>
+        <w:rFonts w:ascii="Wingdings" w:hAnsi="Wingdings" w:hint="default"/>
+        <w:sz w:val="20"/>
+      </w:rPr>
+    </w:lvl>
+    <w:lvl w:ilvl="3" w:tentative="1">
+      <w:start w:val="1"/>
+      <w:numFmt w:val="bullet"/>
+      <w:lvlText w:val=""/>
+      <w:lvlJc w:val="left"/>
+      <w:pPr>
+        <w:tabs>
+          <w:tab w:val="num" w:pos="2880"/>
+        </w:tabs>
+        <w:ind w:left="2880" w:hanging="360"/>
+      </w:pPr>
+      <w:rPr>
+        <w:rFonts w:ascii="Wingdings" w:hAnsi="Wingdings" w:hint="default"/>
+        <w:sz w:val="20"/>
+      </w:rPr>
+    </w:lvl>
+    <w:lvl w:ilvl="4" w:tentative="1">
+      <w:start w:val="1"/>
+      <w:numFmt w:val="bullet"/>
+      <w:lvlText w:val=""/>
+      <w:lvlJc w:val="left"/>
+      <w:pPr>
+        <w:tabs>
+          <w:tab w:val="num" w:pos="3600"/>
+        </w:tabs>
+        <w:ind w:left="3600" w:hanging="360"/>
+      </w:pPr>
+      <w:rPr>
+        <w:rFonts w:ascii="Wingdings" w:hAnsi="Wingdings" w:hint="default"/>
+        <w:sz w:val="20"/>
+      </w:rPr>
+    </w:lvl>
+    <w:lvl w:ilvl="5" w:tentative="1">
+      <w:start w:val="1"/>
+      <w:numFmt w:val="bullet"/>
+      <w:lvlText w:val=""/>
+      <w:lvlJc w:val="left"/>
+      <w:pPr>
+        <w:tabs>
+          <w:tab w:val="num" w:pos="4320"/>
+        </w:tabs>
+        <w:ind w:left="4320" w:hanging="360"/>
+      </w:pPr>
+      <w:rPr>
+        <w:rFonts w:ascii="Wingdings" w:hAnsi="Wingdings" w:hint="default"/>
+        <w:sz w:val="20"/>
+      </w:rPr>
+    </w:lvl>
+    <w:lvl w:ilvl="6" w:tentative="1">
+      <w:start w:val="1"/>
+      <w:numFmt w:val="bullet"/>
+      <w:lvlText w:val=""/>
+      <w:lvlJc w:val="left"/>
+      <w:pPr>
+        <w:tabs>
+          <w:tab w:val="num" w:pos="5040"/>
+        </w:tabs>
+        <w:ind w:left="5040" w:hanging="360"/>
+      </w:pPr>
+      <w:rPr>
+        <w:rFonts w:ascii="Wingdings" w:hAnsi="Wingdings" w:hint="default"/>
+        <w:sz w:val="20"/>
+      </w:rPr>
+    </w:lvl>
+    <w:lvl w:ilvl="7" w:tentative="1">
+      <w:start w:val="1"/>
+      <w:numFmt w:val="bullet"/>
+      <w:lvlText w:val=""/>
+      <w:lvlJc w:val="left"/>
+      <w:pPr>
+        <w:tabs>
+          <w:tab w:val="num" w:pos="5760"/>
+        </w:tabs>
+        <w:ind w:left="5760" w:hanging="360"/>
+      </w:pPr>
+      <w:rPr>
+        <w:rFonts w:ascii="Wingdings" w:hAnsi="Wingdings" w:hint="default"/>
+        <w:sz w:val="20"/>
+      </w:rPr>
+    </w:lvl>
+    <w:lvl w:ilvl="8" w:tentative="1">
+      <w:start w:val="1"/>
+      <w:numFmt w:val="bullet"/>
+      <w:lvlText w:val=""/>
+      <w:lvlJc w:val="left"/>
+      <w:pPr>
+        <w:tabs>
+          <w:tab w:val="num" w:pos="6480"/>
+        </w:tabs>
+        <w:ind w:left="6480" w:hanging="360"/>
+      </w:pPr>
+      <w:rPr>
+        <w:rFonts w:ascii="Wingdings" w:hAnsi="Wingdings" w:hint="default"/>
+        <w:sz w:val="20"/>
+      </w:rPr>
+    </w:lvl>
+  </w:abstractNum>
+  <w:abstractNum w:abstractNumId="10" w15:restartNumberingAfterBreak="0">
     <w:nsid w:val="0D547D4A"/>
     <w:multiLevelType w:val="multilevel"/>
     <w:tmpl w:val="9F3C2A74"/>
@@ -3409,7 +4620,156 @@
       </w:rPr>
     </w:lvl>
   </w:abstractNum>
-  <w:abstractNum w:abstractNumId="10" w15:restartNumberingAfterBreak="0">
+  <w:abstractNum w:abstractNumId="11" w15:restartNumberingAfterBreak="0">
+    <w:nsid w:val="1B7E754D"/>
+    <w:multiLevelType w:val="multilevel"/>
+    <w:tmpl w:val="AA2869E6"/>
+    <w:lvl w:ilvl="0">
+      <w:start w:val="1"/>
+      <w:numFmt w:val="bullet"/>
+      <w:lvlText w:val=""/>
+      <w:lvlJc w:val="left"/>
+      <w:pPr>
+        <w:tabs>
+          <w:tab w:val="num" w:pos="720"/>
+        </w:tabs>
+        <w:ind w:left="720" w:hanging="360"/>
+      </w:pPr>
+      <w:rPr>
+        <w:rFonts w:ascii="Symbol" w:hAnsi="Symbol" w:hint="default"/>
+        <w:sz w:val="20"/>
+      </w:rPr>
+    </w:lvl>
+    <w:lvl w:ilvl="1" w:tentative="1">
+      <w:start w:val="1"/>
+      <w:numFmt w:val="bullet"/>
+      <w:lvlText w:val="o"/>
+      <w:lvlJc w:val="left"/>
+      <w:pPr>
+        <w:tabs>
+          <w:tab w:val="num" w:pos="1440"/>
+        </w:tabs>
+        <w:ind w:left="1440" w:hanging="360"/>
+      </w:pPr>
+      <w:rPr>
+        <w:rFonts w:ascii="Courier New" w:hAnsi="Courier New" w:hint="default"/>
+        <w:sz w:val="20"/>
+      </w:rPr>
+    </w:lvl>
+    <w:lvl w:ilvl="2" w:tentative="1">
+      <w:start w:val="1"/>
+      <w:numFmt w:val="bullet"/>
+      <w:lvlText w:val=""/>
+      <w:lvlJc w:val="left"/>
+      <w:pPr>
+        <w:tabs>
+          <w:tab w:val="num" w:pos="2160"/>
+        </w:tabs>
+        <w:ind w:left="2160" w:hanging="360"/>
+      </w:pPr>
+      <w:rPr>
+        <w:rFonts w:ascii="Wingdings" w:hAnsi="Wingdings" w:hint="default"/>
+        <w:sz w:val="20"/>
+      </w:rPr>
+    </w:lvl>
+    <w:lvl w:ilvl="3" w:tentative="1">
+      <w:start w:val="1"/>
+      <w:numFmt w:val="bullet"/>
+      <w:lvlText w:val=""/>
+      <w:lvlJc w:val="left"/>
+      <w:pPr>
+        <w:tabs>
+          <w:tab w:val="num" w:pos="2880"/>
+        </w:tabs>
+        <w:ind w:left="2880" w:hanging="360"/>
+      </w:pPr>
+      <w:rPr>
+        <w:rFonts w:ascii="Wingdings" w:hAnsi="Wingdings" w:hint="default"/>
+        <w:sz w:val="20"/>
+      </w:rPr>
+    </w:lvl>
+    <w:lvl w:ilvl="4" w:tentative="1">
+      <w:start w:val="1"/>
+      <w:numFmt w:val="bullet"/>
+      <w:lvlText w:val=""/>
+      <w:lvlJc w:val="left"/>
+      <w:pPr>
+        <w:tabs>
+          <w:tab w:val="num" w:pos="3600"/>
+        </w:tabs>
+        <w:ind w:left="3600" w:hanging="360"/>
+      </w:pPr>
+      <w:rPr>
+        <w:rFonts w:ascii="Wingdings" w:hAnsi="Wingdings" w:hint="default"/>
+        <w:sz w:val="20"/>
+      </w:rPr>
+    </w:lvl>
+    <w:lvl w:ilvl="5" w:tentative="1">
+      <w:start w:val="1"/>
+      <w:numFmt w:val="bullet"/>
+      <w:lvlText w:val=""/>
+      <w:lvlJc w:val="left"/>
+      <w:pPr>
+        <w:tabs>
+          <w:tab w:val="num" w:pos="4320"/>
+        </w:tabs>
+        <w:ind w:left="4320" w:hanging="360"/>
+      </w:pPr>
+      <w:rPr>
+        <w:rFonts w:ascii="Wingdings" w:hAnsi="Wingdings" w:hint="default"/>
+        <w:sz w:val="20"/>
+      </w:rPr>
+    </w:lvl>
+    <w:lvl w:ilvl="6" w:tentative="1">
+      <w:start w:val="1"/>
+      <w:numFmt w:val="bullet"/>
+      <w:lvlText w:val=""/>
+      <w:lvlJc w:val="left"/>
+      <w:pPr>
+        <w:tabs>
+          <w:tab w:val="num" w:pos="5040"/>
+        </w:tabs>
+        <w:ind w:left="5040" w:hanging="360"/>
+      </w:pPr>
+      <w:rPr>
+        <w:rFonts w:ascii="Wingdings" w:hAnsi="Wingdings" w:hint="default"/>
+        <w:sz w:val="20"/>
+      </w:rPr>
+    </w:lvl>
+    <w:lvl w:ilvl="7" w:tentative="1">
+      <w:start w:val="1"/>
+      <w:numFmt w:val="bullet"/>
+      <w:lvlText w:val=""/>
+      <w:lvlJc w:val="left"/>
+      <w:pPr>
+        <w:tabs>
+          <w:tab w:val="num" w:pos="5760"/>
+        </w:tabs>
+        <w:ind w:left="5760" w:hanging="360"/>
+      </w:pPr>
+      <w:rPr>
+        <w:rFonts w:ascii="Wingdings" w:hAnsi="Wingdings" w:hint="default"/>
+        <w:sz w:val="20"/>
+      </w:rPr>
+    </w:lvl>
+    <w:lvl w:ilvl="8" w:tentative="1">
+      <w:start w:val="1"/>
+      <w:numFmt w:val="bullet"/>
+      <w:lvlText w:val=""/>
+      <w:lvlJc w:val="left"/>
+      <w:pPr>
+        <w:tabs>
+          <w:tab w:val="num" w:pos="6480"/>
+        </w:tabs>
+        <w:ind w:left="6480" w:hanging="360"/>
+      </w:pPr>
+      <w:rPr>
+        <w:rFonts w:ascii="Wingdings" w:hAnsi="Wingdings" w:hint="default"/>
+        <w:sz w:val="20"/>
+      </w:rPr>
+    </w:lvl>
+  </w:abstractNum>
+  <w:abstractNum w:abstractNumId="12" w15:restartNumberingAfterBreak="0">
     <w:nsid w:val="22EB3A11"/>
     <w:multiLevelType w:val="multilevel"/>
     <w:tmpl w:val="DC90425A"/>
@@ -3558,7 +4918,7 @@
       </w:rPr>
     </w:lvl>
   </w:abstractNum>
-  <w:abstractNum w:abstractNumId="11" w15:restartNumberingAfterBreak="0">
+  <w:abstractNum w:abstractNumId="13" w15:restartNumberingAfterBreak="0">
     <w:nsid w:val="25961B8E"/>
     <w:multiLevelType w:val="multilevel"/>
     <w:tmpl w:val="9D9283AE"/>
@@ -3707,7 +5067,156 @@
       </w:rPr>
     </w:lvl>
   </w:abstractNum>
-  <w:abstractNum w:abstractNumId="12" w15:restartNumberingAfterBreak="0">
+  <w:abstractNum w:abstractNumId="14" w15:restartNumberingAfterBreak="0">
+    <w:nsid w:val="33C83A4C"/>
+    <w:multiLevelType w:val="multilevel"/>
+    <w:tmpl w:val="648A9654"/>
+    <w:lvl w:ilvl="0">
+      <w:start w:val="1"/>
+      <w:numFmt w:val="bullet"/>
+      <w:lvlText w:val=""/>
+      <w:lvlJc w:val="left"/>
+      <w:pPr>
+        <w:tabs>
+          <w:tab w:val="num" w:pos="720"/>
+        </w:tabs>
+        <w:ind w:left="720" w:hanging="360"/>
+      </w:pPr>
+      <w:rPr>
+        <w:rFonts w:ascii="Symbol" w:hAnsi="Symbol" w:hint="default"/>
+        <w:sz w:val="20"/>
+      </w:rPr>
+    </w:lvl>
+    <w:lvl w:ilvl="1" w:tentative="1">
+      <w:start w:val="1"/>
+      <w:numFmt w:val="bullet"/>
+      <w:lvlText w:val="o"/>
+      <w:lvlJc w:val="left"/>
+      <w:pPr>
+        <w:tabs>
+          <w:tab w:val="num" w:pos="1440"/>
+        </w:tabs>
+        <w:ind w:left="1440" w:hanging="360"/>
+      </w:pPr>
+      <w:rPr>
+        <w:rFonts w:ascii="Courier New" w:hAnsi="Courier New" w:hint="default"/>
+        <w:sz w:val="20"/>
+      </w:rPr>
+    </w:lvl>
+    <w:lvl w:ilvl="2" w:tentative="1">
+      <w:start w:val="1"/>
+      <w:numFmt w:val="bullet"/>
+      <w:lvlText w:val=""/>
+      <w:lvlJc w:val="left"/>
+      <w:pPr>
+        <w:tabs>
+          <w:tab w:val="num" w:pos="2160"/>
+        </w:tabs>
+        <w:ind w:left="2160" w:hanging="360"/>
+      </w:pPr>
+      <w:rPr>
+        <w:rFonts w:ascii="Wingdings" w:hAnsi="Wingdings" w:hint="default"/>
+        <w:sz w:val="20"/>
+      </w:rPr>
+    </w:lvl>
+    <w:lvl w:ilvl="3" w:tentative="1">
+      <w:start w:val="1"/>
+      <w:numFmt w:val="bullet"/>
+      <w:lvlText w:val=""/>
+      <w:lvlJc w:val="left"/>
+      <w:pPr>
+        <w:tabs>
+          <w:tab w:val="num" w:pos="2880"/>
+        </w:tabs>
+        <w:ind w:left="2880" w:hanging="360"/>
+      </w:pPr>
+      <w:rPr>
+        <w:rFonts w:ascii="Wingdings" w:hAnsi="Wingdings" w:hint="default"/>
+        <w:sz w:val="20"/>
+      </w:rPr>
+    </w:lvl>
+    <w:lvl w:ilvl="4" w:tentative="1">
+      <w:start w:val="1"/>
+      <w:numFmt w:val="bullet"/>
+      <w:lvlText w:val=""/>
+      <w:lvlJc w:val="left"/>
+      <w:pPr>
+        <w:tabs>
+          <w:tab w:val="num" w:pos="3600"/>
+        </w:tabs>
+        <w:ind w:left="3600" w:hanging="360"/>
+      </w:pPr>
+      <w:rPr>
+        <w:rFonts w:ascii="Wingdings" w:hAnsi="Wingdings" w:hint="default"/>
+        <w:sz w:val="20"/>
+      </w:rPr>
+    </w:lvl>
+    <w:lvl w:ilvl="5" w:tentative="1">
+      <w:start w:val="1"/>
+      <w:numFmt w:val="bullet"/>
+      <w:lvlText w:val=""/>
+      <w:lvlJc w:val="left"/>
+      <w:pPr>
+        <w:tabs>
+          <w:tab w:val="num" w:pos="4320"/>
+        </w:tabs>
+        <w:ind w:left="4320" w:hanging="360"/>
+      </w:pPr>
+      <w:rPr>
+        <w:rFonts w:ascii="Wingdings" w:hAnsi="Wingdings" w:hint="default"/>
+        <w:sz w:val="20"/>
+      </w:rPr>
+    </w:lvl>
+    <w:lvl w:ilvl="6" w:tentative="1">
+      <w:start w:val="1"/>
+      <w:numFmt w:val="bullet"/>
+      <w:lvlText w:val=""/>
+      <w:lvlJc w:val="left"/>
+      <w:pPr>
+        <w:tabs>
+          <w:tab w:val="num" w:pos="5040"/>
+        </w:tabs>
+        <w:ind w:left="5040" w:hanging="360"/>
+      </w:pPr>
+      <w:rPr>
+        <w:rFonts w:ascii="Wingdings" w:hAnsi="Wingdings" w:hint="default"/>
+        <w:sz w:val="20"/>
+      </w:rPr>
+    </w:lvl>
+    <w:lvl w:ilvl="7" w:tentative="1">
+      <w:start w:val="1"/>
+      <w:numFmt w:val="bullet"/>
+      <w:lvlText w:val=""/>
+      <w:lvlJc w:val="left"/>
+      <w:pPr>
+        <w:tabs>
+          <w:tab w:val="num" w:pos="5760"/>
+        </w:tabs>
+        <w:ind w:left="5760" w:hanging="360"/>
+      </w:pPr>
+      <w:rPr>
+        <w:rFonts w:ascii="Wingdings" w:hAnsi="Wingdings" w:hint="default"/>
+        <w:sz w:val="20"/>
+      </w:rPr>
+    </w:lvl>
+    <w:lvl w:ilvl="8" w:tentative="1">
+      <w:start w:val="1"/>
+      <w:numFmt w:val="bullet"/>
+      <w:lvlText w:val=""/>
+      <w:lvlJc w:val="left"/>
+      <w:pPr>
+        <w:tabs>
+          <w:tab w:val="num" w:pos="6480"/>
+        </w:tabs>
+        <w:ind w:left="6480" w:hanging="360"/>
+      </w:pPr>
+      <w:rPr>
+        <w:rFonts w:ascii="Wingdings" w:hAnsi="Wingdings" w:hint="default"/>
+        <w:sz w:val="20"/>
+      </w:rPr>
+    </w:lvl>
+  </w:abstractNum>
+  <w:abstractNum w:abstractNumId="15" w15:restartNumberingAfterBreak="0">
     <w:nsid w:val="6FAB3386"/>
     <w:multiLevelType w:val="multilevel"/>
     <w:tmpl w:val="D7849678"/>
@@ -3884,16 +5393,25 @@
     <w:abstractNumId w:val="0"/>
   </w:num>
   <w:num w:numId="10" w16cid:durableId="536428290">
+    <w:abstractNumId w:val="13"/>
+  </w:num>
+  <w:num w:numId="11" w16cid:durableId="2056275302">
+    <w:abstractNumId w:val="15"/>
+  </w:num>
+  <w:num w:numId="12" w16cid:durableId="1962373001">
+    <w:abstractNumId w:val="10"/>
+  </w:num>
+  <w:num w:numId="13" w16cid:durableId="23756049">
+    <w:abstractNumId w:val="12"/>
+  </w:num>
+  <w:num w:numId="14" w16cid:durableId="2044136608">
     <w:abstractNumId w:val="11"/>
   </w:num>
-  <w:num w:numId="11" w16cid:durableId="2056275302">
-    <w:abstractNumId w:val="12"/>
-  </w:num>
-  <w:num w:numId="12" w16cid:durableId="1962373001">
+  <w:num w:numId="15" w16cid:durableId="793214008">
     <w:abstractNumId w:val="9"/>
   </w:num>
-  <w:num w:numId="13" w16cid:durableId="23756049">
-    <w:abstractNumId w:val="10"/>
+  <w:num w:numId="16" w16cid:durableId="1209878542">
+    <w:abstractNumId w:val="14"/>
   </w:num>
 </w:numbering>
 </file>
@@ -4503,7 +6021,6 @@
   <w:style w:type="character" w:default="1" w:styleId="DefaultParagraphFont">
     <w:name w:val="Default Paragraph Font"/>
     <w:uiPriority w:val="1"/>
-    <w:semiHidden/>
     <w:unhideWhenUsed/>
   </w:style>
   <w:style w:type="table" w:default="1" w:styleId="TableNormal">

</xml_diff>

<commit_message>
Added Part C and Part D to working document
</commit_message>
<xml_diff>
--- a/QuickBite_A2_Team_Coding.docx
+++ b/QuickBite_A2_Team_Coding.docx
@@ -1,6 +1,6 @@
 
 <file path=word/document.xml><?xml version="1.0" encoding="utf-8"?>
-<w:document xmlns:wpc="http://schemas.microsoft.com/office/word/2010/wordprocessingCanvas" xmlns:cx="http://schemas.microsoft.com/office/drawing/2014/chartex" xmlns:cx1="http://schemas.microsoft.com/office/drawing/2015/9/8/chartex" xmlns:cx2="http://schemas.microsoft.com/office/drawing/2015/10/21/chartex" xmlns:cx3="http://schemas.microsoft.com/office/drawing/2016/5/9/chartex" xmlns:cx4="http://schemas.microsoft.com/office/drawing/2016/5/10/chartex" xmlns:cx5="http://schemas.microsoft.com/office/drawing/2016/5/11/chartex" xmlns:cx6="http://schemas.microsoft.com/office/drawing/2016/5/12/chartex" xmlns:cx7="http://schemas.microsoft.com/office/drawing/2016/5/13/chartex" xmlns:cx8="http://schemas.microsoft.com/office/drawing/2016/5/14/chartex" xmlns:mc="http://schemas.openxmlformats.org/markup-compatibility/2006" xmlns:aink="http://schemas.microsoft.com/office/drawing/2016/ink" xmlns:am3d="http://schemas.microsoft.com/office/drawing/2017/model3d" xmlns:o="urn:schemas-microsoft-com:office:office" xmlns:oel="http://schemas.microsoft.com/office/2019/extlst" xmlns:r="http://schemas.openxmlformats.org/officeDocument/2006/relationships" xmlns:m="http://schemas.openxmlformats.org/officeDocument/2006/math" xmlns:v="urn:schemas-microsoft-com:vml" xmlns:wp14="http://schemas.microsoft.com/office/word/2010/wordprocessingDrawing" xmlns:wp="http://schemas.openxmlformats.org/drawingml/2006/wordprocessingDrawing" xmlns:w10="urn:schemas-microsoft-com:office:word" xmlns:w="http://schemas.openxmlformats.org/wordprocessingml/2006/main" xmlns:w14="http://schemas.microsoft.com/office/word/2010/wordml" xmlns:w15="http://schemas.microsoft.com/office/word/2012/wordml" xmlns:w16cex="http://schemas.microsoft.com/office/word/2018/wordml/cex" xmlns:w16cid="http://schemas.microsoft.com/office/word/2016/wordml/cid" xmlns:w16="http://schemas.microsoft.com/office/word/2018/wordml" xmlns:w16du="http://schemas.microsoft.com/office/word/2023/wordml/word16du" xmlns:w16sdtdh="http://schemas.microsoft.com/office/word/2020/wordml/sdtdatahash" xmlns:w16sdtfl="http://schemas.microsoft.com/office/word/2024/wordml/sdtformatlock" xmlns:w16se="http://schemas.microsoft.com/office/word/2015/wordml/symex" xmlns:wpg="http://schemas.microsoft.com/office/word/2010/wordprocessingGroup" xmlns:wpi="http://schemas.microsoft.com/office/word/2010/wordprocessingInk" xmlns:wne="http://schemas.microsoft.com/office/word/2006/wordml" xmlns:wps="http://schemas.microsoft.com/office/word/2010/wordprocessingShape" mc:Ignorable="w14 w15 w16se w16cid w16 w16cex w16sdtdh w16sdtfl w16du wp14">
+<w:document xmlns:wpc="http://schemas.microsoft.com/office/word/2010/wordprocessingCanvas" xmlns:cx="http://schemas.microsoft.com/office/drawing/2014/chartex" xmlns:cx1="http://schemas.microsoft.com/office/drawing/2015/9/8/chartex" xmlns:cx2="http://schemas.microsoft.com/office/drawing/2015/10/21/chartex" xmlns:cx3="http://schemas.microsoft.com/office/drawing/2016/5/9/chartex" xmlns:cx4="http://schemas.microsoft.com/office/drawing/2016/5/10/chartex" xmlns:cx5="http://schemas.microsoft.com/office/drawing/2016/5/11/chartex" xmlns:cx6="http://schemas.microsoft.com/office/drawing/2016/5/12/chartex" xmlns:cx7="http://schemas.microsoft.com/office/drawing/2016/5/13/chartex" xmlns:cx8="http://schemas.microsoft.com/office/drawing/2016/5/14/chartex" xmlns:mc="http://schemas.openxmlformats.org/markup-compatibility/2006" xmlns:m="http://schemas.openxmlformats.org/officeDocument/2006/math" xmlns:aink="http://schemas.microsoft.com/office/drawing/2016/ink" xmlns:am3d="http://schemas.microsoft.com/office/drawing/2017/model3d" xmlns:oel="http://schemas.microsoft.com/office/2019/extlst" xmlns:r="http://schemas.openxmlformats.org/officeDocument/2006/relationships" xmlns:wp14="http://schemas.microsoft.com/office/word/2010/wordprocessingDrawing" xmlns:wp="http://schemas.openxmlformats.org/drawingml/2006/wordprocessingDrawing" xmlns:wpg="http://schemas.microsoft.com/office/word/2010/wordprocessingGroup" xmlns:wpi="http://schemas.microsoft.com/office/word/2010/wordprocessingInk" xmlns:wps="http://schemas.microsoft.com/office/word/2010/wordprocessingShape" xmlns:o="urn:schemas-microsoft-com:office:office" xmlns:v="urn:schemas-microsoft-com:vml" xmlns:w10="urn:schemas-microsoft-com:office:word" xmlns:w="http://schemas.openxmlformats.org/wordprocessingml/2006/main" xmlns:w14="http://schemas.microsoft.com/office/word/2010/wordml" xmlns:w15="http://schemas.microsoft.com/office/word/2012/wordml" xmlns:w16cex="http://schemas.microsoft.com/office/word/2018/wordml/cex" xmlns:w16cid="http://schemas.microsoft.com/office/word/2016/wordml/cid" xmlns:w16="http://schemas.microsoft.com/office/word/2018/wordml" xmlns:w16sdtdh="http://schemas.microsoft.com/office/word/2020/wordml/sdtdatahash" xmlns:w16sdtfl="http://schemas.microsoft.com/office/word/2024/wordml/sdtformatlock" xmlns:w16se="http://schemas.microsoft.com/office/word/2015/wordml/symex" xmlns:w16du="http://schemas.microsoft.com/office/word/2023/wordml/word16du" xmlns:wne="http://schemas.microsoft.com/office/word/2006/wordml" mc:Ignorable="w14 w15 w16se w16cid w16 w16cex w16sdtdh w16sdtfl w16du wp14">
   <w:body>
     <w:p>
       <w:pPr>
@@ -92,9 +92,9 @@
         <w:tblLook w:val="04A0" w:firstRow="1" w:lastRow="0" w:firstColumn="1" w:lastColumn="0" w:noHBand="0" w:noVBand="1"/>
       </w:tblPr>
       <w:tblGrid>
-        <w:gridCol w:w="3456"/>
-        <w:gridCol w:w="3456"/>
-        <w:gridCol w:w="3456"/>
+        <w:gridCol w:w="3452"/>
+        <w:gridCol w:w="3453"/>
+        <w:gridCol w:w="3453"/>
       </w:tblGrid>
       <w:tr>
         <w:trPr>
@@ -346,12 +346,12 @@
         <w:tblLook w:val="04A0" w:firstRow="1" w:lastRow="0" w:firstColumn="1" w:lastColumn="0" w:noHBand="0" w:noVBand="1"/>
       </w:tblPr>
       <w:tblGrid>
-        <w:gridCol w:w="1728"/>
-        <w:gridCol w:w="1728"/>
-        <w:gridCol w:w="1728"/>
-        <w:gridCol w:w="1728"/>
-        <w:gridCol w:w="1728"/>
-        <w:gridCol w:w="1728"/>
+        <w:gridCol w:w="1725"/>
+        <w:gridCol w:w="1727"/>
+        <w:gridCol w:w="1727"/>
+        <w:gridCol w:w="1727"/>
+        <w:gridCol w:w="1726"/>
+        <w:gridCol w:w="1726"/>
       </w:tblGrid>
       <w:tr>
         <w:trPr>
@@ -1522,9 +1522,9 @@
         <w:tblLook w:val="04A0" w:firstRow="1" w:lastRow="0" w:firstColumn="1" w:lastColumn="0" w:noHBand="0" w:noVBand="1"/>
       </w:tblPr>
       <w:tblGrid>
-        <w:gridCol w:w="3456"/>
-        <w:gridCol w:w="3456"/>
-        <w:gridCol w:w="3456"/>
+        <w:gridCol w:w="3453"/>
+        <w:gridCol w:w="3452"/>
+        <w:gridCol w:w="3453"/>
       </w:tblGrid>
       <w:tr>
         <w:trPr>
@@ -2631,7 +2631,1183 @@
         <w:pStyle w:val="ListBullet"/>
       </w:pPr>
       <w:r>
-        <w:t>Product Owner K still needs to confirm top-five priorities and Product Backlog order; this selection is the team’s current Sprint plan.</w:t>
+        <w:t xml:space="preserve">Product Owner K still needs to confirm </w:t>
+      </w:r>
+      <w:proofErr w:type="gramStart"/>
+      <w:r>
+        <w:t>top-five</w:t>
+      </w:r>
+      <w:proofErr w:type="gramEnd"/>
+      <w:r>
+        <w:t xml:space="preserve"> priorities and Product Backlog order; this selection is the team’s current Sprint plan.</w:t>
+      </w:r>
+    </w:p>
+    <w:p>
+      <w:pPr>
+        <w:pStyle w:val="ListBullet"/>
+        <w:numPr>
+          <w:ilvl w:val="0"/>
+          <w:numId w:val="0"/>
+        </w:numPr>
+      </w:pPr>
+    </w:p>
+    <w:p>
+      <w:pPr>
+        <w:pStyle w:val="ListBullet"/>
+        <w:numPr>
+          <w:ilvl w:val="0"/>
+          <w:numId w:val="0"/>
+        </w:numPr>
+        <w:rPr>
+          <w:rFonts w:asciiTheme="majorHAnsi" w:hAnsiTheme="majorHAnsi" w:cstheme="majorHAnsi"/>
+          <w:b/>
+          <w:bCs/>
+          <w:color w:val="365F91" w:themeColor="accent1" w:themeShade="BF"/>
+          <w:sz w:val="30"/>
+          <w:szCs w:val="30"/>
+          <w:lang w:val="en-CA"/>
+        </w:rPr>
+      </w:pPr>
+      <w:r>
+        <w:rPr>
+          <w:rFonts w:asciiTheme="majorHAnsi" w:hAnsiTheme="majorHAnsi" w:cstheme="majorHAnsi"/>
+          <w:b/>
+          <w:bCs/>
+          <w:color w:val="365F91" w:themeColor="accent1" w:themeShade="BF"/>
+          <w:sz w:val="30"/>
+          <w:szCs w:val="30"/>
+          <w:lang w:val="en-CA"/>
+        </w:rPr>
+        <w:t>Part C — Sprint Planning</w:t>
+      </w:r>
+    </w:p>
+    <w:p>
+      <w:r>
+        <w:t>Our Sprint Goal was to build a basic customer ordering flow for QuickBite. Customers should be able to browse restaurants, view a menu, add available items to an order, select a pickup time, and place the order.</w:t>
+      </w:r>
+    </w:p>
+    <w:p>
+      <w:r>
+        <w:t>We selected five Product Backlog Items: Browse Restaurants, View Restaurant Menu, Add Items to Order, Select Pickup Time, and Place Order. These totalled 16 story points and were divided into 28 smaller tasks on GitHub.</w:t>
+      </w:r>
+    </w:p>
+    <w:p>
+      <w:r>
+        <w:t>The planned capacity was 10 hours per member, for a total of 40 hours. Dhruv was responsible for restaurant browsing, order storage, confirmation, and final integration. Ray handled the menu data, menu page, restaurant filtering, and item availability. Jou handled the cart, quantities, and current-order display. Karim handled pickup-time selection, validation, and order submission.</w:t>
+      </w:r>
+    </w:p>
+    <w:p>
+      <w:r>
+        <w:t>The tasks depended on each other. For example, the menu needed the restaurant IDs, and the cart needed the menu-item data. We agreed to share these details so the different features could connect.</w:t>
+      </w:r>
+    </w:p>
+    <w:p>
+      <w:r>
+        <w:t>We used GitHub Projects to track tasks and separate branches and pull requests to combine our work. Our agreed process required testing, review, integration, and meeting the acceptance criteria before marking work Done.</w:t>
+      </w:r>
+    </w:p>
+    <w:p>
+      <w:pPr>
+        <w:pStyle w:val="ListBullet"/>
+        <w:numPr>
+          <w:ilvl w:val="0"/>
+          <w:numId w:val="0"/>
+        </w:numPr>
+        <w:ind w:left="360"/>
+        <w:rPr>
+          <w:rFonts w:cstheme="majorHAnsi"/>
+          <w:szCs w:val="20"/>
+        </w:rPr>
+      </w:pPr>
+    </w:p>
+    <w:p>
+      <w:pPr>
+        <w:pStyle w:val="ListBullet"/>
+        <w:numPr>
+          <w:ilvl w:val="0"/>
+          <w:numId w:val="0"/>
+        </w:numPr>
+        <w:rPr>
+          <w:rFonts w:asciiTheme="majorHAnsi" w:hAnsiTheme="majorHAnsi" w:cstheme="majorHAnsi"/>
+          <w:b/>
+          <w:bCs/>
+          <w:color w:val="365F91" w:themeColor="accent1" w:themeShade="BF"/>
+          <w:sz w:val="30"/>
+          <w:szCs w:val="30"/>
+          <w:lang w:val="en-CA"/>
+        </w:rPr>
+      </w:pPr>
+      <w:r>
+        <w:rPr>
+          <w:rFonts w:asciiTheme="majorHAnsi" w:hAnsiTheme="majorHAnsi" w:cstheme="majorHAnsi"/>
+          <w:b/>
+          <w:bCs/>
+          <w:color w:val="365F91" w:themeColor="accent1" w:themeShade="BF"/>
+          <w:sz w:val="30"/>
+          <w:szCs w:val="30"/>
+          <w:lang w:val="en-CA"/>
+        </w:rPr>
+        <w:t>Part D — Working Increment</w:t>
+      </w:r>
+    </w:p>
+    <w:p>
+      <w:r>
+        <w:t xml:space="preserve">We developed </w:t>
+      </w:r>
+      <w:proofErr w:type="spellStart"/>
+      <w:r>
+        <w:t>QuickBite</w:t>
+      </w:r>
+      <w:proofErr w:type="spellEnd"/>
+      <w:r>
+        <w:t xml:space="preserve"> using HTML, CSS, and JavaScript. The work was split between the four team members, with each person building their assigned features on a separate Git branch before combining the changes through pull requests.</w:t>
+      </w:r>
+    </w:p>
+    <w:p>
+      <w:r>
+        <w:t>My contribution was the restaurant menu and item availability. I created the menu data and menu page, connected the selected restaurant to its menu, and displayed each item’s name, price, and availability. Each menu item had a unique ID and restaurant ID so it could work with Jou’s cart functionality. Unavailable items had their Add to Order button disabled, with an additional availability check in the click handler.</w:t>
+      </w:r>
+    </w:p>
+    <w:p>
+      <w:r>
+        <w:lastRenderedPageBreak/>
+        <w:t>I tested Pizza Palace, Burger House, and Sushi Spot using Live Server. Each restaurant displayed its own menu. Garlic Bread, Fries, and Miso Soup were unavailable and could not be added through the buttons. Available items could be added: two Margherita pizzas showed $25.98, one Classic Burger showed $9.99, and one California Roll showed $8.99.</w:t>
+      </w:r>
+    </w:p>
+    <w:p/>
+    <w:p>
+      <w:r>
+        <w:t>During integration testing, I also found that clicking Place Order did nothing, both with and without a pickup time selected. I reported this separately in GitHub issue #42. A fix was later merged through pull request #43, but the updated order submission still needed to be retested.</w:t>
+      </w:r>
+    </w:p>
+    <w:p>
+      <w:r>
+        <w:t>I recorded my menu and availability testing in issue #20 and attached screenshots as evidence. My six assigned tasks were marked Done on the GitHub project board.</w:t>
+      </w:r>
+    </w:p>
+    <w:p>
+      <w:pPr>
+        <w:pStyle w:val="ListBullet"/>
+        <w:numPr>
+          <w:ilvl w:val="0"/>
+          <w:numId w:val="0"/>
+        </w:numPr>
+        <w:ind w:left="360" w:hanging="360"/>
+        <w:rPr>
+          <w:lang w:val="en-CA"/>
+        </w:rPr>
+      </w:pPr>
+    </w:p>
+    <w:p>
+      <w:pPr>
+        <w:pStyle w:val="ListBullet"/>
+        <w:numPr>
+          <w:ilvl w:val="0"/>
+          <w:numId w:val="0"/>
+        </w:numPr>
+        <w:ind w:left="360" w:hanging="360"/>
+      </w:pPr>
+    </w:p>
+    <w:p>
+      <w:pPr>
+        <w:pStyle w:val="ListBullet"/>
+        <w:numPr>
+          <w:ilvl w:val="0"/>
+          <w:numId w:val="0"/>
+        </w:numPr>
+        <w:rPr>
+          <w:rFonts w:asciiTheme="majorHAnsi" w:hAnsiTheme="majorHAnsi" w:cstheme="majorHAnsi"/>
+          <w:b/>
+          <w:bCs/>
+          <w:color w:val="365F91" w:themeColor="accent1" w:themeShade="BF"/>
+          <w:sz w:val="30"/>
+          <w:szCs w:val="30"/>
+          <w:lang w:val="en-CA"/>
+        </w:rPr>
+      </w:pPr>
+      <w:r>
+        <w:rPr>
+          <w:rFonts w:asciiTheme="majorHAnsi" w:hAnsiTheme="majorHAnsi" w:cstheme="majorHAnsi"/>
+          <w:b/>
+          <w:bCs/>
+          <w:color w:val="365F91" w:themeColor="accent1" w:themeShade="BF"/>
+          <w:sz w:val="30"/>
+          <w:szCs w:val="30"/>
+          <w:lang w:val="en-CA"/>
+        </w:rPr>
+        <w:t>8.Part G — Sprint Review</w:t>
+      </w:r>
+    </w:p>
+    <w:p>
+      <w:pPr>
+        <w:pStyle w:val="ListBullet"/>
+        <w:numPr>
+          <w:ilvl w:val="0"/>
+          <w:numId w:val="0"/>
+        </w:numPr>
+        <w:rPr>
+          <w:rFonts w:cstheme="majorHAnsi"/>
+          <w:szCs w:val="20"/>
+        </w:rPr>
+      </w:pPr>
+      <w:r>
+        <w:rPr>
+          <w:rFonts w:cstheme="majorHAnsi"/>
+          <w:szCs w:val="20"/>
+        </w:rPr>
+        <w:t xml:space="preserve">At the end of the Sprint, the team demonstrated the working </w:t>
+      </w:r>
+      <w:proofErr w:type="spellStart"/>
+      <w:r>
+        <w:rPr>
+          <w:rFonts w:cstheme="majorHAnsi"/>
+          <w:szCs w:val="20"/>
+        </w:rPr>
+        <w:t>QuickBite</w:t>
+      </w:r>
+      <w:proofErr w:type="spellEnd"/>
+      <w:r>
+        <w:rPr>
+          <w:rFonts w:cstheme="majorHAnsi"/>
+          <w:szCs w:val="20"/>
+        </w:rPr>
+        <w:t xml:space="preserve"> Increment. The demonstration showed the customer ordering flow, including browsing restaurants, viewing a restaurant menu, adding available items to the order, selecting quantities, viewing the current order, choosing a pickup time, and placing the order. This demonstrated the main features selected for the Sprint and supported the Sprint Goal.</w:t>
+      </w:r>
+    </w:p>
+    <w:p>
+      <w:pPr>
+        <w:pStyle w:val="ListBullet"/>
+        <w:numPr>
+          <w:ilvl w:val="0"/>
+          <w:numId w:val="0"/>
+        </w:numPr>
+        <w:rPr>
+          <w:rFonts w:cstheme="majorHAnsi"/>
+          <w:szCs w:val="20"/>
+        </w:rPr>
+      </w:pPr>
+    </w:p>
+    <w:p>
+      <w:pPr>
+        <w:pStyle w:val="ListBullet"/>
+        <w:numPr>
+          <w:ilvl w:val="0"/>
+          <w:numId w:val="0"/>
+        </w:numPr>
+        <w:ind w:left="360" w:hanging="360"/>
+        <w:rPr>
+          <w:rFonts w:cstheme="majorHAnsi"/>
+          <w:szCs w:val="20"/>
+          <w:lang w:val="en-CA"/>
+        </w:rPr>
+      </w:pPr>
+      <w:r>
+        <w:rPr>
+          <w:rFonts w:cstheme="majorHAnsi"/>
+          <w:szCs w:val="20"/>
+          <w:lang w:val="en-CA"/>
+        </w:rPr>
+        <w:t>During the Sprint Review, the stakeholder provided the following feedback:</w:t>
+      </w:r>
+    </w:p>
+    <w:p>
+      <w:pPr>
+        <w:pStyle w:val="ListBullet"/>
+        <w:numPr>
+          <w:ilvl w:val="0"/>
+          <w:numId w:val="0"/>
+        </w:numPr>
+        <w:ind w:left="360" w:hanging="360"/>
+        <w:rPr>
+          <w:rFonts w:cstheme="majorHAnsi"/>
+          <w:szCs w:val="20"/>
+          <w:lang w:val="en-CA"/>
+        </w:rPr>
+      </w:pPr>
+    </w:p>
+    <w:p>
+      <w:pPr>
+        <w:pStyle w:val="ListBullet"/>
+        <w:numPr>
+          <w:ilvl w:val="0"/>
+          <w:numId w:val="0"/>
+        </w:numPr>
+        <w:rPr>
+          <w:rFonts w:cstheme="majorHAnsi"/>
+          <w:szCs w:val="20"/>
+        </w:rPr>
+      </w:pPr>
+      <w:r>
+        <w:rPr>
+          <w:rFonts w:cstheme="majorHAnsi"/>
+          <w:b/>
+          <w:bCs/>
+          <w:szCs w:val="20"/>
+        </w:rPr>
+        <w:t xml:space="preserve">Feedback 1: </w:t>
+      </w:r>
+      <w:r>
+        <w:rPr>
+          <w:rFonts w:cstheme="majorHAnsi"/>
+          <w:szCs w:val="20"/>
+        </w:rPr>
+        <w:t>The customer should be able to remove an item from the current order before placing it.</w:t>
+      </w:r>
+      <w:r>
+        <w:rPr>
+          <w:rFonts w:cstheme="majorHAnsi"/>
+          <w:b/>
+          <w:bCs/>
+          <w:szCs w:val="20"/>
+        </w:rPr>
+        <w:br/>
+        <w:t xml:space="preserve">Decision: </w:t>
+      </w:r>
+      <w:r>
+        <w:rPr>
+          <w:rFonts w:cstheme="majorHAnsi"/>
+          <w:szCs w:val="20"/>
+        </w:rPr>
+        <w:t>Add/Modify Product Backlog Item.</w:t>
+      </w:r>
+      <w:r>
+        <w:rPr>
+          <w:rFonts w:cstheme="majorHAnsi"/>
+          <w:b/>
+          <w:bCs/>
+          <w:szCs w:val="20"/>
+        </w:rPr>
+        <w:br/>
+        <w:t xml:space="preserve">Action: </w:t>
+      </w:r>
+      <w:r>
+        <w:rPr>
+          <w:rFonts w:cstheme="majorHAnsi"/>
+          <w:szCs w:val="20"/>
+        </w:rPr>
+        <w:t>PBI-04 will be prioritized for a future Sprint so customers can remove unwanted items and modify their order before submission.</w:t>
+      </w:r>
+    </w:p>
+    <w:p>
+      <w:pPr>
+        <w:pStyle w:val="ListBullet"/>
+        <w:numPr>
+          <w:ilvl w:val="0"/>
+          <w:numId w:val="0"/>
+        </w:numPr>
+        <w:rPr>
+          <w:rFonts w:cstheme="majorHAnsi"/>
+          <w:szCs w:val="20"/>
+        </w:rPr>
+      </w:pPr>
+    </w:p>
+    <w:p>
+      <w:pPr>
+        <w:pStyle w:val="ListBullet"/>
+        <w:numPr>
+          <w:ilvl w:val="0"/>
+          <w:numId w:val="0"/>
+        </w:numPr>
+        <w:rPr>
+          <w:rFonts w:cstheme="majorHAnsi"/>
+          <w:szCs w:val="20"/>
+          <w:lang w:val="en-CA"/>
+        </w:rPr>
+      </w:pPr>
+      <w:r>
+        <w:rPr>
+          <w:rFonts w:cstheme="majorHAnsi"/>
+          <w:b/>
+          <w:bCs/>
+          <w:szCs w:val="20"/>
+        </w:rPr>
+        <w:t>Feedback 2:</w:t>
+      </w:r>
+      <w:r>
+        <w:rPr>
+          <w:rFonts w:cstheme="majorHAnsi"/>
+          <w:szCs w:val="20"/>
+        </w:rPr>
+        <w:t xml:space="preserve"> The order confirmation should clearly show the restaurant, selected items, quantities, total price, and pickup time.</w:t>
+      </w:r>
+      <w:r>
+        <w:rPr>
+          <w:rFonts w:cstheme="majorHAnsi"/>
+          <w:szCs w:val="20"/>
+        </w:rPr>
+        <w:br/>
+      </w:r>
+      <w:r>
+        <w:rPr>
+          <w:rFonts w:cstheme="majorHAnsi"/>
+          <w:b/>
+          <w:bCs/>
+          <w:szCs w:val="20"/>
+        </w:rPr>
+        <w:t>Decision:</w:t>
+      </w:r>
+      <w:r>
+        <w:rPr>
+          <w:rFonts w:cstheme="majorHAnsi"/>
+          <w:szCs w:val="20"/>
+        </w:rPr>
+        <w:t xml:space="preserve"> Accept.</w:t>
+      </w:r>
+      <w:r>
+        <w:rPr>
+          <w:rFonts w:cstheme="majorHAnsi"/>
+          <w:szCs w:val="20"/>
+        </w:rPr>
+        <w:br/>
+      </w:r>
+      <w:r>
+        <w:rPr>
+          <w:rFonts w:cstheme="majorHAnsi"/>
+          <w:b/>
+          <w:bCs/>
+          <w:szCs w:val="20"/>
+        </w:rPr>
+        <w:t>Action:</w:t>
+      </w:r>
+      <w:r>
+        <w:rPr>
+          <w:rFonts w:cstheme="majorHAnsi"/>
+          <w:szCs w:val="20"/>
+        </w:rPr>
+        <w:t xml:space="preserve"> PBI-06 will be updated to make the order confirmation more detailed and clear for the customer.</w:t>
+      </w:r>
+    </w:p>
+    <w:p>
+      <w:pPr>
+        <w:pStyle w:val="ListBullet"/>
+        <w:numPr>
+          <w:ilvl w:val="0"/>
+          <w:numId w:val="0"/>
+        </w:numPr>
+        <w:rPr>
+          <w:rFonts w:cstheme="majorHAnsi"/>
+          <w:szCs w:val="20"/>
+          <w:lang w:val="en-CA"/>
+        </w:rPr>
+      </w:pPr>
+    </w:p>
+    <w:p>
+      <w:pPr>
+        <w:pStyle w:val="ListBullet"/>
+        <w:numPr>
+          <w:ilvl w:val="0"/>
+          <w:numId w:val="0"/>
+        </w:numPr>
+        <w:rPr>
+          <w:rFonts w:cstheme="majorHAnsi"/>
+          <w:szCs w:val="20"/>
+        </w:rPr>
+      </w:pPr>
+      <w:r>
+        <w:rPr>
+          <w:rFonts w:cstheme="majorHAnsi"/>
+          <w:b/>
+          <w:bCs/>
+          <w:szCs w:val="20"/>
+        </w:rPr>
+        <w:t>Feedback 3:</w:t>
+      </w:r>
+      <w:r>
+        <w:rPr>
+          <w:rFonts w:cstheme="majorHAnsi"/>
+          <w:szCs w:val="20"/>
+        </w:rPr>
+        <w:t xml:space="preserve"> Customers should be able to easily check the status of their order after placing it.</w:t>
+      </w:r>
+      <w:r>
+        <w:rPr>
+          <w:rFonts w:cstheme="majorHAnsi"/>
+          <w:szCs w:val="20"/>
+        </w:rPr>
+        <w:br/>
+      </w:r>
+      <w:r>
+        <w:rPr>
+          <w:rFonts w:cstheme="majorHAnsi"/>
+          <w:b/>
+          <w:bCs/>
+          <w:szCs w:val="20"/>
+        </w:rPr>
+        <w:t>Decision:</w:t>
+      </w:r>
+      <w:r>
+        <w:rPr>
+          <w:rFonts w:cstheme="majorHAnsi"/>
+          <w:szCs w:val="20"/>
+        </w:rPr>
+        <w:t xml:space="preserve"> Accept.</w:t>
+      </w:r>
+      <w:r>
+        <w:rPr>
+          <w:rFonts w:cstheme="majorHAnsi"/>
+          <w:szCs w:val="20"/>
+        </w:rPr>
+        <w:br/>
+      </w:r>
+      <w:r>
+        <w:rPr>
+          <w:rFonts w:cstheme="majorHAnsi"/>
+          <w:b/>
+          <w:bCs/>
+          <w:szCs w:val="20"/>
+        </w:rPr>
+        <w:t>Action:</w:t>
+      </w:r>
+      <w:r>
+        <w:rPr>
+          <w:rFonts w:cstheme="majorHAnsi"/>
+          <w:szCs w:val="20"/>
+        </w:rPr>
+        <w:t xml:space="preserve"> PBI-07, View Order Status, will remain a priority for a future Sprint so customers can see whether their order is Received, Preparing, Ready for Pickup, or Completed.</w:t>
+      </w:r>
+    </w:p>
+    <w:p>
+      <w:pPr>
+        <w:pStyle w:val="ListBullet"/>
+        <w:numPr>
+          <w:ilvl w:val="0"/>
+          <w:numId w:val="0"/>
+        </w:numPr>
+        <w:rPr>
+          <w:rFonts w:cstheme="majorHAnsi"/>
+          <w:szCs w:val="20"/>
+        </w:rPr>
+      </w:pPr>
+    </w:p>
+    <w:p>
+      <w:pPr>
+        <w:pStyle w:val="ListBullet"/>
+        <w:numPr>
+          <w:ilvl w:val="0"/>
+          <w:numId w:val="0"/>
+        </w:numPr>
+        <w:rPr>
+          <w:rFonts w:cstheme="majorHAnsi"/>
+          <w:szCs w:val="20"/>
+        </w:rPr>
+      </w:pPr>
+      <w:r>
+        <w:rPr>
+          <w:rFonts w:cstheme="majorHAnsi"/>
+          <w:b/>
+          <w:bCs/>
+          <w:szCs w:val="20"/>
+        </w:rPr>
+        <w:t>Increment → Feedback → Learning → Backlog Adaptation:</w:t>
+      </w:r>
+      <w:r>
+        <w:rPr>
+          <w:rFonts w:cstheme="majorHAnsi"/>
+          <w:szCs w:val="20"/>
+        </w:rPr>
+        <w:br/>
+        <w:t>The team demonstrated the working Increment, collected stakeholder feedback, identified improvements, and used this information to update and reprioritize the Product Backlog.</w:t>
+      </w:r>
+    </w:p>
+    <w:p>
+      <w:pPr>
+        <w:pStyle w:val="ListBullet"/>
+        <w:numPr>
+          <w:ilvl w:val="0"/>
+          <w:numId w:val="0"/>
+        </w:numPr>
+        <w:rPr>
+          <w:rFonts w:cstheme="majorHAnsi"/>
+          <w:szCs w:val="20"/>
+        </w:rPr>
+      </w:pPr>
+    </w:p>
+    <w:p>
+      <w:pPr>
+        <w:pStyle w:val="ListBullet"/>
+        <w:numPr>
+          <w:ilvl w:val="0"/>
+          <w:numId w:val="0"/>
+        </w:numPr>
+        <w:rPr>
+          <w:rFonts w:cstheme="majorHAnsi"/>
+          <w:szCs w:val="20"/>
+          <w:lang w:val="en-CA"/>
+        </w:rPr>
+      </w:pPr>
+      <w:r>
+        <w:rPr>
+          <w:rFonts w:cstheme="majorHAnsi"/>
+          <w:szCs w:val="20"/>
+        </w:rPr>
+        <w:t>The Sprint Review helped the team identify improvements that were not fully included in the current Increment. The feedback showed that the basic ordering flow works, but pickup-time availability, order confirmation, and order-status visibility can be improved. The Product Backlog will be adapted based on this feedback for future development.</w:t>
+      </w:r>
+    </w:p>
+    <w:p>
+      <w:pPr>
+        <w:pStyle w:val="ListBullet"/>
+        <w:numPr>
+          <w:ilvl w:val="0"/>
+          <w:numId w:val="0"/>
+        </w:numPr>
+        <w:ind w:left="360" w:hanging="360"/>
+        <w:rPr>
+          <w:lang w:val="en-CA"/>
+        </w:rPr>
+      </w:pPr>
+    </w:p>
+    <w:p>
+      <w:pPr>
+        <w:pStyle w:val="ListBullet"/>
+        <w:numPr>
+          <w:ilvl w:val="0"/>
+          <w:numId w:val="0"/>
+        </w:numPr>
+        <w:ind w:left="360" w:hanging="360"/>
+        <w:rPr>
+          <w:rFonts w:asciiTheme="majorHAnsi" w:hAnsiTheme="majorHAnsi" w:cstheme="majorHAnsi"/>
+          <w:b/>
+          <w:bCs/>
+          <w:color w:val="365F91" w:themeColor="accent1" w:themeShade="BF"/>
+          <w:sz w:val="30"/>
+          <w:szCs w:val="30"/>
+          <w:lang w:val="en-CA"/>
+        </w:rPr>
+      </w:pPr>
+      <w:r>
+        <w:rPr>
+          <w:rFonts w:asciiTheme="majorHAnsi" w:hAnsiTheme="majorHAnsi" w:cstheme="majorHAnsi"/>
+          <w:b/>
+          <w:bCs/>
+          <w:color w:val="365F91" w:themeColor="accent1" w:themeShade="BF"/>
+          <w:sz w:val="30"/>
+          <w:szCs w:val="30"/>
+          <w:lang w:val="en-CA"/>
+        </w:rPr>
+        <w:t>9.</w:t>
+      </w:r>
+      <w:r>
+        <w:rPr>
+          <w:rFonts w:asciiTheme="majorHAnsi" w:hAnsiTheme="majorHAnsi" w:cstheme="majorHAnsi"/>
+          <w:b/>
+          <w:bCs/>
+          <w:color w:val="365F91" w:themeColor="accent1" w:themeShade="BF"/>
+          <w:sz w:val="30"/>
+          <w:szCs w:val="30"/>
+          <w:lang w:val="en-CA"/>
+        </w:rPr>
+        <w:t>Part H — Sprint Retrospective</w:t>
+      </w:r>
+      <w:r>
+        <w:rPr>
+          <w:rFonts w:asciiTheme="majorHAnsi" w:hAnsiTheme="majorHAnsi" w:cstheme="majorHAnsi"/>
+          <w:b/>
+          <w:bCs/>
+          <w:color w:val="365F91" w:themeColor="accent1" w:themeShade="BF"/>
+          <w:sz w:val="30"/>
+          <w:szCs w:val="30"/>
+          <w:lang w:val="en-CA"/>
+        </w:rPr>
+        <w:t>:</w:t>
+      </w:r>
+    </w:p>
+    <w:p>
+      <w:pPr>
+        <w:pStyle w:val="ListBullet"/>
+        <w:numPr>
+          <w:ilvl w:val="0"/>
+          <w:numId w:val="0"/>
+        </w:numPr>
+        <w:rPr>
+          <w:rFonts w:cstheme="majorHAnsi"/>
+          <w:szCs w:val="20"/>
+        </w:rPr>
+      </w:pPr>
+      <w:r>
+        <w:rPr>
+          <w:rFonts w:cstheme="majorHAnsi"/>
+          <w:b/>
+          <w:bCs/>
+          <w:color w:val="365F91" w:themeColor="accent1" w:themeShade="BF"/>
+          <w:szCs w:val="20"/>
+          <w:lang w:val="en-CA"/>
+        </w:rPr>
+        <w:t xml:space="preserve"> </w:t>
+      </w:r>
+      <w:r>
+        <w:rPr>
+          <w:rFonts w:cstheme="majorHAnsi"/>
+          <w:szCs w:val="20"/>
+        </w:rPr>
+        <w:t>At the end of the Sprint, the four team members discussed how the Sprint went and what could be improved for the next Sprint.</w:t>
+      </w:r>
+    </w:p>
+    <w:p>
+      <w:pPr>
+        <w:pStyle w:val="ListBullet"/>
+        <w:numPr>
+          <w:ilvl w:val="0"/>
+          <w:numId w:val="0"/>
+        </w:numPr>
+        <w:rPr>
+          <w:rFonts w:cstheme="majorHAnsi"/>
+          <w:szCs w:val="20"/>
+        </w:rPr>
+      </w:pPr>
+    </w:p>
+    <w:p>
+      <w:pPr>
+        <w:pStyle w:val="ListBullet"/>
+        <w:numPr>
+          <w:ilvl w:val="0"/>
+          <w:numId w:val="0"/>
+        </w:numPr>
+        <w:rPr>
+          <w:rFonts w:cstheme="majorHAnsi"/>
+          <w:szCs w:val="20"/>
+          <w:lang w:val="en-CA"/>
+        </w:rPr>
+      </w:pPr>
+      <w:r>
+        <w:rPr>
+          <w:rFonts w:cstheme="majorHAnsi"/>
+          <w:b/>
+          <w:bCs/>
+          <w:szCs w:val="20"/>
+        </w:rPr>
+        <w:t>What went well:</w:t>
+      </w:r>
+      <w:r>
+        <w:rPr>
+          <w:rFonts w:cstheme="majorHAnsi"/>
+          <w:b/>
+          <w:bCs/>
+          <w:szCs w:val="20"/>
+        </w:rPr>
+        <w:br/>
+      </w:r>
+      <w:r>
+        <w:rPr>
+          <w:rFonts w:cstheme="majorHAnsi"/>
+          <w:szCs w:val="20"/>
+        </w:rPr>
+        <w:t xml:space="preserve">The team divided the technical work between all four members, which allowed everyone to contribute to the </w:t>
+      </w:r>
+      <w:proofErr w:type="spellStart"/>
+      <w:r>
+        <w:rPr>
+          <w:rFonts w:cstheme="majorHAnsi"/>
+          <w:szCs w:val="20"/>
+        </w:rPr>
+        <w:t>QuickBite</w:t>
+      </w:r>
+      <w:proofErr w:type="spellEnd"/>
+      <w:r>
+        <w:rPr>
+          <w:rFonts w:cstheme="majorHAnsi"/>
+          <w:szCs w:val="20"/>
+        </w:rPr>
+        <w:t xml:space="preserve"> Increment. GitHub Projects helped the team organize the tasks and track the progress of the Sprint. Using separate branches and pull requests also helped the team combine everyone's work into one project.</w:t>
+      </w:r>
+    </w:p>
+    <w:p>
+      <w:pPr>
+        <w:pStyle w:val="ListBullet"/>
+        <w:numPr>
+          <w:ilvl w:val="0"/>
+          <w:numId w:val="0"/>
+        </w:numPr>
+        <w:rPr>
+          <w:lang w:val="en-CA"/>
+        </w:rPr>
+      </w:pPr>
+    </w:p>
+    <w:p>
+      <w:pPr>
+        <w:pStyle w:val="ListBullet"/>
+        <w:numPr>
+          <w:ilvl w:val="0"/>
+          <w:numId w:val="0"/>
+        </w:numPr>
+      </w:pPr>
+      <w:r>
+        <w:rPr>
+          <w:b/>
+          <w:bCs/>
+        </w:rPr>
+        <w:t>What did not go well:</w:t>
+      </w:r>
+      <w:r>
+        <w:br/>
+        <w:t>Some tasks took longer than expected because different parts of the project depended on other team members' work. There were also some problems when merging code, which required additional fixes and testing.</w:t>
+      </w:r>
+    </w:p>
+    <w:p>
+      <w:pPr>
+        <w:pStyle w:val="ListBullet"/>
+        <w:numPr>
+          <w:ilvl w:val="0"/>
+          <w:numId w:val="0"/>
+        </w:numPr>
+      </w:pPr>
+    </w:p>
+    <w:p>
+      <w:pPr>
+        <w:pStyle w:val="ListBullet"/>
+        <w:numPr>
+          <w:ilvl w:val="0"/>
+          <w:numId w:val="0"/>
+        </w:numPr>
+      </w:pPr>
+      <w:r>
+        <w:rPr>
+          <w:b/>
+          <w:bCs/>
+        </w:rPr>
+        <w:t>What slowed the team down:</w:t>
+      </w:r>
+      <w:r>
+        <w:br/>
+        <w:t>Dependencies between tasks slowed the team down. For example, the cart depended on the menu data, and connecting the cart to the final order depended on the pickup-time functionality. This meant some work had to wait until another part was ready. This matches the dependencies identified in the team's plan.</w:t>
+      </w:r>
+    </w:p>
+    <w:p>
+      <w:pPr>
+        <w:pStyle w:val="ListBullet"/>
+        <w:numPr>
+          <w:ilvl w:val="0"/>
+          <w:numId w:val="0"/>
+        </w:numPr>
+      </w:pPr>
+    </w:p>
+    <w:p>
+      <w:pPr>
+        <w:pStyle w:val="ListBullet"/>
+        <w:numPr>
+          <w:ilvl w:val="0"/>
+          <w:numId w:val="0"/>
+        </w:numPr>
+      </w:pPr>
+      <w:r>
+        <w:rPr>
+          <w:b/>
+          <w:bCs/>
+        </w:rPr>
+        <w:t>What helped collaboration:</w:t>
+      </w:r>
+      <w:r>
+        <w:br/>
+        <w:t>GitHub, GitHub Projects, branches, pull requests, and communication between team members helped the team coordinate the work. Team members shared information such as restaurant IDs, menu-item data, cart information, and pickup-time information so the different features could work together.</w:t>
+      </w:r>
+    </w:p>
+    <w:p>
+      <w:pPr>
+        <w:pStyle w:val="ListBullet"/>
+        <w:numPr>
+          <w:ilvl w:val="0"/>
+          <w:numId w:val="0"/>
+        </w:numPr>
+      </w:pPr>
+    </w:p>
+    <w:p>
+      <w:pPr>
+        <w:pStyle w:val="ListBullet"/>
+        <w:numPr>
+          <w:ilvl w:val="0"/>
+          <w:numId w:val="0"/>
+        </w:numPr>
+      </w:pPr>
+      <w:r>
+        <w:rPr>
+          <w:b/>
+          <w:bCs/>
+        </w:rPr>
+        <w:t>Definition of Done:</w:t>
+      </w:r>
+      <w:r>
+        <w:br/>
+        <w:t>The Definition of Done helped the team avoid considering a task complete only because the code was written. The team also needed to test the functionality, review the work, integrate it with the project, and make sure the acceptance criteria were met. This follows the team's coding and integration process.</w:t>
+      </w:r>
+    </w:p>
+    <w:p>
+      <w:pPr>
+        <w:pStyle w:val="ListBullet"/>
+        <w:numPr>
+          <w:ilvl w:val="0"/>
+          <w:numId w:val="0"/>
+        </w:numPr>
+      </w:pPr>
+    </w:p>
+    <w:p>
+      <w:pPr>
+        <w:pStyle w:val="ListBullet"/>
+        <w:numPr>
+          <w:ilvl w:val="0"/>
+          <w:numId w:val="0"/>
+        </w:numPr>
+      </w:pPr>
+      <w:r>
+        <w:rPr>
+          <w:b/>
+          <w:bCs/>
+        </w:rPr>
+        <w:t>Improvement Action 1:</w:t>
+      </w:r>
+      <w:r>
+        <w:br/>
+        <w:t>For the next Sprint, the team will identify dependencies between tasks earlier and agree on shared data structures before starting development. This will reduce waiting time and integration problems.</w:t>
+      </w:r>
+    </w:p>
+    <w:p>
+      <w:pPr>
+        <w:pStyle w:val="ListBullet"/>
+        <w:numPr>
+          <w:ilvl w:val="0"/>
+          <w:numId w:val="0"/>
+        </w:numPr>
+      </w:pPr>
+    </w:p>
+    <w:p>
+      <w:pPr>
+        <w:pStyle w:val="ListBullet"/>
+        <w:numPr>
+          <w:ilvl w:val="0"/>
+          <w:numId w:val="0"/>
+        </w:numPr>
+      </w:pPr>
+      <w:r>
+        <w:rPr>
+          <w:b/>
+          <w:bCs/>
+        </w:rPr>
+        <w:t>Improvement Action 2:</w:t>
+      </w:r>
+      <w:r>
+        <w:br/>
+        <w:t>For the next Sprint, the team will start code reviews and integration testing earlier instead of waiting until several features are completed. This will help identify merge conflicts and integration problems sooner.</w:t>
+      </w:r>
+    </w:p>
+    <w:p>
+      <w:pPr>
+        <w:pStyle w:val="ListBullet"/>
+        <w:numPr>
+          <w:ilvl w:val="0"/>
+          <w:numId w:val="0"/>
+        </w:numPr>
+      </w:pPr>
+    </w:p>
+    <w:p>
+      <w:pPr>
+        <w:pStyle w:val="ListBullet"/>
+        <w:numPr>
+          <w:ilvl w:val="0"/>
+          <w:numId w:val="0"/>
+        </w:numPr>
+        <w:rPr>
+          <w:rFonts w:asciiTheme="majorHAnsi" w:hAnsiTheme="majorHAnsi" w:cstheme="majorHAnsi"/>
+          <w:b/>
+          <w:bCs/>
+          <w:color w:val="365F91" w:themeColor="accent1" w:themeShade="BF"/>
+          <w:sz w:val="30"/>
+          <w:szCs w:val="30"/>
+        </w:rPr>
+      </w:pPr>
+      <w:r>
+        <w:rPr>
+          <w:rFonts w:asciiTheme="majorHAnsi" w:hAnsiTheme="majorHAnsi" w:cstheme="majorHAnsi"/>
+          <w:b/>
+          <w:bCs/>
+          <w:color w:val="365F91" w:themeColor="accent1" w:themeShade="BF"/>
+          <w:sz w:val="30"/>
+          <w:szCs w:val="30"/>
+        </w:rPr>
+        <w:t>10. Agile Reflection</w:t>
+      </w:r>
+    </w:p>
+    <w:p>
+      <w:pPr>
+        <w:pStyle w:val="ListBullet"/>
+        <w:numPr>
+          <w:ilvl w:val="0"/>
+          <w:numId w:val="0"/>
+        </w:numPr>
+      </w:pPr>
+    </w:p>
+    <w:p>
+      <w:pPr>
+        <w:pStyle w:val="ListBullet"/>
+        <w:numPr>
+          <w:ilvl w:val="0"/>
+          <w:numId w:val="0"/>
+        </w:numPr>
+      </w:pPr>
+      <w:r>
+        <w:t xml:space="preserve">The </w:t>
+      </w:r>
+      <w:proofErr w:type="spellStart"/>
+      <w:r>
+        <w:t>QuickBite</w:t>
+      </w:r>
+      <w:proofErr w:type="spellEnd"/>
+      <w:r>
+        <w:t xml:space="preserve"> project demonstrated Agile practices through the way the team planned, developed, tested, and improved the system during the Sprint.</w:t>
+      </w:r>
+    </w:p>
+    <w:p>
+      <w:pPr>
+        <w:pStyle w:val="ListBullet"/>
+        <w:numPr>
+          <w:ilvl w:val="0"/>
+          <w:numId w:val="0"/>
+        </w:numPr>
+      </w:pPr>
+    </w:p>
+    <w:p>
+      <w:pPr>
+        <w:pStyle w:val="ListBullet"/>
+        <w:numPr>
+          <w:ilvl w:val="0"/>
+          <w:numId w:val="0"/>
+        </w:numPr>
+      </w:pPr>
+      <w:r>
+        <w:rPr>
+          <w:b/>
+          <w:bCs/>
+        </w:rPr>
+        <w:t>Incremental Delivery:</w:t>
+      </w:r>
+      <w:r>
+        <w:br/>
+        <w:t xml:space="preserve">The team focused on a small working part of </w:t>
+      </w:r>
+      <w:proofErr w:type="spellStart"/>
+      <w:r>
+        <w:t>QuickBite</w:t>
+      </w:r>
+      <w:proofErr w:type="spellEnd"/>
+      <w:r>
+        <w:t xml:space="preserve"> instead of trying to build the entire system. The Sprint Increment focused on the customer ordering flow, including browsing restaurants, viewing menus, adding items, selecting a pickup time, and placing an order. This followed the Sprint Goal.</w:t>
+      </w:r>
+    </w:p>
+    <w:p>
+      <w:pPr>
+        <w:pStyle w:val="ListBullet"/>
+        <w:numPr>
+          <w:ilvl w:val="0"/>
+          <w:numId w:val="0"/>
+        </w:numPr>
+      </w:pPr>
+    </w:p>
+    <w:p>
+      <w:pPr>
+        <w:pStyle w:val="ListBullet"/>
+        <w:numPr>
+          <w:ilvl w:val="0"/>
+          <w:numId w:val="0"/>
+        </w:numPr>
+      </w:pPr>
+      <w:r>
+        <w:rPr>
+          <w:b/>
+          <w:bCs/>
+        </w:rPr>
+        <w:t>Responding to Change:</w:t>
+      </w:r>
+      <w:r>
+        <w:br/>
+        <w:t>The team responded to the new requirement about restaurant workload and pickup-time availability. Instead of automatically changing the whole Sprint, the team considered how the requirement affected the existing backlog and what should be handled in future work.</w:t>
+      </w:r>
+    </w:p>
+    <w:p>
+      <w:pPr>
+        <w:pStyle w:val="ListBullet"/>
+        <w:numPr>
+          <w:ilvl w:val="0"/>
+          <w:numId w:val="0"/>
+        </w:numPr>
+      </w:pPr>
+    </w:p>
+    <w:p>
+      <w:pPr>
+        <w:pStyle w:val="ListBullet"/>
+        <w:numPr>
+          <w:ilvl w:val="0"/>
+          <w:numId w:val="0"/>
+        </w:numPr>
+      </w:pPr>
+      <w:r>
+        <w:rPr>
+          <w:b/>
+          <w:bCs/>
+        </w:rPr>
+        <w:lastRenderedPageBreak/>
+        <w:t>Working Software and Technical Quality:</w:t>
+      </w:r>
+      <w:r>
+        <w:br/>
+        <w:t>The team produced actual working software instead of only planning the features. Team members used GitHub branches and pull requests, tested their assigned tasks, integrated the different features, and fixed problems that appeared during integration. The team also used the Definition of Done to make sure work was tested and reviewed before being considered complete</w:t>
+      </w:r>
+    </w:p>
+    <w:p>
+      <w:pPr>
+        <w:pStyle w:val="ListBullet"/>
+        <w:numPr>
+          <w:ilvl w:val="0"/>
+          <w:numId w:val="0"/>
+        </w:numPr>
+      </w:pPr>
+    </w:p>
+    <w:p>
+      <w:pPr>
+        <w:pStyle w:val="ListBullet"/>
+        <w:numPr>
+          <w:ilvl w:val="0"/>
+          <w:numId w:val="0"/>
+        </w:numPr>
+      </w:pPr>
+      <w:r>
+        <w:rPr>
+          <w:b/>
+          <w:bCs/>
+        </w:rPr>
+        <w:t>Stakeholder Feedback:</w:t>
+      </w:r>
+      <w:r>
+        <w:br/>
+        <w:t>During the Sprint Review, the team used stakeholder feedback to identify improvements to the product. The feedback helped the team identify improvements related to modifying an order, improving the order confirmation, and viewing the order status. These ideas were used to adapt the Product Backlog for future development.</w:t>
+      </w:r>
+    </w:p>
+    <w:p>
+      <w:pPr>
+        <w:pStyle w:val="ListBullet"/>
+        <w:numPr>
+          <w:ilvl w:val="0"/>
+          <w:numId w:val="0"/>
+        </w:numPr>
+      </w:pPr>
+    </w:p>
+    <w:p>
+      <w:pPr>
+        <w:pStyle w:val="ListBullet"/>
+        <w:numPr>
+          <w:ilvl w:val="0"/>
+          <w:numId w:val="0"/>
+        </w:numPr>
+        <w:rPr>
+          <w:lang w:val="en-CA"/>
+        </w:rPr>
+      </w:pPr>
+      <w:r>
+        <w:rPr>
+          <w:b/>
+          <w:bCs/>
+        </w:rPr>
+        <w:t>Continuous Improvement:</w:t>
+      </w:r>
+      <w:r>
+        <w:br/>
+        <w:t>During the Sprint Retrospective, the team identified problems such as task dependencies and integration difficulties. For the next Sprint, the team decided to identify dependencies earlier and begin code reviews and integration testing sooner. This allows the team to learn from the current Sprint and improve how it works in the future.</w:t>
       </w:r>
     </w:p>
     <w:sectPr>
@@ -2648,7 +3824,7 @@
 </file>
 
 <file path=word/endnotes.xml><?xml version="1.0" encoding="utf-8"?>
-<w:endnotes xmlns:wpc="http://schemas.microsoft.com/office/word/2010/wordprocessingCanvas" xmlns:cx="http://schemas.microsoft.com/office/drawing/2014/chartex" xmlns:cx1="http://schemas.microsoft.com/office/drawing/2015/9/8/chartex" xmlns:cx2="http://schemas.microsoft.com/office/drawing/2015/10/21/chartex" xmlns:cx3="http://schemas.microsoft.com/office/drawing/2016/5/9/chartex" xmlns:cx4="http://schemas.microsoft.com/office/drawing/2016/5/10/chartex" xmlns:cx5="http://schemas.microsoft.com/office/drawing/2016/5/11/chartex" xmlns:cx6="http://schemas.microsoft.com/office/drawing/2016/5/12/chartex" xmlns:cx7="http://schemas.microsoft.com/office/drawing/2016/5/13/chartex" xmlns:cx8="http://schemas.microsoft.com/office/drawing/2016/5/14/chartex" xmlns:mc="http://schemas.openxmlformats.org/markup-compatibility/2006" xmlns:aink="http://schemas.microsoft.com/office/drawing/2016/ink" xmlns:am3d="http://schemas.microsoft.com/office/drawing/2017/model3d" xmlns:o="urn:schemas-microsoft-com:office:office" xmlns:oel="http://schemas.microsoft.com/office/2019/extlst" xmlns:r="http://schemas.openxmlformats.org/officeDocument/2006/relationships" xmlns:m="http://schemas.openxmlformats.org/officeDocument/2006/math" xmlns:v="urn:schemas-microsoft-com:vml" xmlns:wp14="http://schemas.microsoft.com/office/word/2010/wordprocessingDrawing" xmlns:wp="http://schemas.openxmlformats.org/drawingml/2006/wordprocessingDrawing" xmlns:w10="urn:schemas-microsoft-com:office:word" xmlns:w="http://schemas.openxmlformats.org/wordprocessingml/2006/main" xmlns:w14="http://schemas.microsoft.com/office/word/2010/wordml" xmlns:w15="http://schemas.microsoft.com/office/word/2012/wordml" xmlns:w16cex="http://schemas.microsoft.com/office/word/2018/wordml/cex" xmlns:w16cid="http://schemas.microsoft.com/office/word/2016/wordml/cid" xmlns:w16="http://schemas.microsoft.com/office/word/2018/wordml" xmlns:w16du="http://schemas.microsoft.com/office/word/2023/wordml/word16du" xmlns:w16sdtdh="http://schemas.microsoft.com/office/word/2020/wordml/sdtdatahash" xmlns:w16sdtfl="http://schemas.microsoft.com/office/word/2024/wordml/sdtformatlock" xmlns:w16se="http://schemas.microsoft.com/office/word/2015/wordml/symex" xmlns:wpg="http://schemas.microsoft.com/office/word/2010/wordprocessingGroup" xmlns:wpi="http://schemas.microsoft.com/office/word/2010/wordprocessingInk" xmlns:wne="http://schemas.microsoft.com/office/word/2006/wordml" xmlns:wps="http://schemas.microsoft.com/office/word/2010/wordprocessingShape" mc:Ignorable="w14 w15 w16se w16cid w16 w16cex w16sdtdh w16sdtfl w16du wp14">
+<w:endnotes xmlns:wpc="http://schemas.microsoft.com/office/word/2010/wordprocessingCanvas" xmlns:cx="http://schemas.microsoft.com/office/drawing/2014/chartex" xmlns:cx1="http://schemas.microsoft.com/office/drawing/2015/9/8/chartex" xmlns:cx2="http://schemas.microsoft.com/office/drawing/2015/10/21/chartex" xmlns:cx3="http://schemas.microsoft.com/office/drawing/2016/5/9/chartex" xmlns:cx4="http://schemas.microsoft.com/office/drawing/2016/5/10/chartex" xmlns:cx5="http://schemas.microsoft.com/office/drawing/2016/5/11/chartex" xmlns:cx6="http://schemas.microsoft.com/office/drawing/2016/5/12/chartex" xmlns:cx7="http://schemas.microsoft.com/office/drawing/2016/5/13/chartex" xmlns:cx8="http://schemas.microsoft.com/office/drawing/2016/5/14/chartex" xmlns:mc="http://schemas.openxmlformats.org/markup-compatibility/2006" xmlns:m="http://schemas.openxmlformats.org/officeDocument/2006/math" xmlns:aink="http://schemas.microsoft.com/office/drawing/2016/ink" xmlns:am3d="http://schemas.microsoft.com/office/drawing/2017/model3d" xmlns:oel="http://schemas.microsoft.com/office/2019/extlst" xmlns:r="http://schemas.openxmlformats.org/officeDocument/2006/relationships" xmlns:wp14="http://schemas.microsoft.com/office/word/2010/wordprocessingDrawing" xmlns:wp="http://schemas.openxmlformats.org/drawingml/2006/wordprocessingDrawing" xmlns:wpg="http://schemas.microsoft.com/office/word/2010/wordprocessingGroup" xmlns:wpi="http://schemas.microsoft.com/office/word/2010/wordprocessingInk" xmlns:wps="http://schemas.microsoft.com/office/word/2010/wordprocessingShape" xmlns:o="urn:schemas-microsoft-com:office:office" xmlns:v="urn:schemas-microsoft-com:vml" xmlns:w10="urn:schemas-microsoft-com:office:word" xmlns:w="http://schemas.openxmlformats.org/wordprocessingml/2006/main" xmlns:w14="http://schemas.microsoft.com/office/word/2010/wordml" xmlns:w15="http://schemas.microsoft.com/office/word/2012/wordml" xmlns:w16cex="http://schemas.microsoft.com/office/word/2018/wordml/cex" xmlns:w16cid="http://schemas.microsoft.com/office/word/2016/wordml/cid" xmlns:w16="http://schemas.microsoft.com/office/word/2018/wordml" xmlns:w16sdtdh="http://schemas.microsoft.com/office/word/2020/wordml/sdtdatahash" xmlns:w16sdtfl="http://schemas.microsoft.com/office/word/2024/wordml/sdtformatlock" xmlns:w16se="http://schemas.microsoft.com/office/word/2015/wordml/symex" xmlns:w16du="http://schemas.microsoft.com/office/word/2023/wordml/word16du" xmlns:wne="http://schemas.microsoft.com/office/word/2006/wordml" mc:Ignorable="w14 w15 w16se w16cid w16 w16cex w16sdtdh w16sdtfl w16du wp14">
   <w:endnote w:type="separator" w:id="-1">
     <w:p>
       <w:pPr>
@@ -2673,7 +3849,7 @@
 </file>
 
 <file path=word/footnotes.xml><?xml version="1.0" encoding="utf-8"?>
-<w:footnotes xmlns:wpc="http://schemas.microsoft.com/office/word/2010/wordprocessingCanvas" xmlns:cx="http://schemas.microsoft.com/office/drawing/2014/chartex" xmlns:cx1="http://schemas.microsoft.com/office/drawing/2015/9/8/chartex" xmlns:cx2="http://schemas.microsoft.com/office/drawing/2015/10/21/chartex" xmlns:cx3="http://schemas.microsoft.com/office/drawing/2016/5/9/chartex" xmlns:cx4="http://schemas.microsoft.com/office/drawing/2016/5/10/chartex" xmlns:cx5="http://schemas.microsoft.com/office/drawing/2016/5/11/chartex" xmlns:cx6="http://schemas.microsoft.com/office/drawing/2016/5/12/chartex" xmlns:cx7="http://schemas.microsoft.com/office/drawing/2016/5/13/chartex" xmlns:cx8="http://schemas.microsoft.com/office/drawing/2016/5/14/chartex" xmlns:mc="http://schemas.openxmlformats.org/markup-compatibility/2006" xmlns:aink="http://schemas.microsoft.com/office/drawing/2016/ink" xmlns:am3d="http://schemas.microsoft.com/office/drawing/2017/model3d" xmlns:o="urn:schemas-microsoft-com:office:office" xmlns:oel="http://schemas.microsoft.com/office/2019/extlst" xmlns:r="http://schemas.openxmlformats.org/officeDocument/2006/relationships" xmlns:m="http://schemas.openxmlformats.org/officeDocument/2006/math" xmlns:v="urn:schemas-microsoft-com:vml" xmlns:wp14="http://schemas.microsoft.com/office/word/2010/wordprocessingDrawing" xmlns:wp="http://schemas.openxmlformats.org/drawingml/2006/wordprocessingDrawing" xmlns:w10="urn:schemas-microsoft-com:office:word" xmlns:w="http://schemas.openxmlformats.org/wordprocessingml/2006/main" xmlns:w14="http://schemas.microsoft.com/office/word/2010/wordml" xmlns:w15="http://schemas.microsoft.com/office/word/2012/wordml" xmlns:w16cex="http://schemas.microsoft.com/office/word/2018/wordml/cex" xmlns:w16cid="http://schemas.microsoft.com/office/word/2016/wordml/cid" xmlns:w16="http://schemas.microsoft.com/office/word/2018/wordml" xmlns:w16du="http://schemas.microsoft.com/office/word/2023/wordml/word16du" xmlns:w16sdtdh="http://schemas.microsoft.com/office/word/2020/wordml/sdtdatahash" xmlns:w16sdtfl="http://schemas.microsoft.com/office/word/2024/wordml/sdtformatlock" xmlns:w16se="http://schemas.microsoft.com/office/word/2015/wordml/symex" xmlns:wpg="http://schemas.microsoft.com/office/word/2010/wordprocessingGroup" xmlns:wpi="http://schemas.microsoft.com/office/word/2010/wordprocessingInk" xmlns:wne="http://schemas.microsoft.com/office/word/2006/wordml" xmlns:wps="http://schemas.microsoft.com/office/word/2010/wordprocessingShape" mc:Ignorable="w14 w15 w16se w16cid w16 w16cex w16sdtdh w16sdtfl w16du wp14">
+<w:footnotes xmlns:wpc="http://schemas.microsoft.com/office/word/2010/wordprocessingCanvas" xmlns:cx="http://schemas.microsoft.com/office/drawing/2014/chartex" xmlns:cx1="http://schemas.microsoft.com/office/drawing/2015/9/8/chartex" xmlns:cx2="http://schemas.microsoft.com/office/drawing/2015/10/21/chartex" xmlns:cx3="http://schemas.microsoft.com/office/drawing/2016/5/9/chartex" xmlns:cx4="http://schemas.microsoft.com/office/drawing/2016/5/10/chartex" xmlns:cx5="http://schemas.microsoft.com/office/drawing/2016/5/11/chartex" xmlns:cx6="http://schemas.microsoft.com/office/drawing/2016/5/12/chartex" xmlns:cx7="http://schemas.microsoft.com/office/drawing/2016/5/13/chartex" xmlns:cx8="http://schemas.microsoft.com/office/drawing/2016/5/14/chartex" xmlns:mc="http://schemas.openxmlformats.org/markup-compatibility/2006" xmlns:m="http://schemas.openxmlformats.org/officeDocument/2006/math" xmlns:aink="http://schemas.microsoft.com/office/drawing/2016/ink" xmlns:am3d="http://schemas.microsoft.com/office/drawing/2017/model3d" xmlns:oel="http://schemas.microsoft.com/office/2019/extlst" xmlns:r="http://schemas.openxmlformats.org/officeDocument/2006/relationships" xmlns:wp14="http://schemas.microsoft.com/office/word/2010/wordprocessingDrawing" xmlns:wp="http://schemas.openxmlformats.org/drawingml/2006/wordprocessingDrawing" xmlns:wpg="http://schemas.microsoft.com/office/word/2010/wordprocessingGroup" xmlns:wpi="http://schemas.microsoft.com/office/word/2010/wordprocessingInk" xmlns:wps="http://schemas.microsoft.com/office/word/2010/wordprocessingShape" xmlns:o="urn:schemas-microsoft-com:office:office" xmlns:v="urn:schemas-microsoft-com:vml" xmlns:w10="urn:schemas-microsoft-com:office:word" xmlns:w="http://schemas.openxmlformats.org/wordprocessingml/2006/main" xmlns:w14="http://schemas.microsoft.com/office/word/2010/wordml" xmlns:w15="http://schemas.microsoft.com/office/word/2012/wordml" xmlns:w16cex="http://schemas.microsoft.com/office/word/2018/wordml/cex" xmlns:w16cid="http://schemas.microsoft.com/office/word/2016/wordml/cid" xmlns:w16="http://schemas.microsoft.com/office/word/2018/wordml" xmlns:w16sdtdh="http://schemas.microsoft.com/office/word/2020/wordml/sdtdatahash" xmlns:w16sdtfl="http://schemas.microsoft.com/office/word/2024/wordml/sdtformatlock" xmlns:w16se="http://schemas.microsoft.com/office/word/2015/wordml/symex" xmlns:w16du="http://schemas.microsoft.com/office/word/2023/wordml/word16du" xmlns:wne="http://schemas.microsoft.com/office/word/2006/wordml" mc:Ignorable="w14 w15 w16se w16cid w16 w16cex w16sdtdh w16sdtfl w16du wp14">
   <w:footnote w:type="separator" w:id="-1">
     <w:p>
       <w:pPr>
@@ -2698,7 +3874,7 @@
 </file>
 
 <file path=word/header1.xml><?xml version="1.0" encoding="utf-8"?>
-<w:hdr xmlns:wpc="http://schemas.microsoft.com/office/word/2010/wordprocessingCanvas" xmlns:cx="http://schemas.microsoft.com/office/drawing/2014/chartex" xmlns:cx1="http://schemas.microsoft.com/office/drawing/2015/9/8/chartex" xmlns:cx2="http://schemas.microsoft.com/office/drawing/2015/10/21/chartex" xmlns:cx3="http://schemas.microsoft.com/office/drawing/2016/5/9/chartex" xmlns:cx4="http://schemas.microsoft.com/office/drawing/2016/5/10/chartex" xmlns:cx5="http://schemas.microsoft.com/office/drawing/2016/5/11/chartex" xmlns:cx6="http://schemas.microsoft.com/office/drawing/2016/5/12/chartex" xmlns:cx7="http://schemas.microsoft.com/office/drawing/2016/5/13/chartex" xmlns:cx8="http://schemas.microsoft.com/office/drawing/2016/5/14/chartex" xmlns:mc="http://schemas.openxmlformats.org/markup-compatibility/2006" xmlns:aink="http://schemas.microsoft.com/office/drawing/2016/ink" xmlns:am3d="http://schemas.microsoft.com/office/drawing/2017/model3d" xmlns:o="urn:schemas-microsoft-com:office:office" xmlns:oel="http://schemas.microsoft.com/office/2019/extlst" xmlns:r="http://schemas.openxmlformats.org/officeDocument/2006/relationships" xmlns:m="http://schemas.openxmlformats.org/officeDocument/2006/math" xmlns:v="urn:schemas-microsoft-com:vml" xmlns:wp14="http://schemas.microsoft.com/office/word/2010/wordprocessingDrawing" xmlns:wp="http://schemas.openxmlformats.org/drawingml/2006/wordprocessingDrawing" xmlns:w10="urn:schemas-microsoft-com:office:word" xmlns:w="http://schemas.openxmlformats.org/wordprocessingml/2006/main" xmlns:w14="http://schemas.microsoft.com/office/word/2010/wordml" xmlns:w15="http://schemas.microsoft.com/office/word/2012/wordml" xmlns:w16cex="http://schemas.microsoft.com/office/word/2018/wordml/cex" xmlns:w16cid="http://schemas.microsoft.com/office/word/2016/wordml/cid" xmlns:w16="http://schemas.microsoft.com/office/word/2018/wordml" xmlns:w16du="http://schemas.microsoft.com/office/word/2023/wordml/word16du" xmlns:w16sdtdh="http://schemas.microsoft.com/office/word/2020/wordml/sdtdatahash" xmlns:w16sdtfl="http://schemas.microsoft.com/office/word/2024/wordml/sdtformatlock" xmlns:w16se="http://schemas.microsoft.com/office/word/2015/wordml/symex" xmlns:wpg="http://schemas.microsoft.com/office/word/2010/wordprocessingGroup" xmlns:wpi="http://schemas.microsoft.com/office/word/2010/wordprocessingInk" xmlns:wne="http://schemas.microsoft.com/office/word/2006/wordml" xmlns:wps="http://schemas.microsoft.com/office/word/2010/wordprocessingShape" mc:Ignorable="w14 w15 w16se w16cid w16 w16cex w16sdtdh w16sdtfl w16du wp14">
+<w:hdr xmlns:wpc="http://schemas.microsoft.com/office/word/2010/wordprocessingCanvas" xmlns:cx="http://schemas.microsoft.com/office/drawing/2014/chartex" xmlns:cx1="http://schemas.microsoft.com/office/drawing/2015/9/8/chartex" xmlns:cx2="http://schemas.microsoft.com/office/drawing/2015/10/21/chartex" xmlns:cx3="http://schemas.microsoft.com/office/drawing/2016/5/9/chartex" xmlns:cx4="http://schemas.microsoft.com/office/drawing/2016/5/10/chartex" xmlns:cx5="http://schemas.microsoft.com/office/drawing/2016/5/11/chartex" xmlns:cx6="http://schemas.microsoft.com/office/drawing/2016/5/12/chartex" xmlns:cx7="http://schemas.microsoft.com/office/drawing/2016/5/13/chartex" xmlns:cx8="http://schemas.microsoft.com/office/drawing/2016/5/14/chartex" xmlns:mc="http://schemas.openxmlformats.org/markup-compatibility/2006" xmlns:m="http://schemas.openxmlformats.org/officeDocument/2006/math" xmlns:aink="http://schemas.microsoft.com/office/drawing/2016/ink" xmlns:am3d="http://schemas.microsoft.com/office/drawing/2017/model3d" xmlns:oel="http://schemas.microsoft.com/office/2019/extlst" xmlns:r="http://schemas.openxmlformats.org/officeDocument/2006/relationships" xmlns:wp14="http://schemas.microsoft.com/office/word/2010/wordprocessingDrawing" xmlns:wp="http://schemas.openxmlformats.org/drawingml/2006/wordprocessingDrawing" xmlns:wpg="http://schemas.microsoft.com/office/word/2010/wordprocessingGroup" xmlns:wpi="http://schemas.microsoft.com/office/word/2010/wordprocessingInk" xmlns:wps="http://schemas.microsoft.com/office/word/2010/wordprocessingShape" xmlns:o="urn:schemas-microsoft-com:office:office" xmlns:v="urn:schemas-microsoft-com:vml" xmlns:w10="urn:schemas-microsoft-com:office:word" xmlns:w="http://schemas.openxmlformats.org/wordprocessingml/2006/main" xmlns:w14="http://schemas.microsoft.com/office/word/2010/wordml" xmlns:w15="http://schemas.microsoft.com/office/word/2012/wordml" xmlns:w16cex="http://schemas.microsoft.com/office/word/2018/wordml/cex" xmlns:w16cid="http://schemas.microsoft.com/office/word/2016/wordml/cid" xmlns:w16="http://schemas.microsoft.com/office/word/2018/wordml" xmlns:w16sdtdh="http://schemas.microsoft.com/office/word/2020/wordml/sdtdatahash" xmlns:w16sdtfl="http://schemas.microsoft.com/office/word/2024/wordml/sdtformatlock" xmlns:w16se="http://schemas.microsoft.com/office/word/2015/wordml/symex" xmlns:w16du="http://schemas.microsoft.com/office/word/2023/wordml/word16du" xmlns:wne="http://schemas.microsoft.com/office/word/2006/wordml" mc:Ignorable="w14 w15 w16se w16cid w16 w16cex w16sdtdh w16sdtfl w16du wp14">
   <w:p>
     <w:pPr>
       <w:pStyle w:val="Header"/>
@@ -2790,7 +3966,7 @@
               <v:stroke joinstyle="miter"/>
               <v:path gradientshapeok="t" o:connecttype="rect"/>
             </v:shapetype>
-            <v:shape id="Text Box 2" o:spid="_x0000_s1026" type="#_x0000_t202" alt=" " style="position:absolute;margin-left:0;margin-top:0;width:22.25pt;height:25.6pt;z-index:251659264;visibility:visible;mso-wrap-style:none;mso-wrap-distance-left:0;mso-wrap-distance-top:0;mso-wrap-distance-right:0;mso-wrap-distance-bottom:0;mso-position-horizontal:left;mso-position-horizontal-relative:page;mso-position-vertical:top;mso-position-vertical-relative:page;v-text-anchor:top" o:gfxdata="UEsDBBQABgAIAAAAIQC2gziS/gAAAOEBAAATAAAAW0NvbnRlbnRfVHlwZXNdLnhtbJSRQU7DMBBF&#10;90jcwfIWJU67QAgl6YK0S0CoHGBkTxKLZGx5TGhvj5O2G0SRWNoz/78nu9wcxkFMGNg6quQqL6RA&#10;0s5Y6ir5vt9lD1JwBDIwOMJKHpHlpr69KfdHjyxSmriSfYz+USnWPY7AufNIadK6MEJMx9ApD/oD&#10;OlTrorhX2lFEilmcO2RdNtjC5xDF9pCuTyYBB5bi6bQ4syoJ3g9WQ0ymaiLzg5KdCXlKLjvcW893&#10;SUOqXwnz5DrgnHtJTxOsQfEKIT7DmDSUCaxw7Rqn8787ZsmRM9e2VmPeBN4uqYvTtW7jvijg9N/y&#10;JsXecLq0q+WD6m8AAAD//wMAUEsDBBQABgAIAAAAIQA4/SH/1gAAAJQBAAALAAAAX3JlbHMvLnJl&#10;bHOkkMFqwzAMhu+DvYPRfXGawxijTi+j0GvpHsDYimMaW0Yy2fr2M4PBMnrbUb/Q94l/f/hMi1qR&#10;JVI2sOt6UJgd+ZiDgffL8ekFlFSbvV0oo4EbChzGx4f9GRdb25HMsYhqlCwG5lrLq9biZkxWOiqY&#10;22YiTra2kYMu1l1tQD30/bPm3wwYN0x18gb45AdQl1tp5j/sFB2T0FQ7R0nTNEV3j6o9feQzro1i&#10;OWA14Fm+Q8a1a8+Bvu/d/dMb2JY5uiPbhG/ktn4cqGU/er3pcvwCAAD//wMAUEsDBBQABgAIAAAA&#10;IQB2dxKPDgIAABoEAAAOAAAAZHJzL2Uyb0RvYy54bWysU0uP0zAQviPxHyzfadJAYYmarsquipCq&#10;3ZW6aM+uYzeRYo9lT5uUX8/YTVtYOCEuzrwyj2++md8OpmMH5UMLtuLTSc6ZshLq1u4q/v159e6G&#10;s4DC1qIDqyp+VIHfLt6+mfeuVAU00NXKM0piQ9m7ijeIrsyyIBtlRJiAU5acGrwRSKrfZbUXPWU3&#10;XVbk+cesB187D1KFQNb7k5MvUn6tlcRHrYNC1lWcesP0+vRu45st5qLceeGaVo5tiH/owojWUtFL&#10;qnuBgu19+0cq00oPATROJJgMtG6lSjPQNNP81TSbRjiVZiFwgrvAFP5fWvlw2Lgnz3D4AgMtMALS&#10;u1AGMsZ5Bu1N/FKnjPwE4fECmxqQSTIWN8Xs04wzSa73xWxaJFiz68/OB/yqwLAoVNzTVhJY4rAO&#10;SAUp9BwSa1lYtV2XNtPZ3wwUGC3ZtcMo4bAdxra3UB9pGg+nRQcnVy3VXIuAT8LTZmkAYis+0qM7&#10;6CsOo8RZA/7H3+wxngAnL2c9MaXilqjMWffN0iKK2Yc8j8xK2vRzPouaTxoJ27Ng9+YOiIRTugcn&#10;kxjjsDuL2oN5ITIvYzVyCSupZsXxLN7hibd0DFItlymISOQEru3GyZg6ghWRfB5ehHcj3Eh7eoAz&#10;l0T5CvVTbPwzuOUeCfu0kgjsCc0RbyJg2tR4LJHhv+op6nrSi58AAAD//wMAUEsDBBQABgAIAAAA&#10;IQAIuqxP2gAAAAMBAAAPAAAAZHJzL2Rvd25yZXYueG1sTI/NSsRAEITvgu8wtODNneySiMR0FhEE&#10;BRdxXfQ6m+n8YKYnZCab+Pa2XvTSUFRR9XWxXVyvTjSGzjPCepWAIq687bhBOLw9XN2ACtGwNb1n&#10;QviiANvy/KwwufUzv9JpHxslJRxyg9DGOORah6olZ8LKD8Ti1X50JoocG21HM0u56/UmSa61Mx3L&#10;QmsGum+p+txPDuExDR9xquss7J53c/I0u8P08o54ebHc3YKKtMS/MPzgCzqUwnT0E9ugegR5JP5e&#10;8dI0A3VEyNYb0GWh/7OX3wAAAP//AwBQSwECLQAUAAYACAAAACEAtoM4kv4AAADhAQAAEwAAAAAA&#10;AAAAAAAAAAAAAAAAW0NvbnRlbnRfVHlwZXNdLnhtbFBLAQItABQABgAIAAAAIQA4/SH/1gAAAJQB&#10;AAALAAAAAAAAAAAAAAAAAC8BAABfcmVscy8ucmVsc1BLAQItABQABgAIAAAAIQB2dxKPDgIAABoE&#10;AAAOAAAAAAAAAAAAAAAAAC4CAABkcnMvZTJvRG9jLnhtbFBLAQItABQABgAIAAAAIQAIuqxP2gAA&#10;AAMBAAAPAAAAAAAAAAAAAAAAAGgEAABkcnMvZG93bnJldi54bWxQSwUGAAAAAAQABADzAAAAbwUA&#10;AAAA&#10;" filled="f" stroked="f">
+            <v:shape id="Text Box 2" o:spid="_x0000_s1026" type="#_x0000_t202" alt=" " style="position:absolute;margin-left:0;margin-top:0;width:22.25pt;height:25.6pt;z-index:251659264;visibility:visible;mso-wrap-style:none;mso-wrap-distance-left:0;mso-wrap-distance-top:0;mso-wrap-distance-right:0;mso-wrap-distance-bottom:0;mso-position-horizontal:left;mso-position-horizontal-relative:page;mso-position-vertical:top;mso-position-vertical-relative:page;v-text-anchor:top" o:gfxdata="UEsDBBQABgAIAAAAIQC2gziS/gAAAOEBAAATAAAAW0NvbnRlbnRfVHlwZXNdLnhtbJSRQU7DMBBF&#13;&#10;90jcwfIWJU67QAgl6YK0S0CoHGBkTxKLZGx5TGhvj5O2G0SRWNoz/78nu9wcxkFMGNg6quQqL6RA&#13;&#10;0s5Y6ir5vt9lD1JwBDIwOMJKHpHlpr69KfdHjyxSmriSfYz+USnWPY7AufNIadK6MEJMx9ApD/oD&#13;&#10;OlTrorhX2lFEilmcO2RdNtjC5xDF9pCuTyYBB5bi6bQ4syoJ3g9WQ0ymaiLzg5KdCXlKLjvcW893&#13;&#10;SUOqXwnz5DrgnHtJTxOsQfEKIT7DmDSUCaxw7Rqn8787ZsmRM9e2VmPeBN4uqYvTtW7jvijg9N/y&#13;&#10;JsXecLq0q+WD6m8AAAD//wMAUEsDBBQABgAIAAAAIQA4/SH/1gAAAJQBAAALAAAAX3JlbHMvLnJl&#13;&#10;bHOkkMFqwzAMhu+DvYPRfXGawxijTi+j0GvpHsDYimMaW0Yy2fr2M4PBMnrbUb/Q94l/f/hMi1qR&#13;&#10;JVI2sOt6UJgd+ZiDgffL8ekFlFSbvV0oo4EbChzGx4f9GRdb25HMsYhqlCwG5lrLq9biZkxWOiqY&#13;&#10;22YiTra2kYMu1l1tQD30/bPm3wwYN0x18gb45AdQl1tp5j/sFB2T0FQ7R0nTNEV3j6o9feQzro1i&#13;&#10;OWA14Fm+Q8a1a8+Bvu/d/dMb2JY5uiPbhG/ktn4cqGU/er3pcvwCAAD//wMAUEsDBBQABgAIAAAA&#13;&#10;IQB2dxKPDgIAABoEAAAOAAAAZHJzL2Uyb0RvYy54bWysU0uP0zAQviPxHyzfadJAYYmarsquipCq&#13;&#10;3ZW6aM+uYzeRYo9lT5uUX8/YTVtYOCEuzrwyj2++md8OpmMH5UMLtuLTSc6ZshLq1u4q/v159e6G&#13;&#10;s4DC1qIDqyp+VIHfLt6+mfeuVAU00NXKM0piQ9m7ijeIrsyyIBtlRJiAU5acGrwRSKrfZbUXPWU3&#13;&#10;XVbk+cesB187D1KFQNb7k5MvUn6tlcRHrYNC1lWcesP0+vRu45st5qLceeGaVo5tiH/owojWUtFL&#13;&#10;qnuBgu19+0cq00oPATROJJgMtG6lSjPQNNP81TSbRjiVZiFwgrvAFP5fWvlw2Lgnz3D4AgMtMALS&#13;&#10;u1AGMsZ5Bu1N/FKnjPwE4fECmxqQSTIWN8Xs04wzSa73xWxaJFiz68/OB/yqwLAoVNzTVhJY4rAO&#13;&#10;SAUp9BwSa1lYtV2XNtPZ3wwUGC3ZtcMo4bAdxra3UB9pGg+nRQcnVy3VXIuAT8LTZmkAYis+0qM7&#13;&#10;6CsOo8RZA/7H3+wxngAnL2c9MaXilqjMWffN0iKK2Yc8j8xK2vRzPouaTxoJ27Ng9+YOiIRTugcn&#13;&#10;kxjjsDuL2oN5ITIvYzVyCSupZsXxLN7hibd0DFItlymISOQEru3GyZg6ghWRfB5ehHcj3Eh7eoAz&#13;&#10;l0T5CvVTbPwzuOUeCfu0kgjsCc0RbyJg2tR4LJHhv+op6nrSi58AAAD//wMAUEsDBBQABgAIAAAA&#13;&#10;IQB31MLy3gAAAAgBAAAPAAAAZHJzL2Rvd25yZXYueG1sTI9PS8NAEMXvBb/DMkJv7aYlEUmzKUUR&#13;&#10;LFjEWvS6zU7+0OxsyG6a+O0dvejlwfB4b94v2062FVfsfeNIwWoZgUAqnGmoUnB6f1rcg/BBk9Gt&#13;&#10;I1TwhR62+c0s06lxI73h9RgqwSXkU62gDqFLpfRFjVb7peuQ2Ctdb3Xgs6+k6fXI5baV6yi6k1Y3&#13;&#10;xB9q3eFDjcXlOFgFz7H/DENZJv7wchij/WhPw+uHUvPb6XHDstuACDiFvwT8MPB+yHnY2Q1kvGgV&#13;&#10;ME34VfbiOAFxVpCs1iDzTP4HyL8BAAD//wMAUEsBAi0AFAAGAAgAAAAhALaDOJL+AAAA4QEAABMA&#13;&#10;AAAAAAAAAAAAAAAAAAAAAFtDb250ZW50X1R5cGVzXS54bWxQSwECLQAUAAYACAAAACEAOP0h/9YA&#13;&#10;AACUAQAACwAAAAAAAAAAAAAAAAAvAQAAX3JlbHMvLnJlbHNQSwECLQAUAAYACAAAACEAdncSjw4C&#13;&#10;AAAaBAAADgAAAAAAAAAAAAAAAAAuAgAAZHJzL2Uyb0RvYy54bWxQSwECLQAUAAYACAAAACEAd9TC&#13;&#10;8t4AAAAIAQAADwAAAAAAAAAAAAAAAABoBAAAZHJzL2Rvd25yZXYueG1sUEsFBgAAAAAEAAQA8wAA&#13;&#10;AHMFAAAAAA==&#13;&#10;" filled="f" stroked="f">
               <v:textbox style="mso-fit-shape-to-text:t" inset="20pt,15pt,0,0">
                 <w:txbxContent>
                   <w:p>
@@ -2828,7 +4004,7 @@
 </file>
 
 <file path=word/header2.xml><?xml version="1.0" encoding="utf-8"?>
-<w:hdr xmlns:wpc="http://schemas.microsoft.com/office/word/2010/wordprocessingCanvas" xmlns:cx="http://schemas.microsoft.com/office/drawing/2014/chartex" xmlns:cx1="http://schemas.microsoft.com/office/drawing/2015/9/8/chartex" xmlns:cx2="http://schemas.microsoft.com/office/drawing/2015/10/21/chartex" xmlns:cx3="http://schemas.microsoft.com/office/drawing/2016/5/9/chartex" xmlns:cx4="http://schemas.microsoft.com/office/drawing/2016/5/10/chartex" xmlns:cx5="http://schemas.microsoft.com/office/drawing/2016/5/11/chartex" xmlns:cx6="http://schemas.microsoft.com/office/drawing/2016/5/12/chartex" xmlns:cx7="http://schemas.microsoft.com/office/drawing/2016/5/13/chartex" xmlns:cx8="http://schemas.microsoft.com/office/drawing/2016/5/14/chartex" xmlns:mc="http://schemas.openxmlformats.org/markup-compatibility/2006" xmlns:aink="http://schemas.microsoft.com/office/drawing/2016/ink" xmlns:am3d="http://schemas.microsoft.com/office/drawing/2017/model3d" xmlns:o="urn:schemas-microsoft-com:office:office" xmlns:oel="http://schemas.microsoft.com/office/2019/extlst" xmlns:r="http://schemas.openxmlformats.org/officeDocument/2006/relationships" xmlns:m="http://schemas.openxmlformats.org/officeDocument/2006/math" xmlns:v="urn:schemas-microsoft-com:vml" xmlns:wp14="http://schemas.microsoft.com/office/word/2010/wordprocessingDrawing" xmlns:wp="http://schemas.openxmlformats.org/drawingml/2006/wordprocessingDrawing" xmlns:w10="urn:schemas-microsoft-com:office:word" xmlns:w="http://schemas.openxmlformats.org/wordprocessingml/2006/main" xmlns:w14="http://schemas.microsoft.com/office/word/2010/wordml" xmlns:w15="http://schemas.microsoft.com/office/word/2012/wordml" xmlns:w16cex="http://schemas.microsoft.com/office/word/2018/wordml/cex" xmlns:w16cid="http://schemas.microsoft.com/office/word/2016/wordml/cid" xmlns:w16="http://schemas.microsoft.com/office/word/2018/wordml" xmlns:w16du="http://schemas.microsoft.com/office/word/2023/wordml/word16du" xmlns:w16sdtdh="http://schemas.microsoft.com/office/word/2020/wordml/sdtdatahash" xmlns:w16sdtfl="http://schemas.microsoft.com/office/word/2024/wordml/sdtformatlock" xmlns:w16se="http://schemas.microsoft.com/office/word/2015/wordml/symex" xmlns:wpg="http://schemas.microsoft.com/office/word/2010/wordprocessingGroup" xmlns:wpi="http://schemas.microsoft.com/office/word/2010/wordprocessingInk" xmlns:wne="http://schemas.microsoft.com/office/word/2006/wordml" xmlns:wps="http://schemas.microsoft.com/office/word/2010/wordprocessingShape" mc:Ignorable="w14 w15 w16se w16cid w16 w16cex w16sdtdh w16sdtfl w16du wp14">
+<w:hdr xmlns:wpc="http://schemas.microsoft.com/office/word/2010/wordprocessingCanvas" xmlns:cx="http://schemas.microsoft.com/office/drawing/2014/chartex" xmlns:cx1="http://schemas.microsoft.com/office/drawing/2015/9/8/chartex" xmlns:cx2="http://schemas.microsoft.com/office/drawing/2015/10/21/chartex" xmlns:cx3="http://schemas.microsoft.com/office/drawing/2016/5/9/chartex" xmlns:cx4="http://schemas.microsoft.com/office/drawing/2016/5/10/chartex" xmlns:cx5="http://schemas.microsoft.com/office/drawing/2016/5/11/chartex" xmlns:cx6="http://schemas.microsoft.com/office/drawing/2016/5/12/chartex" xmlns:cx7="http://schemas.microsoft.com/office/drawing/2016/5/13/chartex" xmlns:cx8="http://schemas.microsoft.com/office/drawing/2016/5/14/chartex" xmlns:mc="http://schemas.openxmlformats.org/markup-compatibility/2006" xmlns:m="http://schemas.openxmlformats.org/officeDocument/2006/math" xmlns:aink="http://schemas.microsoft.com/office/drawing/2016/ink" xmlns:am3d="http://schemas.microsoft.com/office/drawing/2017/model3d" xmlns:oel="http://schemas.microsoft.com/office/2019/extlst" xmlns:r="http://schemas.openxmlformats.org/officeDocument/2006/relationships" xmlns:wp14="http://schemas.microsoft.com/office/word/2010/wordprocessingDrawing" xmlns:wp="http://schemas.openxmlformats.org/drawingml/2006/wordprocessingDrawing" xmlns:wpg="http://schemas.microsoft.com/office/word/2010/wordprocessingGroup" xmlns:wpi="http://schemas.microsoft.com/office/word/2010/wordprocessingInk" xmlns:wps="http://schemas.microsoft.com/office/word/2010/wordprocessingShape" xmlns:o="urn:schemas-microsoft-com:office:office" xmlns:v="urn:schemas-microsoft-com:vml" xmlns:w10="urn:schemas-microsoft-com:office:word" xmlns:w="http://schemas.openxmlformats.org/wordprocessingml/2006/main" xmlns:w14="http://schemas.microsoft.com/office/word/2010/wordml" xmlns:w15="http://schemas.microsoft.com/office/word/2012/wordml" xmlns:w16cex="http://schemas.microsoft.com/office/word/2018/wordml/cex" xmlns:w16cid="http://schemas.microsoft.com/office/word/2016/wordml/cid" xmlns:w16="http://schemas.microsoft.com/office/word/2018/wordml" xmlns:w16sdtdh="http://schemas.microsoft.com/office/word/2020/wordml/sdtdatahash" xmlns:w16sdtfl="http://schemas.microsoft.com/office/word/2024/wordml/sdtformatlock" xmlns:w16se="http://schemas.microsoft.com/office/word/2015/wordml/symex" xmlns:w16du="http://schemas.microsoft.com/office/word/2023/wordml/word16du" xmlns:wne="http://schemas.microsoft.com/office/word/2006/wordml" mc:Ignorable="w14 w15 w16se w16cid w16 w16cex w16sdtdh w16sdtfl w16du wp14">
   <w:p>
     <w:pPr>
       <w:pStyle w:val="Header"/>
@@ -2920,7 +4096,7 @@
               <v:stroke joinstyle="miter"/>
               <v:path gradientshapeok="t" o:connecttype="rect"/>
             </v:shapetype>
-            <v:shape id="Text Box 3" o:spid="_x0000_s1027" type="#_x0000_t202" alt=" " style="position:absolute;margin-left:0;margin-top:0;width:22.25pt;height:25.6pt;z-index:251660288;visibility:visible;mso-wrap-style:none;mso-wrap-distance-left:0;mso-wrap-distance-top:0;mso-wrap-distance-right:0;mso-wrap-distance-bottom:0;mso-position-horizontal:left;mso-position-horizontal-relative:page;mso-position-vertical:top;mso-position-vertical-relative:page;v-text-anchor:top" o:gfxdata="UEsDBBQABgAIAAAAIQC2gziS/gAAAOEBAAATAAAAW0NvbnRlbnRfVHlwZXNdLnhtbJSRQU7DMBBF&#10;90jcwfIWJU67QAgl6YK0S0CoHGBkTxKLZGx5TGhvj5O2G0SRWNoz/78nu9wcxkFMGNg6quQqL6RA&#10;0s5Y6ir5vt9lD1JwBDIwOMJKHpHlpr69KfdHjyxSmriSfYz+USnWPY7AufNIadK6MEJMx9ApD/oD&#10;OlTrorhX2lFEilmcO2RdNtjC5xDF9pCuTyYBB5bi6bQ4syoJ3g9WQ0ymaiLzg5KdCXlKLjvcW893&#10;SUOqXwnz5DrgnHtJTxOsQfEKIT7DmDSUCaxw7Rqn8787ZsmRM9e2VmPeBN4uqYvTtW7jvijg9N/y&#10;JsXecLq0q+WD6m8AAAD//wMAUEsDBBQABgAIAAAAIQA4/SH/1gAAAJQBAAALAAAAX3JlbHMvLnJl&#10;bHOkkMFqwzAMhu+DvYPRfXGawxijTi+j0GvpHsDYimMaW0Yy2fr2M4PBMnrbUb/Q94l/f/hMi1qR&#10;JVI2sOt6UJgd+ZiDgffL8ekFlFSbvV0oo4EbChzGx4f9GRdb25HMsYhqlCwG5lrLq9biZkxWOiqY&#10;22YiTra2kYMu1l1tQD30/bPm3wwYN0x18gb45AdQl1tp5j/sFB2T0FQ7R0nTNEV3j6o9feQzro1i&#10;OWA14Fm+Q8a1a8+Bvu/d/dMb2JY5uiPbhG/ktn4cqGU/er3pcvwCAAD//wMAUEsDBBQABgAIAAAA&#10;IQAUgEe7EQIAACEEAAAOAAAAZHJzL2Uyb0RvYy54bWysU01v2zAMvQ/YfxB0X+x4y9YZcYqsRYYB&#10;QVsgHXpWZCk2YImCxMTOfv0o5avteip2kSmS5sd7T9PrwXRsp3xowVZ8PMo5U1ZC3dpNxX8/Lj5d&#10;cRZQ2Fp0YFXF9yrw69nHD9PelaqABrpaeUZFbCh7V/EG0ZVZFmSjjAgjcMpSUIM3AunqN1ntRU/V&#10;TZcVef4168HXzoNUIZD39hDks1RfayXxXuugkHUVp9kwnT6d63hms6koN164ppXHMcQ7pjCitdT0&#10;XOpWoGBb3/5TyrTSQwCNIwkmA61bqdIOtM04f7XNqhFOpV0InODOMIX/V1be7VbuwTMcfsBABEZA&#10;ehfKQM64z6C9iV+alFGcINyfYVMDMknO4qqYfJtwJin0uZiMiwRrdvnZ+YA/FRgWjYp7YiWBJXbL&#10;gNSQUk8psZeFRdt1iZnOvnBQYvRklwmjhcN6YG39bPo11HtaysOB7+DkoqXWSxHwQXgimPYg0eI9&#10;HbqDvuJwtDhrwP95yx/zCXeKctaTYCpuSdGcdb8s8VFMvuR5FFi6jb/nk3jz6UbG+mTYrbkB0uKY&#10;noWTyYx52J1M7cE8kabnsRuFhJXUs+J4Mm/wIF96E1LN5ymJtOQELu3KyVg6YhYBfRyehHdH1JHo&#10;uoOTpET5CvxDbvwzuPkWiYLETMT3gOYRdtJhIuz4ZqLQn99T1uVlz/4CAAD//wMAUEsDBBQABgAI&#10;AAAAIQAIuqxP2gAAAAMBAAAPAAAAZHJzL2Rvd25yZXYueG1sTI/NSsRAEITvgu8wtODNneySiMR0&#10;FhEEBRdxXfQ6m+n8YKYnZCab+Pa2XvTSUFRR9XWxXVyvTjSGzjPCepWAIq687bhBOLw9XN2ACtGw&#10;Nb1nQviiANvy/KwwufUzv9JpHxslJRxyg9DGOORah6olZ8LKD8Ti1X50JoocG21HM0u56/UmSa61&#10;Mx3LQmsGum+p+txPDuExDR9xquss7J53c/I0u8P08o54ebHc3YKKtMS/MPzgCzqUwnT0E9ugegR5&#10;JP5e8dI0A3VEyNYb0GWh/7OX3wAAAP//AwBQSwECLQAUAAYACAAAACEAtoM4kv4AAADhAQAAEwAA&#10;AAAAAAAAAAAAAAAAAAAAW0NvbnRlbnRfVHlwZXNdLnhtbFBLAQItABQABgAIAAAAIQA4/SH/1gAA&#10;AJQBAAALAAAAAAAAAAAAAAAAAC8BAABfcmVscy8ucmVsc1BLAQItABQABgAIAAAAIQAUgEe7EQIA&#10;ACEEAAAOAAAAAAAAAAAAAAAAAC4CAABkcnMvZTJvRG9jLnhtbFBLAQItABQABgAIAAAAIQAIuqxP&#10;2gAAAAMBAAAPAAAAAAAAAAAAAAAAAGsEAABkcnMvZG93bnJldi54bWxQSwUGAAAAAAQABADzAAAA&#10;cgUAAAAA&#10;" filled="f" stroked="f">
+            <v:shape id="Text Box 3" o:spid="_x0000_s1027" type="#_x0000_t202" alt=" " style="position:absolute;margin-left:0;margin-top:0;width:22.25pt;height:25.6pt;z-index:251660288;visibility:visible;mso-wrap-style:none;mso-wrap-distance-left:0;mso-wrap-distance-top:0;mso-wrap-distance-right:0;mso-wrap-distance-bottom:0;mso-position-horizontal:left;mso-position-horizontal-relative:page;mso-position-vertical:top;mso-position-vertical-relative:page;v-text-anchor:top" o:gfxdata="UEsDBBQABgAIAAAAIQC2gziS/gAAAOEBAAATAAAAW0NvbnRlbnRfVHlwZXNdLnhtbJSRQU7DMBBF&#13;&#10;90jcwfIWJU67QAgl6YK0S0CoHGBkTxKLZGx5TGhvj5O2G0SRWNoz/78nu9wcxkFMGNg6quQqL6RA&#13;&#10;0s5Y6ir5vt9lD1JwBDIwOMJKHpHlpr69KfdHjyxSmriSfYz+USnWPY7AufNIadK6MEJMx9ApD/oD&#13;&#10;OlTrorhX2lFEilmcO2RdNtjC5xDF9pCuTyYBB5bi6bQ4syoJ3g9WQ0ymaiLzg5KdCXlKLjvcW893&#13;&#10;SUOqXwnz5DrgnHtJTxOsQfEKIT7DmDSUCaxw7Rqn8787ZsmRM9e2VmPeBN4uqYvTtW7jvijg9N/y&#13;&#10;JsXecLq0q+WD6m8AAAD//wMAUEsDBBQABgAIAAAAIQA4/SH/1gAAAJQBAAALAAAAX3JlbHMvLnJl&#13;&#10;bHOkkMFqwzAMhu+DvYPRfXGawxijTi+j0GvpHsDYimMaW0Yy2fr2M4PBMnrbUb/Q94l/f/hMi1qR&#13;&#10;JVI2sOt6UJgd+ZiDgffL8ekFlFSbvV0oo4EbChzGx4f9GRdb25HMsYhqlCwG5lrLq9biZkxWOiqY&#13;&#10;22YiTra2kYMu1l1tQD30/bPm3wwYN0x18gb45AdQl1tp5j/sFB2T0FQ7R0nTNEV3j6o9feQzro1i&#13;&#10;OWA14Fm+Q8a1a8+Bvu/d/dMb2JY5uiPbhG/ktn4cqGU/er3pcvwCAAD//wMAUEsDBBQABgAIAAAA&#13;&#10;IQAUgEe7EQIAACEEAAAOAAAAZHJzL2Uyb0RvYy54bWysU01v2zAMvQ/YfxB0X+x4y9YZcYqsRYYB&#13;&#10;QVsgHXpWZCk2YImCxMTOfv0o5avteip2kSmS5sd7T9PrwXRsp3xowVZ8PMo5U1ZC3dpNxX8/Lj5d&#13;&#10;cRZQ2Fp0YFXF9yrw69nHD9PelaqABrpaeUZFbCh7V/EG0ZVZFmSjjAgjcMpSUIM3AunqN1ntRU/V&#13;&#10;TZcVef4168HXzoNUIZD39hDks1RfayXxXuugkHUVp9kwnT6d63hms6koN164ppXHMcQ7pjCitdT0&#13;&#10;XOpWoGBb3/5TyrTSQwCNIwkmA61bqdIOtM04f7XNqhFOpV0InODOMIX/V1be7VbuwTMcfsBABEZA&#13;&#10;ehfKQM64z6C9iV+alFGcINyfYVMDMknO4qqYfJtwJin0uZiMiwRrdvnZ+YA/FRgWjYp7YiWBJXbL&#13;&#10;gNSQUk8psZeFRdt1iZnOvnBQYvRklwmjhcN6YG39bPo11HtaysOB7+DkoqXWSxHwQXgimPYg0eI9&#13;&#10;HbqDvuJwtDhrwP95yx/zCXeKctaTYCpuSdGcdb8s8VFMvuR5FFi6jb/nk3jz6UbG+mTYrbkB0uKY&#13;&#10;noWTyYx52J1M7cE8kabnsRuFhJXUs+J4Mm/wIF96E1LN5ymJtOQELu3KyVg6YhYBfRyehHdH1JHo&#13;&#10;uoOTpET5CvxDbvwzuPkWiYLETMT3gOYRdtJhIuz4ZqLQn99T1uVlz/4CAAD//wMAUEsDBBQABgAI&#13;&#10;AAAAIQB31MLy3gAAAAgBAAAPAAAAZHJzL2Rvd25yZXYueG1sTI9PS8NAEMXvBb/DMkJv7aYlEUmz&#13;&#10;KUURLFjEWvS6zU7+0OxsyG6a+O0dvejlwfB4b94v2062FVfsfeNIwWoZgUAqnGmoUnB6f1rcg/BB&#13;&#10;k9GtI1TwhR62+c0s06lxI73h9RgqwSXkU62gDqFLpfRFjVb7peuQ2Ctdb3Xgs6+k6fXI5baV6yi6&#13;&#10;k1Y3xB9q3eFDjcXlOFgFz7H/DENZJv7wchij/WhPw+uHUvPb6XHDstuACDiFvwT8MPB+yHnY2Q1k&#13;&#10;vGgVME34VfbiOAFxVpCs1iDzTP4HyL8BAAD//wMAUEsBAi0AFAAGAAgAAAAhALaDOJL+AAAA4QEA&#13;&#10;ABMAAAAAAAAAAAAAAAAAAAAAAFtDb250ZW50X1R5cGVzXS54bWxQSwECLQAUAAYACAAAACEAOP0h&#13;&#10;/9YAAACUAQAACwAAAAAAAAAAAAAAAAAvAQAAX3JlbHMvLnJlbHNQSwECLQAUAAYACAAAACEAFIBH&#13;&#10;uxECAAAhBAAADgAAAAAAAAAAAAAAAAAuAgAAZHJzL2Uyb0RvYy54bWxQSwECLQAUAAYACAAAACEA&#13;&#10;d9TC8t4AAAAIAQAADwAAAAAAAAAAAAAAAABrBAAAZHJzL2Rvd25yZXYueG1sUEsFBgAAAAAEAAQA&#13;&#10;8wAAAHYFAAAAAA==&#13;&#10;" filled="f" stroked="f">
               <v:textbox style="mso-fit-shape-to-text:t" inset="20pt,15pt,0,0">
                 <w:txbxContent>
                   <w:p>
@@ -2958,7 +4134,7 @@
 </file>
 
 <file path=word/header3.xml><?xml version="1.0" encoding="utf-8"?>
-<w:hdr xmlns:wpc="http://schemas.microsoft.com/office/word/2010/wordprocessingCanvas" xmlns:cx="http://schemas.microsoft.com/office/drawing/2014/chartex" xmlns:cx1="http://schemas.microsoft.com/office/drawing/2015/9/8/chartex" xmlns:cx2="http://schemas.microsoft.com/office/drawing/2015/10/21/chartex" xmlns:cx3="http://schemas.microsoft.com/office/drawing/2016/5/9/chartex" xmlns:cx4="http://schemas.microsoft.com/office/drawing/2016/5/10/chartex" xmlns:cx5="http://schemas.microsoft.com/office/drawing/2016/5/11/chartex" xmlns:cx6="http://schemas.microsoft.com/office/drawing/2016/5/12/chartex" xmlns:cx7="http://schemas.microsoft.com/office/drawing/2016/5/13/chartex" xmlns:cx8="http://schemas.microsoft.com/office/drawing/2016/5/14/chartex" xmlns:mc="http://schemas.openxmlformats.org/markup-compatibility/2006" xmlns:aink="http://schemas.microsoft.com/office/drawing/2016/ink" xmlns:am3d="http://schemas.microsoft.com/office/drawing/2017/model3d" xmlns:o="urn:schemas-microsoft-com:office:office" xmlns:oel="http://schemas.microsoft.com/office/2019/extlst" xmlns:r="http://schemas.openxmlformats.org/officeDocument/2006/relationships" xmlns:m="http://schemas.openxmlformats.org/officeDocument/2006/math" xmlns:v="urn:schemas-microsoft-com:vml" xmlns:wp14="http://schemas.microsoft.com/office/word/2010/wordprocessingDrawing" xmlns:wp="http://schemas.openxmlformats.org/drawingml/2006/wordprocessingDrawing" xmlns:w10="urn:schemas-microsoft-com:office:word" xmlns:w="http://schemas.openxmlformats.org/wordprocessingml/2006/main" xmlns:w14="http://schemas.microsoft.com/office/word/2010/wordml" xmlns:w15="http://schemas.microsoft.com/office/word/2012/wordml" xmlns:w16cex="http://schemas.microsoft.com/office/word/2018/wordml/cex" xmlns:w16cid="http://schemas.microsoft.com/office/word/2016/wordml/cid" xmlns:w16="http://schemas.microsoft.com/office/word/2018/wordml" xmlns:w16du="http://schemas.microsoft.com/office/word/2023/wordml/word16du" xmlns:w16sdtdh="http://schemas.microsoft.com/office/word/2020/wordml/sdtdatahash" xmlns:w16sdtfl="http://schemas.microsoft.com/office/word/2024/wordml/sdtformatlock" xmlns:w16se="http://schemas.microsoft.com/office/word/2015/wordml/symex" xmlns:wpg="http://schemas.microsoft.com/office/word/2010/wordprocessingGroup" xmlns:wpi="http://schemas.microsoft.com/office/word/2010/wordprocessingInk" xmlns:wne="http://schemas.microsoft.com/office/word/2006/wordml" xmlns:wps="http://schemas.microsoft.com/office/word/2010/wordprocessingShape" mc:Ignorable="w14 w15 w16se w16cid w16 w16cex w16sdtdh w16sdtfl w16du wp14">
+<w:hdr xmlns:wpc="http://schemas.microsoft.com/office/word/2010/wordprocessingCanvas" xmlns:cx="http://schemas.microsoft.com/office/drawing/2014/chartex" xmlns:cx1="http://schemas.microsoft.com/office/drawing/2015/9/8/chartex" xmlns:cx2="http://schemas.microsoft.com/office/drawing/2015/10/21/chartex" xmlns:cx3="http://schemas.microsoft.com/office/drawing/2016/5/9/chartex" xmlns:cx4="http://schemas.microsoft.com/office/drawing/2016/5/10/chartex" xmlns:cx5="http://schemas.microsoft.com/office/drawing/2016/5/11/chartex" xmlns:cx6="http://schemas.microsoft.com/office/drawing/2016/5/12/chartex" xmlns:cx7="http://schemas.microsoft.com/office/drawing/2016/5/13/chartex" xmlns:cx8="http://schemas.microsoft.com/office/drawing/2016/5/14/chartex" xmlns:mc="http://schemas.openxmlformats.org/markup-compatibility/2006" xmlns:m="http://schemas.openxmlformats.org/officeDocument/2006/math" xmlns:aink="http://schemas.microsoft.com/office/drawing/2016/ink" xmlns:am3d="http://schemas.microsoft.com/office/drawing/2017/model3d" xmlns:oel="http://schemas.microsoft.com/office/2019/extlst" xmlns:r="http://schemas.openxmlformats.org/officeDocument/2006/relationships" xmlns:wp14="http://schemas.microsoft.com/office/word/2010/wordprocessingDrawing" xmlns:wp="http://schemas.openxmlformats.org/drawingml/2006/wordprocessingDrawing" xmlns:wpg="http://schemas.microsoft.com/office/word/2010/wordprocessingGroup" xmlns:wpi="http://schemas.microsoft.com/office/word/2010/wordprocessingInk" xmlns:wps="http://schemas.microsoft.com/office/word/2010/wordprocessingShape" xmlns:o="urn:schemas-microsoft-com:office:office" xmlns:v="urn:schemas-microsoft-com:vml" xmlns:w10="urn:schemas-microsoft-com:office:word" xmlns:w="http://schemas.openxmlformats.org/wordprocessingml/2006/main" xmlns:w14="http://schemas.microsoft.com/office/word/2010/wordml" xmlns:w15="http://schemas.microsoft.com/office/word/2012/wordml" xmlns:w16cex="http://schemas.microsoft.com/office/word/2018/wordml/cex" xmlns:w16cid="http://schemas.microsoft.com/office/word/2016/wordml/cid" xmlns:w16="http://schemas.microsoft.com/office/word/2018/wordml" xmlns:w16sdtdh="http://schemas.microsoft.com/office/word/2020/wordml/sdtdatahash" xmlns:w16sdtfl="http://schemas.microsoft.com/office/word/2024/wordml/sdtformatlock" xmlns:w16se="http://schemas.microsoft.com/office/word/2015/wordml/symex" xmlns:w16du="http://schemas.microsoft.com/office/word/2023/wordml/word16du" xmlns:wne="http://schemas.microsoft.com/office/word/2006/wordml" mc:Ignorable="w14 w15 w16se w16cid w16 w16cex w16sdtdh w16sdtfl w16du wp14">
   <w:p>
     <w:pPr>
       <w:pStyle w:val="Header"/>
@@ -3050,7 +4226,7 @@
               <v:stroke joinstyle="miter"/>
               <v:path gradientshapeok="t" o:connecttype="rect"/>
             </v:shapetype>
-            <v:shape id="Text Box 1" o:spid="_x0000_s1028" type="#_x0000_t202" alt=" " style="position:absolute;margin-left:0;margin-top:0;width:22.25pt;height:25.6pt;z-index:251658240;visibility:visible;mso-wrap-style:none;mso-wrap-distance-left:0;mso-wrap-distance-top:0;mso-wrap-distance-right:0;mso-wrap-distance-bottom:0;mso-position-horizontal:left;mso-position-horizontal-relative:page;mso-position-vertical:top;mso-position-vertical-relative:page;v-text-anchor:top" o:gfxdata="UEsDBBQABgAIAAAAIQC2gziS/gAAAOEBAAATAAAAW0NvbnRlbnRfVHlwZXNdLnhtbJSRQU7DMBBF&#10;90jcwfIWJU67QAgl6YK0S0CoHGBkTxKLZGx5TGhvj5O2G0SRWNoz/78nu9wcxkFMGNg6quQqL6RA&#10;0s5Y6ir5vt9lD1JwBDIwOMJKHpHlpr69KfdHjyxSmriSfYz+USnWPY7AufNIadK6MEJMx9ApD/oD&#10;OlTrorhX2lFEilmcO2RdNtjC5xDF9pCuTyYBB5bi6bQ4syoJ3g9WQ0ymaiLzg5KdCXlKLjvcW893&#10;SUOqXwnz5DrgnHtJTxOsQfEKIT7DmDSUCaxw7Rqn8787ZsmRM9e2VmPeBN4uqYvTtW7jvijg9N/y&#10;JsXecLq0q+WD6m8AAAD//wMAUEsDBBQABgAIAAAAIQA4/SH/1gAAAJQBAAALAAAAX3JlbHMvLnJl&#10;bHOkkMFqwzAMhu+DvYPRfXGawxijTi+j0GvpHsDYimMaW0Yy2fr2M4PBMnrbUb/Q94l/f/hMi1qR&#10;JVI2sOt6UJgd+ZiDgffL8ekFlFSbvV0oo4EbChzGx4f9GRdb25HMsYhqlCwG5lrLq9biZkxWOiqY&#10;22YiTra2kYMu1l1tQD30/bPm3wwYN0x18gb45AdQl1tp5j/sFB2T0FQ7R0nTNEV3j6o9feQzro1i&#10;OWA14Fm+Q8a1a8+Bvu/d/dMb2JY5uiPbhG/ktn4cqGU/er3pcvwCAAD//wMAUEsDBBQABgAIAAAA&#10;IQBFFrT5EwIAACEEAAAOAAAAZHJzL2Uyb0RvYy54bWysU02P0zAQvSPxHyzfadJAYYmarsquipCq&#10;3ZW6aM+uYzeRYo9lT5uUX8/YbVpYOCEuznhmMh/vPc9vB9Oxg/KhBVvx6STnTFkJdWt3Ff/+vHp3&#10;w1lAYWvRgVUVP6rAbxdv38x7V6oCGuhq5RkVsaHsXcUbRFdmWZCNMiJMwClLQQ3eCKSr32W1Fz1V&#10;N11W5PnHrAdfOw9ShUDe+1OQL1J9rZXER62DQtZVnGbDdPp0buOZLeai3HnhmlaexxD/MIURraWm&#10;l1L3AgXb+/aPUqaVHgJonEgwGWjdSpV2oG2m+attNo1wKu1C4AR3gSn8v7Ly4bBxT57h8AUGIjAC&#10;0rtQBnLGfQbtTfzSpIziBOHxApsakElyFjfF7NOMM0mh98VsWiRYs+vPzgf8qsCwaFTcEysJLHFY&#10;B6SGlDqmxF4WVm3XJWY6+5uDEqMnu04YLRy2A2trGmScfgv1kZbycOI7OLlqqfVaBHwSngimPUi0&#10;+EiH7qCvOJwtzhrwP/7mj/mEO0U560kwFbekaM66b5b4KGYf8jwKLN2mn/NZvPl0I2M7GnZv7oC0&#10;OKVn4WQyYx52o6k9mBfS9DJ2o5CwknpWHEfzDk/ypTch1XKZkkhLTuDabpyMpSNmEdDn4UV4d0Yd&#10;ia4HGCUlylfgn3Ljn8Et90gUJGYivic0z7CTDhNh5zcThf7rPWVdX/biJwAAAP//AwBQSwMEFAAG&#10;AAgAAAAhAAi6rE/aAAAAAwEAAA8AAABkcnMvZG93bnJldi54bWxMj81KxEAQhO+C7zC04M2d7JKI&#10;xHQWEQQFF3Fd9Dqb6fxgpidkJpv49rZe9NJQVFH1dbFdXK9ONIbOM8J6lYAirrztuEE4vD1c3YAK&#10;0bA1vWdC+KIA2/L8rDC59TO/0mkfGyUlHHKD0MY45FqHqiVnwsoPxOLVfnQmihwbbUczS7nr9SZJ&#10;rrUzHctCawa6b6n63E8O4TENH3Gq6yzsnndz8jS7w/Tyjnh5sdzdgoq0xL8w/OALOpTCdPQT26B6&#10;BHkk/l7x0jQDdUTI1hvQZaH/s5ffAAAA//8DAFBLAQItABQABgAIAAAAIQC2gziS/gAAAOEBAAAT&#10;AAAAAAAAAAAAAAAAAAAAAABbQ29udGVudF9UeXBlc10ueG1sUEsBAi0AFAAGAAgAAAAhADj9If/W&#10;AAAAlAEAAAsAAAAAAAAAAAAAAAAALwEAAF9yZWxzLy5yZWxzUEsBAi0AFAAGAAgAAAAhAEUWtPkT&#10;AgAAIQQAAA4AAAAAAAAAAAAAAAAALgIAAGRycy9lMm9Eb2MueG1sUEsBAi0AFAAGAAgAAAAhAAi6&#10;rE/aAAAAAwEAAA8AAAAAAAAAAAAAAAAAbQQAAGRycy9kb3ducmV2LnhtbFBLBQYAAAAABAAEAPMA&#10;AAB0BQAAAAA=&#10;" filled="f" stroked="f">
+            <v:shape id="Text Box 1" o:spid="_x0000_s1028" type="#_x0000_t202" alt=" " style="position:absolute;margin-left:0;margin-top:0;width:22.25pt;height:25.6pt;z-index:251658240;visibility:visible;mso-wrap-style:none;mso-wrap-distance-left:0;mso-wrap-distance-top:0;mso-wrap-distance-right:0;mso-wrap-distance-bottom:0;mso-position-horizontal:left;mso-position-horizontal-relative:page;mso-position-vertical:top;mso-position-vertical-relative:page;v-text-anchor:top" o:gfxdata="UEsDBBQABgAIAAAAIQC2gziS/gAAAOEBAAATAAAAW0NvbnRlbnRfVHlwZXNdLnhtbJSRQU7DMBBF&#13;&#10;90jcwfIWJU67QAgl6YK0S0CoHGBkTxKLZGx5TGhvj5O2G0SRWNoz/78nu9wcxkFMGNg6quQqL6RA&#13;&#10;0s5Y6ir5vt9lD1JwBDIwOMJKHpHlpr69KfdHjyxSmriSfYz+USnWPY7AufNIadK6MEJMx9ApD/oD&#13;&#10;OlTrorhX2lFEilmcO2RdNtjC5xDF9pCuTyYBB5bi6bQ4syoJ3g9WQ0ymaiLzg5KdCXlKLjvcW893&#13;&#10;SUOqXwnz5DrgnHtJTxOsQfEKIT7DmDSUCaxw7Rqn8787ZsmRM9e2VmPeBN4uqYvTtW7jvijg9N/y&#13;&#10;JsXecLq0q+WD6m8AAAD//wMAUEsDBBQABgAIAAAAIQA4/SH/1gAAAJQBAAALAAAAX3JlbHMvLnJl&#13;&#10;bHOkkMFqwzAMhu+DvYPRfXGawxijTi+j0GvpHsDYimMaW0Yy2fr2M4PBMnrbUb/Q94l/f/hMi1qR&#13;&#10;JVI2sOt6UJgd+ZiDgffL8ekFlFSbvV0oo4EbChzGx4f9GRdb25HMsYhqlCwG5lrLq9biZkxWOiqY&#13;&#10;22YiTra2kYMu1l1tQD30/bPm3wwYN0x18gb45AdQl1tp5j/sFB2T0FQ7R0nTNEV3j6o9feQzro1i&#13;&#10;OWA14Fm+Q8a1a8+Bvu/d/dMb2JY5uiPbhG/ktn4cqGU/er3pcvwCAAD//wMAUEsDBBQABgAIAAAA&#13;&#10;IQBFFrT5EwIAACEEAAAOAAAAZHJzL2Uyb0RvYy54bWysU02P0zAQvSPxHyzfadJAYYmarsquipCq&#13;&#10;3ZW6aM+uYzeRYo9lT5uUX8/YbVpYOCEuznhmMh/vPc9vB9Oxg/KhBVvx6STnTFkJdWt3Ff/+vHp3&#13;&#10;w1lAYWvRgVUVP6rAbxdv38x7V6oCGuhq5RkVsaHsXcUbRFdmWZCNMiJMwClLQQ3eCKSr32W1Fz1V&#13;&#10;N11W5PnHrAdfOw9ShUDe+1OQL1J9rZXER62DQtZVnGbDdPp0buOZLeai3HnhmlaexxD/MIURraWm&#13;&#10;l1L3AgXb+/aPUqaVHgJonEgwGWjdSpV2oG2m+attNo1wKu1C4AR3gSn8v7Ly4bBxT57h8AUGIjAC&#13;&#10;0rtQBnLGfQbtTfzSpIziBOHxApsakElyFjfF7NOMM0mh98VsWiRYs+vPzgf8qsCwaFTcEysJLHFY&#13;&#10;B6SGlDqmxF4WVm3XJWY6+5uDEqMnu04YLRy2A2trGmScfgv1kZbycOI7OLlqqfVaBHwSngimPUi0&#13;&#10;+EiH7qCvOJwtzhrwP/7mj/mEO0U560kwFbekaM66b5b4KGYf8jwKLN2mn/NZvPl0I2M7GnZv7oC0&#13;&#10;OKVn4WQyYx52o6k9mBfS9DJ2o5CwknpWHEfzDk/ypTch1XKZkkhLTuDabpyMpSNmEdDn4UV4d0Yd&#13;&#10;ia4HGCUlylfgn3Ljn8Et90gUJGYivic0z7CTDhNh5zcThf7rPWVdX/biJwAAAP//AwBQSwMEFAAG&#13;&#10;AAgAAAAhAHfUwvLeAAAACAEAAA8AAABkcnMvZG93bnJldi54bWxMj09Lw0AQxe8Fv8MyQm/tpiUR&#13;&#10;SbMpRREsWMRa9LrNTv7Q7GzIbpr47R296OXB8Hhv3i/bTrYVV+x940jBahmBQCqcaahScHp/WtyD&#13;&#10;8EGT0a0jVPCFHrb5zSzTqXEjveH1GCrBJeRTraAOoUul9EWNVvul65DYK11vdeCzr6Tp9cjltpXr&#13;&#10;KLqTVjfEH2rd4UONxeU4WAXPsf8MQ1km/vByGKP9aE/D64dS89vpccOy24AIOIW/BPww8H7IedjZ&#13;&#10;DWS8aBUwTfhV9uI4AXFWkKzWIPNM/gfIvwEAAP//AwBQSwECLQAUAAYACAAAACEAtoM4kv4AAADh&#13;&#10;AQAAEwAAAAAAAAAAAAAAAAAAAAAAW0NvbnRlbnRfVHlwZXNdLnhtbFBLAQItABQABgAIAAAAIQA4&#13;&#10;/SH/1gAAAJQBAAALAAAAAAAAAAAAAAAAAC8BAABfcmVscy8ucmVsc1BLAQItABQABgAIAAAAIQBF&#13;&#10;FrT5EwIAACEEAAAOAAAAAAAAAAAAAAAAAC4CAABkcnMvZTJvRG9jLnhtbFBLAQItABQABgAIAAAA&#13;&#10;IQB31MLy3gAAAAgBAAAPAAAAAAAAAAAAAAAAAG0EAABkcnMvZG93bnJldi54bWxQSwUGAAAAAAQA&#13;&#10;BADzAAAAeAUAAAAA&#13;&#10;" filled="f" stroked="f">
               <v:textbox style="mso-fit-shape-to-text:t" inset="20pt,15pt,0,0">
                 <w:txbxContent>
                   <w:p>
@@ -3088,7 +4264,7 @@
 </file>
 
 <file path=word/numbering.xml><?xml version="1.0" encoding="utf-8"?>
-<w:numbering xmlns:wpc="http://schemas.microsoft.com/office/word/2010/wordprocessingCanvas" xmlns:cx="http://schemas.microsoft.com/office/drawing/2014/chartex" xmlns:cx1="http://schemas.microsoft.com/office/drawing/2015/9/8/chartex" xmlns:cx2="http://schemas.microsoft.com/office/drawing/2015/10/21/chartex" xmlns:cx3="http://schemas.microsoft.com/office/drawing/2016/5/9/chartex" xmlns:cx4="http://schemas.microsoft.com/office/drawing/2016/5/10/chartex" xmlns:cx5="http://schemas.microsoft.com/office/drawing/2016/5/11/chartex" xmlns:cx6="http://schemas.microsoft.com/office/drawing/2016/5/12/chartex" xmlns:cx7="http://schemas.microsoft.com/office/drawing/2016/5/13/chartex" xmlns:cx8="http://schemas.microsoft.com/office/drawing/2016/5/14/chartex" xmlns:mc="http://schemas.openxmlformats.org/markup-compatibility/2006" xmlns:aink="http://schemas.microsoft.com/office/drawing/2016/ink" xmlns:am3d="http://schemas.microsoft.com/office/drawing/2017/model3d" xmlns:o="urn:schemas-microsoft-com:office:office" xmlns:oel="http://schemas.microsoft.com/office/2019/extlst" xmlns:r="http://schemas.openxmlformats.org/officeDocument/2006/relationships" xmlns:m="http://schemas.openxmlformats.org/officeDocument/2006/math" xmlns:v="urn:schemas-microsoft-com:vml" xmlns:wp14="http://schemas.microsoft.com/office/word/2010/wordprocessingDrawing" xmlns:wp="http://schemas.openxmlformats.org/drawingml/2006/wordprocessingDrawing" xmlns:w10="urn:schemas-microsoft-com:office:word" xmlns:w="http://schemas.openxmlformats.org/wordprocessingml/2006/main" xmlns:w14="http://schemas.microsoft.com/office/word/2010/wordml" xmlns:w15="http://schemas.microsoft.com/office/word/2012/wordml" xmlns:w16cex="http://schemas.microsoft.com/office/word/2018/wordml/cex" xmlns:w16cid="http://schemas.microsoft.com/office/word/2016/wordml/cid" xmlns:w16="http://schemas.microsoft.com/office/word/2018/wordml" xmlns:w16du="http://schemas.microsoft.com/office/word/2023/wordml/word16du" xmlns:w16sdtdh="http://schemas.microsoft.com/office/word/2020/wordml/sdtdatahash" xmlns:w16sdtfl="http://schemas.microsoft.com/office/word/2024/wordml/sdtformatlock" xmlns:w16se="http://schemas.microsoft.com/office/word/2015/wordml/symex" xmlns:wpg="http://schemas.microsoft.com/office/word/2010/wordprocessingGroup" xmlns:wpi="http://schemas.microsoft.com/office/word/2010/wordprocessingInk" xmlns:wne="http://schemas.microsoft.com/office/word/2006/wordml" xmlns:wps="http://schemas.microsoft.com/office/word/2010/wordprocessingShape" mc:Ignorable="w14 w15 w16se w16cid w16 w16cex w16sdtdh w16sdtfl w16du wp14">
+<w:numbering xmlns:wpc="http://schemas.microsoft.com/office/word/2010/wordprocessingCanvas" xmlns:cx="http://schemas.microsoft.com/office/drawing/2014/chartex" xmlns:cx1="http://schemas.microsoft.com/office/drawing/2015/9/8/chartex" xmlns:cx2="http://schemas.microsoft.com/office/drawing/2015/10/21/chartex" xmlns:cx3="http://schemas.microsoft.com/office/drawing/2016/5/9/chartex" xmlns:cx4="http://schemas.microsoft.com/office/drawing/2016/5/10/chartex" xmlns:cx5="http://schemas.microsoft.com/office/drawing/2016/5/11/chartex" xmlns:cx6="http://schemas.microsoft.com/office/drawing/2016/5/12/chartex" xmlns:cx7="http://schemas.microsoft.com/office/drawing/2016/5/13/chartex" xmlns:cx8="http://schemas.microsoft.com/office/drawing/2016/5/14/chartex" xmlns:mc="http://schemas.openxmlformats.org/markup-compatibility/2006" xmlns:m="http://schemas.openxmlformats.org/officeDocument/2006/math" xmlns:aink="http://schemas.microsoft.com/office/drawing/2016/ink" xmlns:am3d="http://schemas.microsoft.com/office/drawing/2017/model3d" xmlns:oel="http://schemas.microsoft.com/office/2019/extlst" xmlns:r="http://schemas.openxmlformats.org/officeDocument/2006/relationships" xmlns:wp14="http://schemas.microsoft.com/office/word/2010/wordprocessingDrawing" xmlns:wp="http://schemas.openxmlformats.org/drawingml/2006/wordprocessingDrawing" xmlns:wpg="http://schemas.microsoft.com/office/word/2010/wordprocessingGroup" xmlns:wpi="http://schemas.microsoft.com/office/word/2010/wordprocessingInk" xmlns:wps="http://schemas.microsoft.com/office/word/2010/wordprocessingShape" xmlns:o="urn:schemas-microsoft-com:office:office" xmlns:v="urn:schemas-microsoft-com:vml" xmlns:w10="urn:schemas-microsoft-com:office:word" xmlns:w="http://schemas.openxmlformats.org/wordprocessingml/2006/main" xmlns:w14="http://schemas.microsoft.com/office/word/2010/wordml" xmlns:w15="http://schemas.microsoft.com/office/word/2012/wordml" xmlns:w16cex="http://schemas.microsoft.com/office/word/2018/wordml/cex" xmlns:w16cid="http://schemas.microsoft.com/office/word/2016/wordml/cid" xmlns:w16="http://schemas.microsoft.com/office/word/2018/wordml" xmlns:w16sdtdh="http://schemas.microsoft.com/office/word/2020/wordml/sdtdatahash" xmlns:w16sdtfl="http://schemas.microsoft.com/office/word/2024/wordml/sdtformatlock" xmlns:w16se="http://schemas.microsoft.com/office/word/2015/wordml/symex" xmlns:w16du="http://schemas.microsoft.com/office/word/2023/wordml/word16du" xmlns:wne="http://schemas.microsoft.com/office/word/2006/wordml" mc:Ignorable="w14 w15 w16se w16cid w16 w16cex w16sdtdh w16sdtfl w16du wp14">
   <w:abstractNum w:abstractNumId="0" w15:restartNumberingAfterBreak="0">
     <w:nsid w:val="FFFFFF7C"/>
     <w:multiLevelType w:val="singleLevel"/>
@@ -3261,6 +4437,155 @@
     </w:lvl>
   </w:abstractNum>
   <w:abstractNum w:abstractNumId="9" w15:restartNumberingAfterBreak="0">
+    <w:nsid w:val="092869A3"/>
+    <w:multiLevelType w:val="multilevel"/>
+    <w:tmpl w:val="DF427802"/>
+    <w:lvl w:ilvl="0">
+      <w:start w:val="1"/>
+      <w:numFmt w:val="bullet"/>
+      <w:lvlText w:val=""/>
+      <w:lvlJc w:val="left"/>
+      <w:pPr>
+        <w:tabs>
+          <w:tab w:val="num" w:pos="720"/>
+        </w:tabs>
+        <w:ind w:left="720" w:hanging="360"/>
+      </w:pPr>
+      <w:rPr>
+        <w:rFonts w:ascii="Symbol" w:hAnsi="Symbol" w:hint="default"/>
+        <w:sz w:val="20"/>
+      </w:rPr>
+    </w:lvl>
+    <w:lvl w:ilvl="1" w:tentative="1">
+      <w:start w:val="1"/>
+      <w:numFmt w:val="bullet"/>
+      <w:lvlText w:val="o"/>
+      <w:lvlJc w:val="left"/>
+      <w:pPr>
+        <w:tabs>
+          <w:tab w:val="num" w:pos="1440"/>
+        </w:tabs>
+        <w:ind w:left="1440" w:hanging="360"/>
+      </w:pPr>
+      <w:rPr>
+        <w:rFonts w:ascii="Courier New" w:hAnsi="Courier New" w:hint="default"/>
+        <w:sz w:val="20"/>
+      </w:rPr>
+    </w:lvl>
+    <w:lvl w:ilvl="2" w:tentative="1">
+      <w:start w:val="1"/>
+      <w:numFmt w:val="bullet"/>
+      <w:lvlText w:val=""/>
+      <w:lvlJc w:val="left"/>
+      <w:pPr>
+        <w:tabs>
+          <w:tab w:val="num" w:pos="2160"/>
+        </w:tabs>
+        <w:ind w:left="2160" w:hanging="360"/>
+      </w:pPr>
+      <w:rPr>
+        <w:rFonts w:ascii="Wingdings" w:hAnsi="Wingdings" w:hint="default"/>
+        <w:sz w:val="20"/>
+      </w:rPr>
+    </w:lvl>
+    <w:lvl w:ilvl="3" w:tentative="1">
+      <w:start w:val="1"/>
+      <w:numFmt w:val="bullet"/>
+      <w:lvlText w:val=""/>
+      <w:lvlJc w:val="left"/>
+      <w:pPr>
+        <w:tabs>
+          <w:tab w:val="num" w:pos="2880"/>
+        </w:tabs>
+        <w:ind w:left="2880" w:hanging="360"/>
+      </w:pPr>
+      <w:rPr>
+        <w:rFonts w:ascii="Wingdings" w:hAnsi="Wingdings" w:hint="default"/>
+        <w:sz w:val="20"/>
+      </w:rPr>
+    </w:lvl>
+    <w:lvl w:ilvl="4" w:tentative="1">
+      <w:start w:val="1"/>
+      <w:numFmt w:val="bullet"/>
+      <w:lvlText w:val=""/>
+      <w:lvlJc w:val="left"/>
+      <w:pPr>
+        <w:tabs>
+          <w:tab w:val="num" w:pos="3600"/>
+        </w:tabs>
+        <w:ind w:left="3600" w:hanging="360"/>
+      </w:pPr>
+      <w:rPr>
+        <w:rFonts w:ascii="Wingdings" w:hAnsi="Wingdings" w:hint="default"/>
+        <w:sz w:val="20"/>
+      </w:rPr>
+    </w:lvl>
+    <w:lvl w:ilvl="5" w:tentative="1">
+      <w:start w:val="1"/>
+      <w:numFmt w:val="bullet"/>
+      <w:lvlText w:val=""/>
+      <w:lvlJc w:val="left"/>
+      <w:pPr>
+        <w:tabs>
+          <w:tab w:val="num" w:pos="4320"/>
+        </w:tabs>
+        <w:ind w:left="4320" w:hanging="360"/>
+      </w:pPr>
+      <w:rPr>
+        <w:rFonts w:ascii="Wingdings" w:hAnsi="Wingdings" w:hint="default"/>
+        <w:sz w:val="20"/>
+      </w:rPr>
+    </w:lvl>
+    <w:lvl w:ilvl="6" w:tentative="1">
+      <w:start w:val="1"/>
+      <w:numFmt w:val="bullet"/>
+      <w:lvlText w:val=""/>
+      <w:lvlJc w:val="left"/>
+      <w:pPr>
+        <w:tabs>
+          <w:tab w:val="num" w:pos="5040"/>
+        </w:tabs>
+        <w:ind w:left="5040" w:hanging="360"/>
+      </w:pPr>
+      <w:rPr>
+        <w:rFonts w:ascii="Wingdings" w:hAnsi="Wingdings" w:hint="default"/>
+        <w:sz w:val="20"/>
+      </w:rPr>
+    </w:lvl>
+    <w:lvl w:ilvl="7" w:tentative="1">
+      <w:start w:val="1"/>
+      <w:numFmt w:val="bullet"/>
+      <w:lvlText w:val=""/>
+      <w:lvlJc w:val="left"/>
+      <w:pPr>
+        <w:tabs>
+          <w:tab w:val="num" w:pos="5760"/>
+        </w:tabs>
+        <w:ind w:left="5760" w:hanging="360"/>
+      </w:pPr>
+      <w:rPr>
+        <w:rFonts w:ascii="Wingdings" w:hAnsi="Wingdings" w:hint="default"/>
+        <w:sz w:val="20"/>
+      </w:rPr>
+    </w:lvl>
+    <w:lvl w:ilvl="8" w:tentative="1">
+      <w:start w:val="1"/>
+      <w:numFmt w:val="bullet"/>
+      <w:lvlText w:val=""/>
+      <w:lvlJc w:val="left"/>
+      <w:pPr>
+        <w:tabs>
+          <w:tab w:val="num" w:pos="6480"/>
+        </w:tabs>
+        <w:ind w:left="6480" w:hanging="360"/>
+      </w:pPr>
+      <w:rPr>
+        <w:rFonts w:ascii="Wingdings" w:hAnsi="Wingdings" w:hint="default"/>
+        <w:sz w:val="20"/>
+      </w:rPr>
+    </w:lvl>
+  </w:abstractNum>
+  <w:abstractNum w:abstractNumId="10" w15:restartNumberingAfterBreak="0">
     <w:nsid w:val="0D547D4A"/>
     <w:multiLevelType w:val="multilevel"/>
     <w:tmpl w:val="9F3C2A74"/>
@@ -3409,7 +4734,156 @@
       </w:rPr>
     </w:lvl>
   </w:abstractNum>
-  <w:abstractNum w:abstractNumId="10" w15:restartNumberingAfterBreak="0">
+  <w:abstractNum w:abstractNumId="11" w15:restartNumberingAfterBreak="0">
+    <w:nsid w:val="1B7E754D"/>
+    <w:multiLevelType w:val="multilevel"/>
+    <w:tmpl w:val="AA2869E6"/>
+    <w:lvl w:ilvl="0">
+      <w:start w:val="1"/>
+      <w:numFmt w:val="bullet"/>
+      <w:lvlText w:val=""/>
+      <w:lvlJc w:val="left"/>
+      <w:pPr>
+        <w:tabs>
+          <w:tab w:val="num" w:pos="720"/>
+        </w:tabs>
+        <w:ind w:left="720" w:hanging="360"/>
+      </w:pPr>
+      <w:rPr>
+        <w:rFonts w:ascii="Symbol" w:hAnsi="Symbol" w:hint="default"/>
+        <w:sz w:val="20"/>
+      </w:rPr>
+    </w:lvl>
+    <w:lvl w:ilvl="1" w:tentative="1">
+      <w:start w:val="1"/>
+      <w:numFmt w:val="bullet"/>
+      <w:lvlText w:val="o"/>
+      <w:lvlJc w:val="left"/>
+      <w:pPr>
+        <w:tabs>
+          <w:tab w:val="num" w:pos="1440"/>
+        </w:tabs>
+        <w:ind w:left="1440" w:hanging="360"/>
+      </w:pPr>
+      <w:rPr>
+        <w:rFonts w:ascii="Courier New" w:hAnsi="Courier New" w:hint="default"/>
+        <w:sz w:val="20"/>
+      </w:rPr>
+    </w:lvl>
+    <w:lvl w:ilvl="2" w:tentative="1">
+      <w:start w:val="1"/>
+      <w:numFmt w:val="bullet"/>
+      <w:lvlText w:val=""/>
+      <w:lvlJc w:val="left"/>
+      <w:pPr>
+        <w:tabs>
+          <w:tab w:val="num" w:pos="2160"/>
+        </w:tabs>
+        <w:ind w:left="2160" w:hanging="360"/>
+      </w:pPr>
+      <w:rPr>
+        <w:rFonts w:ascii="Wingdings" w:hAnsi="Wingdings" w:hint="default"/>
+        <w:sz w:val="20"/>
+      </w:rPr>
+    </w:lvl>
+    <w:lvl w:ilvl="3" w:tentative="1">
+      <w:start w:val="1"/>
+      <w:numFmt w:val="bullet"/>
+      <w:lvlText w:val=""/>
+      <w:lvlJc w:val="left"/>
+      <w:pPr>
+        <w:tabs>
+          <w:tab w:val="num" w:pos="2880"/>
+        </w:tabs>
+        <w:ind w:left="2880" w:hanging="360"/>
+      </w:pPr>
+      <w:rPr>
+        <w:rFonts w:ascii="Wingdings" w:hAnsi="Wingdings" w:hint="default"/>
+        <w:sz w:val="20"/>
+      </w:rPr>
+    </w:lvl>
+    <w:lvl w:ilvl="4" w:tentative="1">
+      <w:start w:val="1"/>
+      <w:numFmt w:val="bullet"/>
+      <w:lvlText w:val=""/>
+      <w:lvlJc w:val="left"/>
+      <w:pPr>
+        <w:tabs>
+          <w:tab w:val="num" w:pos="3600"/>
+        </w:tabs>
+        <w:ind w:left="3600" w:hanging="360"/>
+      </w:pPr>
+      <w:rPr>
+        <w:rFonts w:ascii="Wingdings" w:hAnsi="Wingdings" w:hint="default"/>
+        <w:sz w:val="20"/>
+      </w:rPr>
+    </w:lvl>
+    <w:lvl w:ilvl="5" w:tentative="1">
+      <w:start w:val="1"/>
+      <w:numFmt w:val="bullet"/>
+      <w:lvlText w:val=""/>
+      <w:lvlJc w:val="left"/>
+      <w:pPr>
+        <w:tabs>
+          <w:tab w:val="num" w:pos="4320"/>
+        </w:tabs>
+        <w:ind w:left="4320" w:hanging="360"/>
+      </w:pPr>
+      <w:rPr>
+        <w:rFonts w:ascii="Wingdings" w:hAnsi="Wingdings" w:hint="default"/>
+        <w:sz w:val="20"/>
+      </w:rPr>
+    </w:lvl>
+    <w:lvl w:ilvl="6" w:tentative="1">
+      <w:start w:val="1"/>
+      <w:numFmt w:val="bullet"/>
+      <w:lvlText w:val=""/>
+      <w:lvlJc w:val="left"/>
+      <w:pPr>
+        <w:tabs>
+          <w:tab w:val="num" w:pos="5040"/>
+        </w:tabs>
+        <w:ind w:left="5040" w:hanging="360"/>
+      </w:pPr>
+      <w:rPr>
+        <w:rFonts w:ascii="Wingdings" w:hAnsi="Wingdings" w:hint="default"/>
+        <w:sz w:val="20"/>
+      </w:rPr>
+    </w:lvl>
+    <w:lvl w:ilvl="7" w:tentative="1">
+      <w:start w:val="1"/>
+      <w:numFmt w:val="bullet"/>
+      <w:lvlText w:val=""/>
+      <w:lvlJc w:val="left"/>
+      <w:pPr>
+        <w:tabs>
+          <w:tab w:val="num" w:pos="5760"/>
+        </w:tabs>
+        <w:ind w:left="5760" w:hanging="360"/>
+      </w:pPr>
+      <w:rPr>
+        <w:rFonts w:ascii="Wingdings" w:hAnsi="Wingdings" w:hint="default"/>
+        <w:sz w:val="20"/>
+      </w:rPr>
+    </w:lvl>
+    <w:lvl w:ilvl="8" w:tentative="1">
+      <w:start w:val="1"/>
+      <w:numFmt w:val="bullet"/>
+      <w:lvlText w:val=""/>
+      <w:lvlJc w:val="left"/>
+      <w:pPr>
+        <w:tabs>
+          <w:tab w:val="num" w:pos="6480"/>
+        </w:tabs>
+        <w:ind w:left="6480" w:hanging="360"/>
+      </w:pPr>
+      <w:rPr>
+        <w:rFonts w:ascii="Wingdings" w:hAnsi="Wingdings" w:hint="default"/>
+        <w:sz w:val="20"/>
+      </w:rPr>
+    </w:lvl>
+  </w:abstractNum>
+  <w:abstractNum w:abstractNumId="12" w15:restartNumberingAfterBreak="0">
     <w:nsid w:val="22EB3A11"/>
     <w:multiLevelType w:val="multilevel"/>
     <w:tmpl w:val="DC90425A"/>
@@ -3558,7 +5032,7 @@
       </w:rPr>
     </w:lvl>
   </w:abstractNum>
-  <w:abstractNum w:abstractNumId="11" w15:restartNumberingAfterBreak="0">
+  <w:abstractNum w:abstractNumId="13" w15:restartNumberingAfterBreak="0">
     <w:nsid w:val="25961B8E"/>
     <w:multiLevelType w:val="multilevel"/>
     <w:tmpl w:val="9D9283AE"/>
@@ -3707,7 +5181,156 @@
       </w:rPr>
     </w:lvl>
   </w:abstractNum>
-  <w:abstractNum w:abstractNumId="12" w15:restartNumberingAfterBreak="0">
+  <w:abstractNum w:abstractNumId="14" w15:restartNumberingAfterBreak="0">
+    <w:nsid w:val="33C83A4C"/>
+    <w:multiLevelType w:val="multilevel"/>
+    <w:tmpl w:val="648A9654"/>
+    <w:lvl w:ilvl="0">
+      <w:start w:val="1"/>
+      <w:numFmt w:val="bullet"/>
+      <w:lvlText w:val=""/>
+      <w:lvlJc w:val="left"/>
+      <w:pPr>
+        <w:tabs>
+          <w:tab w:val="num" w:pos="720"/>
+        </w:tabs>
+        <w:ind w:left="720" w:hanging="360"/>
+      </w:pPr>
+      <w:rPr>
+        <w:rFonts w:ascii="Symbol" w:hAnsi="Symbol" w:hint="default"/>
+        <w:sz w:val="20"/>
+      </w:rPr>
+    </w:lvl>
+    <w:lvl w:ilvl="1" w:tentative="1">
+      <w:start w:val="1"/>
+      <w:numFmt w:val="bullet"/>
+      <w:lvlText w:val="o"/>
+      <w:lvlJc w:val="left"/>
+      <w:pPr>
+        <w:tabs>
+          <w:tab w:val="num" w:pos="1440"/>
+        </w:tabs>
+        <w:ind w:left="1440" w:hanging="360"/>
+      </w:pPr>
+      <w:rPr>
+        <w:rFonts w:ascii="Courier New" w:hAnsi="Courier New" w:hint="default"/>
+        <w:sz w:val="20"/>
+      </w:rPr>
+    </w:lvl>
+    <w:lvl w:ilvl="2" w:tentative="1">
+      <w:start w:val="1"/>
+      <w:numFmt w:val="bullet"/>
+      <w:lvlText w:val=""/>
+      <w:lvlJc w:val="left"/>
+      <w:pPr>
+        <w:tabs>
+          <w:tab w:val="num" w:pos="2160"/>
+        </w:tabs>
+        <w:ind w:left="2160" w:hanging="360"/>
+      </w:pPr>
+      <w:rPr>
+        <w:rFonts w:ascii="Wingdings" w:hAnsi="Wingdings" w:hint="default"/>
+        <w:sz w:val="20"/>
+      </w:rPr>
+    </w:lvl>
+    <w:lvl w:ilvl="3" w:tentative="1">
+      <w:start w:val="1"/>
+      <w:numFmt w:val="bullet"/>
+      <w:lvlText w:val=""/>
+      <w:lvlJc w:val="left"/>
+      <w:pPr>
+        <w:tabs>
+          <w:tab w:val="num" w:pos="2880"/>
+        </w:tabs>
+        <w:ind w:left="2880" w:hanging="360"/>
+      </w:pPr>
+      <w:rPr>
+        <w:rFonts w:ascii="Wingdings" w:hAnsi="Wingdings" w:hint="default"/>
+        <w:sz w:val="20"/>
+      </w:rPr>
+    </w:lvl>
+    <w:lvl w:ilvl="4" w:tentative="1">
+      <w:start w:val="1"/>
+      <w:numFmt w:val="bullet"/>
+      <w:lvlText w:val=""/>
+      <w:lvlJc w:val="left"/>
+      <w:pPr>
+        <w:tabs>
+          <w:tab w:val="num" w:pos="3600"/>
+        </w:tabs>
+        <w:ind w:left="3600" w:hanging="360"/>
+      </w:pPr>
+      <w:rPr>
+        <w:rFonts w:ascii="Wingdings" w:hAnsi="Wingdings" w:hint="default"/>
+        <w:sz w:val="20"/>
+      </w:rPr>
+    </w:lvl>
+    <w:lvl w:ilvl="5" w:tentative="1">
+      <w:start w:val="1"/>
+      <w:numFmt w:val="bullet"/>
+      <w:lvlText w:val=""/>
+      <w:lvlJc w:val="left"/>
+      <w:pPr>
+        <w:tabs>
+          <w:tab w:val="num" w:pos="4320"/>
+        </w:tabs>
+        <w:ind w:left="4320" w:hanging="360"/>
+      </w:pPr>
+      <w:rPr>
+        <w:rFonts w:ascii="Wingdings" w:hAnsi="Wingdings" w:hint="default"/>
+        <w:sz w:val="20"/>
+      </w:rPr>
+    </w:lvl>
+    <w:lvl w:ilvl="6" w:tentative="1">
+      <w:start w:val="1"/>
+      <w:numFmt w:val="bullet"/>
+      <w:lvlText w:val=""/>
+      <w:lvlJc w:val="left"/>
+      <w:pPr>
+        <w:tabs>
+          <w:tab w:val="num" w:pos="5040"/>
+        </w:tabs>
+        <w:ind w:left="5040" w:hanging="360"/>
+      </w:pPr>
+      <w:rPr>
+        <w:rFonts w:ascii="Wingdings" w:hAnsi="Wingdings" w:hint="default"/>
+        <w:sz w:val="20"/>
+      </w:rPr>
+    </w:lvl>
+    <w:lvl w:ilvl="7" w:tentative="1">
+      <w:start w:val="1"/>
+      <w:numFmt w:val="bullet"/>
+      <w:lvlText w:val=""/>
+      <w:lvlJc w:val="left"/>
+      <w:pPr>
+        <w:tabs>
+          <w:tab w:val="num" w:pos="5760"/>
+        </w:tabs>
+        <w:ind w:left="5760" w:hanging="360"/>
+      </w:pPr>
+      <w:rPr>
+        <w:rFonts w:ascii="Wingdings" w:hAnsi="Wingdings" w:hint="default"/>
+        <w:sz w:val="20"/>
+      </w:rPr>
+    </w:lvl>
+    <w:lvl w:ilvl="8" w:tentative="1">
+      <w:start w:val="1"/>
+      <w:numFmt w:val="bullet"/>
+      <w:lvlText w:val=""/>
+      <w:lvlJc w:val="left"/>
+      <w:pPr>
+        <w:tabs>
+          <w:tab w:val="num" w:pos="6480"/>
+        </w:tabs>
+        <w:ind w:left="6480" w:hanging="360"/>
+      </w:pPr>
+      <w:rPr>
+        <w:rFonts w:ascii="Wingdings" w:hAnsi="Wingdings" w:hint="default"/>
+        <w:sz w:val="20"/>
+      </w:rPr>
+    </w:lvl>
+  </w:abstractNum>
+  <w:abstractNum w:abstractNumId="15" w15:restartNumberingAfterBreak="0">
     <w:nsid w:val="6FAB3386"/>
     <w:multiLevelType w:val="multilevel"/>
     <w:tmpl w:val="D7849678"/>
@@ -3884,22 +5507,40 @@
     <w:abstractNumId w:val="0"/>
   </w:num>
   <w:num w:numId="10" w16cid:durableId="536428290">
+    <w:abstractNumId w:val="13"/>
+  </w:num>
+  <w:num w:numId="11" w16cid:durableId="2056275302">
+    <w:abstractNumId w:val="15"/>
+  </w:num>
+  <w:num w:numId="12" w16cid:durableId="1962373001">
+    <w:abstractNumId w:val="10"/>
+  </w:num>
+  <w:num w:numId="13" w16cid:durableId="23756049">
+    <w:abstractNumId w:val="12"/>
+  </w:num>
+  <w:num w:numId="14" w16cid:durableId="2044136608">
     <w:abstractNumId w:val="11"/>
   </w:num>
-  <w:num w:numId="11" w16cid:durableId="2056275302">
-    <w:abstractNumId w:val="12"/>
-  </w:num>
-  <w:num w:numId="12" w16cid:durableId="1962373001">
+  <w:num w:numId="15" w16cid:durableId="793214008">
     <w:abstractNumId w:val="9"/>
   </w:num>
-  <w:num w:numId="13" w16cid:durableId="23756049">
-    <w:abstractNumId w:val="10"/>
+  <w:num w:numId="16" w16cid:durableId="1209878542">
+    <w:abstractNumId w:val="14"/>
+  </w:num>
+  <w:num w:numId="17" w16cid:durableId="1848592302">
+    <w:abstractNumId w:val="8"/>
+  </w:num>
+  <w:num w:numId="18" w16cid:durableId="286592636">
+    <w:abstractNumId w:val="8"/>
+  </w:num>
+  <w:num w:numId="19" w16cid:durableId="279800522">
+    <w:abstractNumId w:val="8"/>
   </w:num>
 </w:numbering>
 </file>
 
 <file path=word/styles.xml><?xml version="1.0" encoding="utf-8"?>
-<w:styles xmlns:mc="http://schemas.openxmlformats.org/markup-compatibility/2006" xmlns:r="http://schemas.openxmlformats.org/officeDocument/2006/relationships" xmlns:w="http://schemas.openxmlformats.org/wordprocessingml/2006/main" xmlns:w14="http://schemas.microsoft.com/office/word/2010/wordml" xmlns:w15="http://schemas.microsoft.com/office/word/2012/wordml" xmlns:w16cex="http://schemas.microsoft.com/office/word/2018/wordml/cex" xmlns:w16cid="http://schemas.microsoft.com/office/word/2016/wordml/cid" xmlns:w16="http://schemas.microsoft.com/office/word/2018/wordml" xmlns:w16du="http://schemas.microsoft.com/office/word/2023/wordml/word16du" xmlns:w16sdtdh="http://schemas.microsoft.com/office/word/2020/wordml/sdtdatahash" xmlns:w16sdtfl="http://schemas.microsoft.com/office/word/2024/wordml/sdtformatlock" xmlns:w16se="http://schemas.microsoft.com/office/word/2015/wordml/symex" mc:Ignorable="w14 w15 w16se w16cid w16 w16cex w16sdtdh w16sdtfl w16du">
+<w:styles xmlns:mc="http://schemas.openxmlformats.org/markup-compatibility/2006" xmlns:r="http://schemas.openxmlformats.org/officeDocument/2006/relationships" xmlns:w="http://schemas.openxmlformats.org/wordprocessingml/2006/main" xmlns:w14="http://schemas.microsoft.com/office/word/2010/wordml" xmlns:w15="http://schemas.microsoft.com/office/word/2012/wordml" xmlns:w16cex="http://schemas.microsoft.com/office/word/2018/wordml/cex" xmlns:w16cid="http://schemas.microsoft.com/office/word/2016/wordml/cid" xmlns:w16="http://schemas.microsoft.com/office/word/2018/wordml" xmlns:w16sdtdh="http://schemas.microsoft.com/office/word/2020/wordml/sdtdatahash" xmlns:w16sdtfl="http://schemas.microsoft.com/office/word/2024/wordml/sdtformatlock" xmlns:w16se="http://schemas.microsoft.com/office/word/2015/wordml/symex" xmlns:w16du="http://schemas.microsoft.com/office/word/2023/wordml/word16du" mc:Ignorable="w14 w15 w16se w16cid w16 w16cex w16sdtdh w16sdtfl w16du">
   <w:docDefaults>
     <w:rPrDefault>
       <w:rPr>
@@ -4503,7 +6144,6 @@
   <w:style w:type="character" w:default="1" w:styleId="DefaultParagraphFont">
     <w:name w:val="Default Paragraph Font"/>
     <w:uiPriority w:val="1"/>
-    <w:semiHidden/>
     <w:unhideWhenUsed/>
   </w:style>
   <w:style w:type="table" w:default="1" w:styleId="TableNormal">

</xml_diff>